<commit_message>
again updated my version of bhb proposal
</commit_message>
<xml_diff>
--- a/Proposal working/Sam - BHB - Capstone Proposal.docx
+++ b/Proposal working/Sam - BHB - Capstone Proposal.docx
@@ -3945,7 +3945,7 @@
           <w:r>
             <w:fldChar w:fldCharType="separate"/>
           </w:r>
-          <w:hyperlink w:anchor="_Toc236998676" w:history="1">
+          <w:hyperlink w:anchor="_Toc237963392" w:history="1">
             <w:r>
               <w:rPr>
                 <w:rStyle w:val="Hyperlink"/>
@@ -3972,7 +3972,7 @@
                 <w:noProof/>
                 <w:webHidden/>
               </w:rPr>
-              <w:instrText xml:space="preserve"> PAGEREF _Toc236998676 \h </w:instrText>
+              <w:instrText xml:space="preserve"> PAGEREF _Toc237963392 \h </w:instrText>
             </w:r>
             <w:r>
               <w:rPr>
@@ -4019,7 +4019,7 @@
               <w14:ligatures w14:val="standardContextual"/>
             </w:rPr>
           </w:pPr>
-          <w:hyperlink w:anchor="_Toc236998677" w:history="1">
+          <w:hyperlink w:anchor="_Toc237963393" w:history="1">
             <w:r>
               <w:rPr>
                 <w:rStyle w:val="Hyperlink"/>
@@ -4046,7 +4046,7 @@
                 <w:noProof/>
                 <w:webHidden/>
               </w:rPr>
-              <w:instrText xml:space="preserve"> PAGEREF _Toc236998677 \h </w:instrText>
+              <w:instrText xml:space="preserve"> PAGEREF _Toc237963393 \h </w:instrText>
             </w:r>
             <w:r>
               <w:rPr>
@@ -4093,7 +4093,7 @@
               <w14:ligatures w14:val="standardContextual"/>
             </w:rPr>
           </w:pPr>
-          <w:hyperlink w:anchor="_Toc236998678" w:history="1">
+          <w:hyperlink w:anchor="_Toc237963394" w:history="1">
             <w:r>
               <w:rPr>
                 <w:rStyle w:val="Hyperlink"/>
@@ -4120,7 +4120,7 @@
                 <w:noProof/>
                 <w:webHidden/>
               </w:rPr>
-              <w:instrText xml:space="preserve"> PAGEREF _Toc236998678 \h </w:instrText>
+              <w:instrText xml:space="preserve"> PAGEREF _Toc237963394 \h </w:instrText>
             </w:r>
             <w:r>
               <w:rPr>
@@ -4167,7 +4167,7 @@
               <w14:ligatures w14:val="standardContextual"/>
             </w:rPr>
           </w:pPr>
-          <w:hyperlink w:anchor="_Toc236998679" w:history="1">
+          <w:hyperlink w:anchor="_Toc237963395" w:history="1">
             <w:r>
               <w:rPr>
                 <w:rStyle w:val="Hyperlink"/>
@@ -4194,7 +4194,7 @@
                 <w:noProof/>
                 <w:webHidden/>
               </w:rPr>
-              <w:instrText xml:space="preserve"> PAGEREF _Toc236998679 \h </w:instrText>
+              <w:instrText xml:space="preserve"> PAGEREF _Toc237963395 \h </w:instrText>
             </w:r>
             <w:r>
               <w:rPr>
@@ -4241,7 +4241,7 @@
               <w14:ligatures w14:val="standardContextual"/>
             </w:rPr>
           </w:pPr>
-          <w:hyperlink w:anchor="_Toc236998680" w:history="1">
+          <w:hyperlink w:anchor="_Toc237963396" w:history="1">
             <w:r>
               <w:rPr>
                 <w:rStyle w:val="Hyperlink"/>
@@ -4268,7 +4268,7 @@
                 <w:noProof/>
                 <w:webHidden/>
               </w:rPr>
-              <w:instrText xml:space="preserve"> PAGEREF _Toc236998680 \h </w:instrText>
+              <w:instrText xml:space="preserve"> PAGEREF _Toc237963396 \h </w:instrText>
             </w:r>
             <w:r>
               <w:rPr>
@@ -4315,7 +4315,7 @@
               <w14:ligatures w14:val="standardContextual"/>
             </w:rPr>
           </w:pPr>
-          <w:hyperlink w:anchor="_Toc236998681" w:history="1">
+          <w:hyperlink w:anchor="_Toc237963397" w:history="1">
             <w:r>
               <w:rPr>
                 <w:rStyle w:val="Hyperlink"/>
@@ -4342,7 +4342,81 @@
                 <w:noProof/>
                 <w:webHidden/>
               </w:rPr>
-              <w:instrText xml:space="preserve"> PAGEREF _Toc236998681 \h </w:instrText>
+              <w:instrText xml:space="preserve"> PAGEREF _Toc237963397 \h </w:instrText>
+            </w:r>
+            <w:r>
+              <w:rPr>
+                <w:noProof/>
+                <w:webHidden/>
+              </w:rPr>
+            </w:r>
+            <w:r>
+              <w:rPr>
+                <w:noProof/>
+                <w:webHidden/>
+              </w:rPr>
+              <w:fldChar w:fldCharType="separate"/>
+            </w:r>
+            <w:r>
+              <w:rPr>
+                <w:noProof/>
+                <w:webHidden/>
+              </w:rPr>
+              <w:t>3</w:t>
+            </w:r>
+            <w:r>
+              <w:rPr>
+                <w:noProof/>
+                <w:webHidden/>
+              </w:rPr>
+              <w:fldChar w:fldCharType="end"/>
+            </w:r>
+          </w:hyperlink>
+        </w:p>
+        <w:p>
+          <w:pPr>
+            <w:pStyle w:val="TOC2"/>
+            <w:tabs>
+              <w:tab w:val="right" w:leader="dot" w:pos="10456"/>
+            </w:tabs>
+            <w:rPr>
+              <w:rFonts w:asciiTheme="minorHAnsi" w:eastAsiaTheme="minorEastAsia" w:hAnsiTheme="minorHAnsi"/>
+              <w:noProof/>
+              <w:kern w:val="2"/>
+              <w:sz w:val="24"/>
+              <w:szCs w:val="24"/>
+              <w:lang w:val="en-NZ" w:eastAsia="en-NZ"/>
+              <w14:ligatures w14:val="standardContextual"/>
+            </w:rPr>
+          </w:pPr>
+          <w:hyperlink w:anchor="_Toc237963398" w:history="1">
+            <w:r>
+              <w:rPr>
+                <w:rStyle w:val="Hyperlink"/>
+                <w:noProof/>
+              </w:rPr>
+              <w:t>Use of AI</w:t>
+            </w:r>
+            <w:r>
+              <w:rPr>
+                <w:noProof/>
+                <w:webHidden/>
+              </w:rPr>
+              <w:tab/>
+            </w:r>
+            <w:r>
+              <w:rPr>
+                <w:noProof/>
+                <w:webHidden/>
+              </w:rPr>
+              <w:fldChar w:fldCharType="begin"/>
+            </w:r>
+            <w:r>
+              <w:rPr>
+                <w:noProof/>
+                <w:webHidden/>
+              </w:rPr>
+              <w:instrText xml:space="preserve"> PAGEREF _Toc237963398 \h </w:instrText>
             </w:r>
             <w:r>
               <w:rPr>
@@ -4389,7 +4463,7 @@
               <w14:ligatures w14:val="standardContextual"/>
             </w:rPr>
           </w:pPr>
-          <w:hyperlink w:anchor="_Toc236998682" w:history="1">
+          <w:hyperlink w:anchor="_Toc237963399" w:history="1">
             <w:r>
               <w:rPr>
                 <w:rStyle w:val="Hyperlink"/>
@@ -4416,7 +4490,7 @@
                 <w:noProof/>
                 <w:webHidden/>
               </w:rPr>
-              <w:instrText xml:space="preserve"> PAGEREF _Toc236998682 \h </w:instrText>
+              <w:instrText xml:space="preserve"> PAGEREF _Toc237963399 \h </w:instrText>
             </w:r>
             <w:r>
               <w:rPr>
@@ -4463,7 +4537,7 @@
               <w14:ligatures w14:val="standardContextual"/>
             </w:rPr>
           </w:pPr>
-          <w:hyperlink w:anchor="_Toc236998683" w:history="1">
+          <w:hyperlink w:anchor="_Toc237963400" w:history="1">
             <w:r>
               <w:rPr>
                 <w:rStyle w:val="Hyperlink"/>
@@ -4490,7 +4564,7 @@
                 <w:noProof/>
                 <w:webHidden/>
               </w:rPr>
-              <w:instrText xml:space="preserve"> PAGEREF _Toc236998683 \h </w:instrText>
+              <w:instrText xml:space="preserve"> PAGEREF _Toc237963400 \h </w:instrText>
             </w:r>
             <w:r>
               <w:rPr>
@@ -4537,7 +4611,7 @@
               <w14:ligatures w14:val="standardContextual"/>
             </w:rPr>
           </w:pPr>
-          <w:hyperlink w:anchor="_Toc236998684" w:history="1">
+          <w:hyperlink w:anchor="_Toc237963401" w:history="1">
             <w:r>
               <w:rPr>
                 <w:rStyle w:val="Hyperlink"/>
@@ -4564,7 +4638,7 @@
                 <w:noProof/>
                 <w:webHidden/>
               </w:rPr>
-              <w:instrText xml:space="preserve"> PAGEREF _Toc236998684 \h </w:instrText>
+              <w:instrText xml:space="preserve"> PAGEREF _Toc237963401 \h </w:instrText>
             </w:r>
             <w:r>
               <w:rPr>
@@ -4611,7 +4685,7 @@
               <w14:ligatures w14:val="standardContextual"/>
             </w:rPr>
           </w:pPr>
-          <w:hyperlink w:anchor="_Toc236998685" w:history="1">
+          <w:hyperlink w:anchor="_Toc237963402" w:history="1">
             <w:r>
               <w:rPr>
                 <w:rStyle w:val="Hyperlink"/>
@@ -4638,7 +4712,7 @@
                 <w:noProof/>
                 <w:webHidden/>
               </w:rPr>
-              <w:instrText xml:space="preserve"> PAGEREF _Toc236998685 \h </w:instrText>
+              <w:instrText xml:space="preserve"> PAGEREF _Toc237963402 \h </w:instrText>
             </w:r>
             <w:r>
               <w:rPr>
@@ -4658,7 +4732,7 @@
                 <w:noProof/>
                 <w:webHidden/>
               </w:rPr>
-              <w:t>4</w:t>
+              <w:t>5</w:t>
             </w:r>
             <w:r>
               <w:rPr>
@@ -4685,7 +4759,7 @@
               <w14:ligatures w14:val="standardContextual"/>
             </w:rPr>
           </w:pPr>
-          <w:hyperlink w:anchor="_Toc236998686" w:history="1">
+          <w:hyperlink w:anchor="_Toc237963403" w:history="1">
             <w:r>
               <w:rPr>
                 <w:rStyle w:val="Hyperlink"/>
@@ -4712,7 +4786,7 @@
                 <w:noProof/>
                 <w:webHidden/>
               </w:rPr>
-              <w:instrText xml:space="preserve"> PAGEREF _Toc236998686 \h </w:instrText>
+              <w:instrText xml:space="preserve"> PAGEREF _Toc237963403 \h </w:instrText>
             </w:r>
             <w:r>
               <w:rPr>
@@ -4732,7 +4806,7 @@
                 <w:noProof/>
                 <w:webHidden/>
               </w:rPr>
-              <w:t>4</w:t>
+              <w:t>5</w:t>
             </w:r>
             <w:r>
               <w:rPr>
@@ -4759,7 +4833,7 @@
               <w14:ligatures w14:val="standardContextual"/>
             </w:rPr>
           </w:pPr>
-          <w:hyperlink w:anchor="_Toc236998687" w:history="1">
+          <w:hyperlink w:anchor="_Toc237963404" w:history="1">
             <w:r>
               <w:rPr>
                 <w:rStyle w:val="Hyperlink"/>
@@ -4786,7 +4860,7 @@
                 <w:noProof/>
                 <w:webHidden/>
               </w:rPr>
-              <w:instrText xml:space="preserve"> PAGEREF _Toc236998687 \h </w:instrText>
+              <w:instrText xml:space="preserve"> PAGEREF _Toc237963404 \h </w:instrText>
             </w:r>
             <w:r>
               <w:rPr>
@@ -4806,7 +4880,7 @@
                 <w:noProof/>
                 <w:webHidden/>
               </w:rPr>
-              <w:t>4</w:t>
+              <w:t>9</w:t>
             </w:r>
             <w:r>
               <w:rPr>
@@ -4833,7 +4907,7 @@
               <w14:ligatures w14:val="standardContextual"/>
             </w:rPr>
           </w:pPr>
-          <w:hyperlink w:anchor="_Toc236998688" w:history="1">
+          <w:hyperlink w:anchor="_Toc237963405" w:history="1">
             <w:r>
               <w:rPr>
                 <w:rStyle w:val="Hyperlink"/>
@@ -4860,7 +4934,7 @@
                 <w:noProof/>
                 <w:webHidden/>
               </w:rPr>
-              <w:instrText xml:space="preserve"> PAGEREF _Toc236998688 \h </w:instrText>
+              <w:instrText xml:space="preserve"> PAGEREF _Toc237963405 \h </w:instrText>
             </w:r>
             <w:r>
               <w:rPr>
@@ -4880,7 +4954,7 @@
                 <w:noProof/>
                 <w:webHidden/>
               </w:rPr>
-              <w:t>5</w:t>
+              <w:t>9</w:t>
             </w:r>
             <w:r>
               <w:rPr>
@@ -4907,7 +4981,7 @@
               <w14:ligatures w14:val="standardContextual"/>
             </w:rPr>
           </w:pPr>
-          <w:hyperlink w:anchor="_Toc236998689" w:history="1">
+          <w:hyperlink w:anchor="_Toc237963406" w:history="1">
             <w:r>
               <w:rPr>
                 <w:rStyle w:val="Hyperlink"/>
@@ -4934,7 +5008,7 @@
                 <w:noProof/>
                 <w:webHidden/>
               </w:rPr>
-              <w:instrText xml:space="preserve"> PAGEREF _Toc236998689 \h </w:instrText>
+              <w:instrText xml:space="preserve"> PAGEREF _Toc237963406 \h </w:instrText>
             </w:r>
             <w:r>
               <w:rPr>
@@ -4954,7 +5028,7 @@
                 <w:noProof/>
                 <w:webHidden/>
               </w:rPr>
-              <w:t>5</w:t>
+              <w:t>9</w:t>
             </w:r>
             <w:r>
               <w:rPr>
@@ -4981,7 +5055,7 @@
               <w14:ligatures w14:val="standardContextual"/>
             </w:rPr>
           </w:pPr>
-          <w:hyperlink w:anchor="_Toc236998690" w:history="1">
+          <w:hyperlink w:anchor="_Toc237963407" w:history="1">
             <w:r>
               <w:rPr>
                 <w:rStyle w:val="Hyperlink"/>
@@ -5008,7 +5082,7 @@
                 <w:noProof/>
                 <w:webHidden/>
               </w:rPr>
-              <w:instrText xml:space="preserve"> PAGEREF _Toc236998690 \h </w:instrText>
+              <w:instrText xml:space="preserve"> PAGEREF _Toc237963407 \h </w:instrText>
             </w:r>
             <w:r>
               <w:rPr>
@@ -5028,7 +5102,7 @@
                 <w:noProof/>
                 <w:webHidden/>
               </w:rPr>
-              <w:t>5</w:t>
+              <w:t>9</w:t>
             </w:r>
             <w:r>
               <w:rPr>
@@ -5055,7 +5129,7 @@
               <w14:ligatures w14:val="standardContextual"/>
             </w:rPr>
           </w:pPr>
-          <w:hyperlink w:anchor="_Toc236998691" w:history="1">
+          <w:hyperlink w:anchor="_Toc237963408" w:history="1">
             <w:r>
               <w:rPr>
                 <w:rStyle w:val="Hyperlink"/>
@@ -5082,7 +5156,7 @@
                 <w:noProof/>
                 <w:webHidden/>
               </w:rPr>
-              <w:instrText xml:space="preserve"> PAGEREF _Toc236998691 \h </w:instrText>
+              <w:instrText xml:space="preserve"> PAGEREF _Toc237963408 \h </w:instrText>
             </w:r>
             <w:r>
               <w:rPr>
@@ -5102,7 +5176,7 @@
                 <w:noProof/>
                 <w:webHidden/>
               </w:rPr>
-              <w:t>5</w:t>
+              <w:t>10</w:t>
             </w:r>
             <w:r>
               <w:rPr>
@@ -5129,7 +5203,7 @@
               <w14:ligatures w14:val="standardContextual"/>
             </w:rPr>
           </w:pPr>
-          <w:hyperlink w:anchor="_Toc236998692" w:history="1">
+          <w:hyperlink w:anchor="_Toc237963409" w:history="1">
             <w:r>
               <w:rPr>
                 <w:rStyle w:val="Hyperlink"/>
@@ -5156,7 +5230,7 @@
                 <w:noProof/>
                 <w:webHidden/>
               </w:rPr>
-              <w:instrText xml:space="preserve"> PAGEREF _Toc236998692 \h </w:instrText>
+              <w:instrText xml:space="preserve"> PAGEREF _Toc237963409 \h </w:instrText>
             </w:r>
             <w:r>
               <w:rPr>
@@ -5176,7 +5250,7 @@
                 <w:noProof/>
                 <w:webHidden/>
               </w:rPr>
-              <w:t>5</w:t>
+              <w:t>10</w:t>
             </w:r>
             <w:r>
               <w:rPr>
@@ -5203,7 +5277,7 @@
               <w14:ligatures w14:val="standardContextual"/>
             </w:rPr>
           </w:pPr>
-          <w:hyperlink w:anchor="_Toc236998693" w:history="1">
+          <w:hyperlink w:anchor="_Toc237963410" w:history="1">
             <w:r>
               <w:rPr>
                 <w:rStyle w:val="Hyperlink"/>
@@ -5230,7 +5304,7 @@
                 <w:noProof/>
                 <w:webHidden/>
               </w:rPr>
-              <w:instrText xml:space="preserve"> PAGEREF _Toc236998693 \h </w:instrText>
+              <w:instrText xml:space="preserve"> PAGEREF _Toc237963410 \h </w:instrText>
             </w:r>
             <w:r>
               <w:rPr>
@@ -5250,7 +5324,7 @@
                 <w:noProof/>
                 <w:webHidden/>
               </w:rPr>
-              <w:t>6</w:t>
+              <w:t>10</w:t>
             </w:r>
             <w:r>
               <w:rPr>
@@ -5277,7 +5351,7 @@
               <w14:ligatures w14:val="standardContextual"/>
             </w:rPr>
           </w:pPr>
-          <w:hyperlink w:anchor="_Toc236998694" w:history="1">
+          <w:hyperlink w:anchor="_Toc237963411" w:history="1">
             <w:r>
               <w:rPr>
                 <w:rStyle w:val="Hyperlink"/>
@@ -5304,7 +5378,7 @@
                 <w:noProof/>
                 <w:webHidden/>
               </w:rPr>
-              <w:instrText xml:space="preserve"> PAGEREF _Toc236998694 \h </w:instrText>
+              <w:instrText xml:space="preserve"> PAGEREF _Toc237963411 \h </w:instrText>
             </w:r>
             <w:r>
               <w:rPr>
@@ -5324,7 +5398,7 @@
                 <w:noProof/>
                 <w:webHidden/>
               </w:rPr>
-              <w:t>6</w:t>
+              <w:t>11</w:t>
             </w:r>
             <w:r>
               <w:rPr>
@@ -5351,7 +5425,7 @@
               <w14:ligatures w14:val="standardContextual"/>
             </w:rPr>
           </w:pPr>
-          <w:hyperlink w:anchor="_Toc236998695" w:history="1">
+          <w:hyperlink w:anchor="_Toc237963412" w:history="1">
             <w:r>
               <w:rPr>
                 <w:rStyle w:val="Hyperlink"/>
@@ -5378,7 +5452,7 @@
                 <w:noProof/>
                 <w:webHidden/>
               </w:rPr>
-              <w:instrText xml:space="preserve"> PAGEREF _Toc236998695 \h </w:instrText>
+              <w:instrText xml:space="preserve"> PAGEREF _Toc237963412 \h </w:instrText>
             </w:r>
             <w:r>
               <w:rPr>
@@ -5398,7 +5472,7 @@
                 <w:noProof/>
                 <w:webHidden/>
               </w:rPr>
-              <w:t>8</w:t>
+              <w:t>12</w:t>
             </w:r>
             <w:r>
               <w:rPr>
@@ -5425,7 +5499,7 @@
               <w14:ligatures w14:val="standardContextual"/>
             </w:rPr>
           </w:pPr>
-          <w:hyperlink w:anchor="_Toc236998696" w:history="1">
+          <w:hyperlink w:anchor="_Toc237963413" w:history="1">
             <w:r>
               <w:rPr>
                 <w:rStyle w:val="Hyperlink"/>
@@ -5452,7 +5526,7 @@
                 <w:noProof/>
                 <w:webHidden/>
               </w:rPr>
-              <w:instrText xml:space="preserve"> PAGEREF _Toc236998696 \h </w:instrText>
+              <w:instrText xml:space="preserve"> PAGEREF _Toc237963413 \h </w:instrText>
             </w:r>
             <w:r>
               <w:rPr>
@@ -5472,7 +5546,7 @@
                 <w:noProof/>
                 <w:webHidden/>
               </w:rPr>
-              <w:t>8</w:t>
+              <w:t>13</w:t>
             </w:r>
             <w:r>
               <w:rPr>
@@ -5499,7 +5573,7 @@
               <w14:ligatures w14:val="standardContextual"/>
             </w:rPr>
           </w:pPr>
-          <w:hyperlink w:anchor="_Toc236998697" w:history="1">
+          <w:hyperlink w:anchor="_Toc237963414" w:history="1">
             <w:r>
               <w:rPr>
                 <w:rStyle w:val="Hyperlink"/>
@@ -5526,7 +5600,7 @@
                 <w:noProof/>
                 <w:webHidden/>
               </w:rPr>
-              <w:instrText xml:space="preserve"> PAGEREF _Toc236998697 \h </w:instrText>
+              <w:instrText xml:space="preserve"> PAGEREF _Toc237963414 \h </w:instrText>
             </w:r>
             <w:r>
               <w:rPr>
@@ -5546,7 +5620,7 @@
                 <w:noProof/>
                 <w:webHidden/>
               </w:rPr>
-              <w:t>12</w:t>
+              <w:t>16</w:t>
             </w:r>
             <w:r>
               <w:rPr>
@@ -5573,7 +5647,7 @@
               <w14:ligatures w14:val="standardContextual"/>
             </w:rPr>
           </w:pPr>
-          <w:hyperlink w:anchor="_Toc236998698" w:history="1">
+          <w:hyperlink w:anchor="_Toc237963415" w:history="1">
             <w:r>
               <w:rPr>
                 <w:rStyle w:val="Hyperlink"/>
@@ -5600,7 +5674,7 @@
                 <w:noProof/>
                 <w:webHidden/>
               </w:rPr>
-              <w:instrText xml:space="preserve"> PAGEREF _Toc236998698 \h </w:instrText>
+              <w:instrText xml:space="preserve"> PAGEREF _Toc237963415 \h </w:instrText>
             </w:r>
             <w:r>
               <w:rPr>
@@ -5620,7 +5694,7 @@
                 <w:noProof/>
                 <w:webHidden/>
               </w:rPr>
-              <w:t>13</w:t>
+              <w:t>17</w:t>
             </w:r>
             <w:r>
               <w:rPr>
@@ -5647,7 +5721,7 @@
               <w14:ligatures w14:val="standardContextual"/>
             </w:rPr>
           </w:pPr>
-          <w:hyperlink w:anchor="_Toc236998699" w:history="1">
+          <w:hyperlink w:anchor="_Toc237963416" w:history="1">
             <w:r>
               <w:rPr>
                 <w:rStyle w:val="Hyperlink"/>
@@ -5674,7 +5748,7 @@
                 <w:noProof/>
                 <w:webHidden/>
               </w:rPr>
-              <w:instrText xml:space="preserve"> PAGEREF _Toc236998699 \h </w:instrText>
+              <w:instrText xml:space="preserve"> PAGEREF _Toc237963416 \h </w:instrText>
             </w:r>
             <w:r>
               <w:rPr>
@@ -5694,7 +5768,7 @@
                 <w:noProof/>
                 <w:webHidden/>
               </w:rPr>
-              <w:t>13</w:t>
+              <w:t>17</w:t>
             </w:r>
             <w:r>
               <w:rPr>
@@ -5721,7 +5795,7 @@
               <w14:ligatures w14:val="standardContextual"/>
             </w:rPr>
           </w:pPr>
-          <w:hyperlink w:anchor="_Toc236998700" w:history="1">
+          <w:hyperlink w:anchor="_Toc237963417" w:history="1">
             <w:r>
               <w:rPr>
                 <w:rStyle w:val="Hyperlink"/>
@@ -5748,7 +5822,7 @@
                 <w:noProof/>
                 <w:webHidden/>
               </w:rPr>
-              <w:instrText xml:space="preserve"> PAGEREF _Toc236998700 \h </w:instrText>
+              <w:instrText xml:space="preserve"> PAGEREF _Toc237963417 \h </w:instrText>
             </w:r>
             <w:r>
               <w:rPr>
@@ -5768,7 +5842,7 @@
                 <w:noProof/>
                 <w:webHidden/>
               </w:rPr>
-              <w:t>14</w:t>
+              <w:t>18</w:t>
             </w:r>
             <w:r>
               <w:rPr>
@@ -5795,7 +5869,7 @@
               <w14:ligatures w14:val="standardContextual"/>
             </w:rPr>
           </w:pPr>
-          <w:hyperlink w:anchor="_Toc236998701" w:history="1">
+          <w:hyperlink w:anchor="_Toc237963418" w:history="1">
             <w:r>
               <w:rPr>
                 <w:rStyle w:val="Hyperlink"/>
@@ -5822,7 +5896,7 @@
                 <w:noProof/>
                 <w:webHidden/>
               </w:rPr>
-              <w:instrText xml:space="preserve"> PAGEREF _Toc236998701 \h </w:instrText>
+              <w:instrText xml:space="preserve"> PAGEREF _Toc237963418 \h </w:instrText>
             </w:r>
             <w:r>
               <w:rPr>
@@ -5842,7 +5916,7 @@
                 <w:noProof/>
                 <w:webHidden/>
               </w:rPr>
-              <w:t>14</w:t>
+              <w:t>19</w:t>
             </w:r>
             <w:r>
               <w:rPr>
@@ -5869,7 +5943,7 @@
               <w14:ligatures w14:val="standardContextual"/>
             </w:rPr>
           </w:pPr>
-          <w:hyperlink w:anchor="_Toc236998702" w:history="1">
+          <w:hyperlink w:anchor="_Toc237963419" w:history="1">
             <w:r>
               <w:rPr>
                 <w:rStyle w:val="Hyperlink"/>
@@ -5896,7 +5970,7 @@
                 <w:noProof/>
                 <w:webHidden/>
               </w:rPr>
-              <w:instrText xml:space="preserve"> PAGEREF _Toc236998702 \h </w:instrText>
+              <w:instrText xml:space="preserve"> PAGEREF _Toc237963419 \h </w:instrText>
             </w:r>
             <w:r>
               <w:rPr>
@@ -5916,7 +5990,7 @@
                 <w:noProof/>
                 <w:webHidden/>
               </w:rPr>
-              <w:t>14</w:t>
+              <w:t>19</w:t>
             </w:r>
             <w:r>
               <w:rPr>
@@ -5943,7 +6017,7 @@
               <w14:ligatures w14:val="standardContextual"/>
             </w:rPr>
           </w:pPr>
-          <w:hyperlink w:anchor="_Toc236998703" w:history="1">
+          <w:hyperlink w:anchor="_Toc237963420" w:history="1">
             <w:r>
               <w:rPr>
                 <w:rStyle w:val="Hyperlink"/>
@@ -5970,7 +6044,7 @@
                 <w:noProof/>
                 <w:webHidden/>
               </w:rPr>
-              <w:instrText xml:space="preserve"> PAGEREF _Toc236998703 \h </w:instrText>
+              <w:instrText xml:space="preserve"> PAGEREF _Toc237963420 \h </w:instrText>
             </w:r>
             <w:r>
               <w:rPr>
@@ -5990,7 +6064,7 @@
                 <w:noProof/>
                 <w:webHidden/>
               </w:rPr>
-              <w:t>15</w:t>
+              <w:t>19</w:t>
             </w:r>
             <w:r>
               <w:rPr>
@@ -6018,7 +6092,7 @@
               <w14:ligatures w14:val="standardContextual"/>
             </w:rPr>
           </w:pPr>
-          <w:hyperlink w:anchor="_Toc236998704" w:history="1">
+          <w:hyperlink w:anchor="_Toc237963421" w:history="1">
             <w:r>
               <w:rPr>
                 <w:rStyle w:val="Hyperlink"/>
@@ -6064,7 +6138,7 @@
                 <w:noProof/>
                 <w:webHidden/>
               </w:rPr>
-              <w:instrText xml:space="preserve"> PAGEREF _Toc236998704 \h </w:instrText>
+              <w:instrText xml:space="preserve"> PAGEREF _Toc237963421 \h </w:instrText>
             </w:r>
             <w:r>
               <w:rPr>
@@ -6084,7 +6158,7 @@
                 <w:noProof/>
                 <w:webHidden/>
               </w:rPr>
-              <w:t>15</w:t>
+              <w:t>20</w:t>
             </w:r>
             <w:r>
               <w:rPr>
@@ -6112,7 +6186,7 @@
               <w14:ligatures w14:val="standardContextual"/>
             </w:rPr>
           </w:pPr>
-          <w:hyperlink w:anchor="_Toc236998705" w:history="1">
+          <w:hyperlink w:anchor="_Toc237963422" w:history="1">
             <w:r>
               <w:rPr>
                 <w:rStyle w:val="Hyperlink"/>
@@ -6158,7 +6232,7 @@
                 <w:noProof/>
                 <w:webHidden/>
               </w:rPr>
-              <w:instrText xml:space="preserve"> PAGEREF _Toc236998705 \h </w:instrText>
+              <w:instrText xml:space="preserve"> PAGEREF _Toc237963422 \h </w:instrText>
             </w:r>
             <w:r>
               <w:rPr>
@@ -6178,7 +6252,7 @@
                 <w:noProof/>
                 <w:webHidden/>
               </w:rPr>
-              <w:t>15</w:t>
+              <w:t>20</w:t>
             </w:r>
             <w:r>
               <w:rPr>
@@ -6206,7 +6280,7 @@
               <w14:ligatures w14:val="standardContextual"/>
             </w:rPr>
           </w:pPr>
-          <w:hyperlink w:anchor="_Toc236998706" w:history="1">
+          <w:hyperlink w:anchor="_Toc237963423" w:history="1">
             <w:r>
               <w:rPr>
                 <w:rStyle w:val="Hyperlink"/>
@@ -6252,7 +6326,7 @@
                 <w:noProof/>
                 <w:webHidden/>
               </w:rPr>
-              <w:instrText xml:space="preserve"> PAGEREF _Toc236998706 \h </w:instrText>
+              <w:instrText xml:space="preserve"> PAGEREF _Toc237963423 \h </w:instrText>
             </w:r>
             <w:r>
               <w:rPr>
@@ -6272,7 +6346,7 @@
                 <w:noProof/>
                 <w:webHidden/>
               </w:rPr>
-              <w:t>16</w:t>
+              <w:t>21</w:t>
             </w:r>
             <w:r>
               <w:rPr>
@@ -6300,7 +6374,7 @@
               <w14:ligatures w14:val="standardContextual"/>
             </w:rPr>
           </w:pPr>
-          <w:hyperlink w:anchor="_Toc236998707" w:history="1">
+          <w:hyperlink w:anchor="_Toc237963424" w:history="1">
             <w:r>
               <w:rPr>
                 <w:rStyle w:val="Hyperlink"/>
@@ -6346,7 +6420,7 @@
                 <w:noProof/>
                 <w:webHidden/>
               </w:rPr>
-              <w:instrText xml:space="preserve"> PAGEREF _Toc236998707 \h </w:instrText>
+              <w:instrText xml:space="preserve"> PAGEREF _Toc237963424 \h </w:instrText>
             </w:r>
             <w:r>
               <w:rPr>
@@ -6366,7 +6440,7 @@
                 <w:noProof/>
                 <w:webHidden/>
               </w:rPr>
-              <w:t>16</w:t>
+              <w:t>21</w:t>
             </w:r>
             <w:r>
               <w:rPr>
@@ -6393,7 +6467,7 @@
               <w14:ligatures w14:val="standardContextual"/>
             </w:rPr>
           </w:pPr>
-          <w:hyperlink w:anchor="_Toc236998708" w:history="1">
+          <w:hyperlink w:anchor="_Toc237963425" w:history="1">
             <w:r>
               <w:rPr>
                 <w:rStyle w:val="Hyperlink"/>
@@ -6420,7 +6494,7 @@
                 <w:noProof/>
                 <w:webHidden/>
               </w:rPr>
-              <w:instrText xml:space="preserve"> PAGEREF _Toc236998708 \h </w:instrText>
+              <w:instrText xml:space="preserve"> PAGEREF _Toc237963425 \h </w:instrText>
             </w:r>
             <w:r>
               <w:rPr>
@@ -6440,7 +6514,7 @@
                 <w:noProof/>
                 <w:webHidden/>
               </w:rPr>
-              <w:t>17</w:t>
+              <w:t>22</w:t>
             </w:r>
             <w:r>
               <w:rPr>
@@ -6467,7 +6541,7 @@
               <w14:ligatures w14:val="standardContextual"/>
             </w:rPr>
           </w:pPr>
-          <w:hyperlink w:anchor="_Toc236998709" w:history="1">
+          <w:hyperlink w:anchor="_Toc237963426" w:history="1">
             <w:r>
               <w:rPr>
                 <w:rStyle w:val="Hyperlink"/>
@@ -6494,7 +6568,7 @@
                 <w:noProof/>
                 <w:webHidden/>
               </w:rPr>
-              <w:instrText xml:space="preserve"> PAGEREF _Toc236998709 \h </w:instrText>
+              <w:instrText xml:space="preserve"> PAGEREF _Toc237963426 \h </w:instrText>
             </w:r>
             <w:r>
               <w:rPr>
@@ -6514,7 +6588,7 @@
                 <w:noProof/>
                 <w:webHidden/>
               </w:rPr>
-              <w:t>17</w:t>
+              <w:t>22</w:t>
             </w:r>
             <w:r>
               <w:rPr>
@@ -6543,7 +6617,7 @@
       <w:pPr>
         <w:pStyle w:val="Heading1"/>
       </w:pPr>
-      <w:bookmarkStart w:id="0" w:name="_Toc236998676"/>
+      <w:bookmarkStart w:id="0" w:name="_Toc237963392"/>
       <w:r>
         <w:t>Project Objective</w:t>
       </w:r>
@@ -6553,7 +6627,7 @@
       <w:pPr>
         <w:pStyle w:val="Heading2"/>
       </w:pPr>
-      <w:bookmarkStart w:id="1" w:name="_Toc236998677"/>
+      <w:bookmarkStart w:id="1" w:name="_Toc237963393"/>
       <w:r>
         <w:t>Client background</w:t>
       </w:r>
@@ -6629,7 +6703,7 @@
       <w:pPr>
         <w:pStyle w:val="Heading2"/>
       </w:pPr>
-      <w:bookmarkStart w:id="2" w:name="_Toc236998678"/>
+      <w:bookmarkStart w:id="2" w:name="_Toc237963394"/>
       <w:r>
         <w:t>Deliverables</w:t>
       </w:r>
@@ -6651,7 +6725,7 @@
       <w:pPr>
         <w:pStyle w:val="Heading2"/>
       </w:pPr>
-      <w:bookmarkStart w:id="3" w:name="_Toc236998679"/>
+      <w:bookmarkStart w:id="3" w:name="_Toc237963395"/>
       <w:r>
         <w:t>Must haves</w:t>
       </w:r>
@@ -6669,7 +6743,7 @@
       <w:pPr>
         <w:pStyle w:val="Heading2"/>
       </w:pPr>
-      <w:bookmarkStart w:id="4" w:name="_Toc236998680"/>
+      <w:bookmarkStart w:id="4" w:name="_Toc237963396"/>
       <w:r>
         <w:t>Nice to haves</w:t>
       </w:r>
@@ -6737,7 +6811,7 @@
       <w:pPr>
         <w:pStyle w:val="Heading2"/>
       </w:pPr>
-      <w:bookmarkStart w:id="5" w:name="_Toc236998681"/>
+      <w:bookmarkStart w:id="5" w:name="_Toc237963397"/>
       <w:r>
         <w:lastRenderedPageBreak/>
         <w:t>Scope</w:t>
@@ -6808,9 +6882,11 @@
       <w:pPr>
         <w:pStyle w:val="Heading2"/>
       </w:pPr>
+      <w:bookmarkStart w:id="6" w:name="_Toc237963398"/>
       <w:r>
         <w:t>Use of AI</w:t>
       </w:r>
+      <w:bookmarkEnd w:id="6"/>
     </w:p>
     <w:p>
       <w:pPr>
@@ -6960,31 +7036,31 @@
       <w:pPr>
         <w:pStyle w:val="Heading1"/>
       </w:pPr>
-      <w:bookmarkStart w:id="6" w:name="_Toc236998682"/>
+      <w:bookmarkStart w:id="7" w:name="_Toc237963399"/>
       <w:r>
         <w:t>Project Plan</w:t>
       </w:r>
-      <w:bookmarkEnd w:id="6"/>
+      <w:bookmarkEnd w:id="7"/>
     </w:p>
     <w:p>
       <w:pPr>
         <w:pStyle w:val="Heading2"/>
       </w:pPr>
-      <w:bookmarkStart w:id="7" w:name="_Toc236998683"/>
+      <w:bookmarkStart w:id="8" w:name="_Toc237963400"/>
       <w:r>
         <w:t>Methodology</w:t>
       </w:r>
-      <w:bookmarkEnd w:id="7"/>
+      <w:bookmarkEnd w:id="8"/>
     </w:p>
     <w:p>
       <w:pPr>
         <w:pStyle w:val="Heading3"/>
       </w:pPr>
-      <w:bookmarkStart w:id="8" w:name="_Toc236998684"/>
+      <w:bookmarkStart w:id="9" w:name="_Toc237963401"/>
       <w:r>
         <w:t>Kanban</w:t>
       </w:r>
-      <w:bookmarkEnd w:id="8"/>
+      <w:bookmarkEnd w:id="9"/>
     </w:p>
     <w:p>
       <w:pPr>
@@ -7142,18 +7218,12 @@
         <w:rPr>
           <w:highlight w:val="yellow"/>
         </w:rPr>
-        <w:t>better</w:t>
+        <w:t xml:space="preserve">better </w:t>
       </w:r>
       <w:r>
         <w:rPr>
           <w:highlight w:val="yellow"/>
         </w:rPr>
-        <w:t xml:space="preserve"> </w:t>
-      </w:r>
-      <w:r>
-        <w:rPr>
-          <w:highlight w:val="yellow"/>
-        </w:rPr>
         <w:t>suit our requirements.</w:t>
       </w:r>
     </w:p>
@@ -7183,12 +7253,12 @@
       <w:pPr>
         <w:pStyle w:val="Heading3"/>
       </w:pPr>
-      <w:bookmarkStart w:id="9" w:name="_Toc236998685"/>
+      <w:bookmarkStart w:id="10" w:name="_Toc237963402"/>
       <w:r>
         <w:lastRenderedPageBreak/>
         <w:t>NIST CTFF</w:t>
       </w:r>
-      <w:bookmarkEnd w:id="9"/>
+      <w:bookmarkEnd w:id="10"/>
     </w:p>
     <w:p>
       <w:pPr>
@@ -7343,31 +7413,23 @@
         <w:t xml:space="preserve"> Add findings to final report</w:t>
       </w:r>
       <w:r>
-        <w:t xml:space="preserve">. </w:t>
+        <w:t>. Using this testing process, we believe that we can achieve the outcomes required of our project as it is a testing process specific to tool testing.</w:t>
       </w:r>
     </w:p>
     <w:p>
       <w:pPr>
         <w:pStyle w:val="TNR"/>
       </w:pPr>
-      <w:r>
-        <w:t>Using this testing process, we believe that we can achieve the outcomes required of our project as it is a testing process specific to tool testing.</w:t>
-      </w:r>
-    </w:p>
-    <w:p>
-      <w:pPr>
-        <w:pStyle w:val="TNR"/>
-      </w:pPr>
     </w:p>
     <w:p>
       <w:pPr>
         <w:pStyle w:val="Heading2"/>
       </w:pPr>
-      <w:bookmarkStart w:id="10" w:name="_Toc236998686"/>
+      <w:bookmarkStart w:id="11" w:name="_Toc237963403"/>
       <w:r>
         <w:t>Technologies</w:t>
       </w:r>
-      <w:bookmarkEnd w:id="10"/>
+      <w:bookmarkEnd w:id="11"/>
     </w:p>
     <w:p>
       <w:pPr>
@@ -7391,21 +7453,26 @@
         </w:rPr>
         <w:t xml:space="preserve"> The Technologies that will be used are </w:t>
       </w:r>
-      <w:proofErr w:type="gramStart"/>
       <w:r>
         <w:rPr>
           <w:rFonts w:cs="Times New Roman"/>
           <w:highlight w:val="green"/>
         </w:rPr>
-        <w:t>Kali</w:t>
-      </w:r>
-      <w:proofErr w:type="gramEnd"/>
+        <w:t>Kali,</w:t>
+      </w:r>
       <w:r>
         <w:rPr>
           <w:rFonts w:cs="Times New Roman"/>
           <w:highlight w:val="green"/>
         </w:rPr>
         <w:t xml:space="preserve"> which is a Linux distribution, LM studio and Ollama, Git Hub, Discord and </w:t>
+      </w:r>
+      <w:r>
+        <w:rPr>
+          <w:rFonts w:cs="Times New Roman"/>
+          <w:highlight w:val="green"/>
+        </w:rPr>
+        <w:t>the various tools that we have selected for evaluation.</w:t>
       </w:r>
     </w:p>
     <w:p>
@@ -7491,7 +7558,7 @@
           <w:szCs w:val="24"/>
           <w:highlight w:val="green"/>
         </w:rPr>
-        <w:t xml:space="preserve"> (</w:t>
+        <w:t xml:space="preserve"> (Kali GNU Linux Rolling 2026.3)</w:t>
       </w:r>
       <w:r>
         <w:rPr>
@@ -7500,7 +7567,7 @@
           <w:szCs w:val="24"/>
           <w:highlight w:val="green"/>
         </w:rPr>
-        <w:t>Kali GNU Linux Rolling 2026.3</w:t>
+        <w:t xml:space="preserve"> which is the most updated version pulled from kali-dev</w:t>
       </w:r>
       <w:r>
         <w:rPr>
@@ -7509,7 +7576,7 @@
           <w:szCs w:val="24"/>
           <w:highlight w:val="green"/>
         </w:rPr>
-        <w:t>)</w:t>
+        <w:t xml:space="preserve">, </w:t>
       </w:r>
       <w:r>
         <w:rPr>
@@ -7518,17 +7585,19 @@
           <w:szCs w:val="24"/>
           <w:highlight w:val="green"/>
         </w:rPr>
-        <w:t xml:space="preserve"> which is the most updated version pulled from kali-dev</w:t>
-      </w:r>
-      <w:r>
+        <w:t xml:space="preserve">which is the Debian testing area for new kali updates. </w:t>
+      </w:r>
+    </w:p>
+    <w:p>
+      <w:pPr>
+        <w:pStyle w:val="Heading4"/>
         <w:rPr>
           <w:rFonts w:ascii="Times New Roman" w:hAnsi="Times New Roman" w:cs="Times New Roman"/>
           <w:sz w:val="24"/>
           <w:szCs w:val="24"/>
           <w:highlight w:val="green"/>
         </w:rPr>
-        <w:t xml:space="preserve">, </w:t>
-      </w:r>
+      </w:pPr>
       <w:r>
         <w:rPr>
           <w:rFonts w:ascii="Times New Roman" w:hAnsi="Times New Roman" w:cs="Times New Roman"/>
@@ -7536,19 +7605,17 @@
           <w:szCs w:val="24"/>
           <w:highlight w:val="green"/>
         </w:rPr>
-        <w:t xml:space="preserve">which is the Debian testing area for new kali updates. </w:t>
-      </w:r>
-    </w:p>
-    <w:p>
-      <w:pPr>
-        <w:pStyle w:val="Heading4"/>
+        <w:t>LM</w:t>
+      </w:r>
+      <w:r>
         <w:rPr>
           <w:rFonts w:ascii="Times New Roman" w:hAnsi="Times New Roman" w:cs="Times New Roman"/>
           <w:sz w:val="24"/>
           <w:szCs w:val="24"/>
           <w:highlight w:val="green"/>
         </w:rPr>
-      </w:pPr>
+        <w:t xml:space="preserve"> S</w:t>
+      </w:r>
       <w:r>
         <w:rPr>
           <w:rFonts w:ascii="Times New Roman" w:hAnsi="Times New Roman" w:cs="Times New Roman"/>
@@ -7556,7 +7623,7 @@
           <w:szCs w:val="24"/>
           <w:highlight w:val="green"/>
         </w:rPr>
-        <w:t>LM</w:t>
+        <w:t>tudio</w:t>
       </w:r>
       <w:r>
         <w:rPr>
@@ -7565,34 +7632,7 @@
           <w:szCs w:val="24"/>
           <w:highlight w:val="green"/>
         </w:rPr>
-        <w:t xml:space="preserve"> S</w:t>
-      </w:r>
-      <w:r>
-        <w:rPr>
-          <w:rFonts w:ascii="Times New Roman" w:hAnsi="Times New Roman" w:cs="Times New Roman"/>
-          <w:sz w:val="24"/>
-          <w:szCs w:val="24"/>
-          <w:highlight w:val="green"/>
-        </w:rPr>
-        <w:t>tudio</w:t>
-      </w:r>
-      <w:r>
-        <w:rPr>
-          <w:rFonts w:ascii="Times New Roman" w:hAnsi="Times New Roman" w:cs="Times New Roman"/>
-          <w:sz w:val="24"/>
-          <w:szCs w:val="24"/>
-          <w:highlight w:val="green"/>
-        </w:rPr>
-        <w:t xml:space="preserve"> &amp; </w:t>
-      </w:r>
-      <w:r>
-        <w:rPr>
-          <w:rFonts w:ascii="Times New Roman" w:hAnsi="Times New Roman" w:cs="Times New Roman"/>
-          <w:sz w:val="24"/>
-          <w:szCs w:val="24"/>
-          <w:highlight w:val="green"/>
-        </w:rPr>
-        <w:t>Ollama</w:t>
+        <w:t xml:space="preserve"> &amp; Ollama</w:t>
       </w:r>
     </w:p>
     <w:p>
@@ -7698,21 +7738,7 @@
           <w:rFonts w:cs="Times New Roman"/>
           <w:highlight w:val="green"/>
         </w:rPr>
-        <w:t xml:space="preserve">Large corporations such as </w:t>
-      </w:r>
-      <w:r>
-        <w:rPr>
-          <w:rFonts w:cs="Times New Roman"/>
-          <w:highlight w:val="green"/>
-        </w:rPr>
-        <w:t>OpenAI</w:t>
-      </w:r>
-      <w:r>
-        <w:rPr>
-          <w:rFonts w:cs="Times New Roman"/>
-          <w:highlight w:val="green"/>
-        </w:rPr>
-        <w:t xml:space="preserve"> or Anthropic use these systems to answer prompts given to them by online users, which potentially poses a risk to security as data would need to be sent outside of the local </w:t>
+        <w:t xml:space="preserve">Large corporations such as OpenAI or Anthropic use these systems to answer prompts given to them by online users, which potentially poses a risk to security as data would need to be sent outside of the local </w:t>
       </w:r>
       <w:r>
         <w:rPr>
@@ -7749,14 +7775,7 @@
           <w:rFonts w:cs="Times New Roman"/>
           <w:highlight w:val="green"/>
         </w:rPr>
-        <w:t xml:space="preserve"> (Build 2)</w:t>
-      </w:r>
-      <w:r>
-        <w:rPr>
-          <w:rFonts w:cs="Times New Roman"/>
-          <w:highlight w:val="green"/>
-        </w:rPr>
-        <w:t xml:space="preserve"> and Ollama will be running on </w:t>
+        <w:t xml:space="preserve"> (Build 2) and Ollama will be running on </w:t>
       </w:r>
       <w:r>
         <w:rPr>
@@ -7817,7 +7836,33 @@
         <w:rPr>
           <w:rFonts w:cs="Times New Roman"/>
         </w:rPr>
-        <w:t>Our group will be using GitHub repository in order to collate our work, and which provides us with a clear history of changes and can provide a timeline for when work was completed in order to be presented once the project has been completed.</w:t>
+        <w:t>Our group will be using GitHub repository in order to collate our work</w:t>
+      </w:r>
+      <w:r>
+        <w:rPr>
+          <w:rFonts w:cs="Times New Roman"/>
+          <w:highlight w:val="yellow"/>
+        </w:rPr>
+        <w:t>,</w:t>
+      </w:r>
+      <w:r>
+        <w:rPr>
+          <w:rFonts w:cs="Times New Roman"/>
+          <w:highlight w:val="yellow"/>
+        </w:rPr>
+        <w:t xml:space="preserve"> Git Hub is a program that allows us to work from a single repository /directory which makes it easy for us to keep a single documented project file which can then be submitted as our work at the end of the project, this also</w:t>
+      </w:r>
+      <w:r>
+        <w:rPr>
+          <w:rFonts w:cs="Times New Roman"/>
+        </w:rPr>
+        <w:t xml:space="preserve"> </w:t>
+      </w:r>
+      <w:r>
+        <w:rPr>
+          <w:rFonts w:cs="Times New Roman"/>
+        </w:rPr>
+        <w:t>provides us with a clear history of changes and can provide a timeline for when work was completed in order to be presented once the project has been completed.</w:t>
       </w:r>
       <w:r>
         <w:rPr>
@@ -7879,44 +7924,100 @@
       <w:r>
         <w:rPr>
           <w:rFonts w:cs="Times New Roman"/>
+          <w:highlight w:val="yellow"/>
         </w:rPr>
         <w:t xml:space="preserve">The team will communicate </w:t>
       </w:r>
       <w:r>
         <w:rPr>
           <w:rFonts w:cs="Times New Roman"/>
+          <w:highlight w:val="yellow"/>
         </w:rPr>
         <w:t xml:space="preserve">primarily using </w:t>
       </w:r>
       <w:r>
         <w:rPr>
           <w:rFonts w:cs="Times New Roman"/>
-        </w:rPr>
-        <w:t>Discord</w:t>
+          <w:highlight w:val="yellow"/>
+        </w:rPr>
+        <w:t>Discor</w:t>
       </w:r>
       <w:r>
         <w:rPr>
           <w:rFonts w:cs="Times New Roman"/>
-        </w:rPr>
-        <w:t xml:space="preserve">, </w:t>
+          <w:highlight w:val="yellow"/>
+        </w:rPr>
+        <w:t xml:space="preserve">d. Discord is a program that allows users to communicate both orally and over text/images through servers provided by Discord </w:t>
       </w:r>
       <w:r>
         <w:rPr>
           <w:rFonts w:cs="Times New Roman"/>
-          <w:highlight w:val="green"/>
-        </w:rPr>
-        <w:t xml:space="preserve">this is because discord is our preferred communication device and will be used to host voice calls in leu of zoom meetings as it facilitates a better communication flow </w:t>
+          <w:highlight w:val="yellow"/>
+        </w:rPr>
+        <w:t>itself</w:t>
       </w:r>
       <w:r>
         <w:rPr>
           <w:rFonts w:cs="Times New Roman"/>
-          <w:highlight w:val="green"/>
-        </w:rPr>
-        <w:t>for our personal needs than zoom meetings do</w:t>
+          <w:highlight w:val="yellow"/>
+        </w:rPr>
+        <w:t xml:space="preserve">, this effectively enables us to use this space as constant meeting room that we can join in and out of according to our </w:t>
       </w:r>
       <w:r>
         <w:rPr>
           <w:rFonts w:cs="Times New Roman"/>
+          <w:highlight w:val="yellow"/>
+        </w:rPr>
+        <w:t>day-to-day</w:t>
+      </w:r>
+      <w:r>
+        <w:rPr>
+          <w:rFonts w:cs="Times New Roman"/>
+          <w:highlight w:val="yellow"/>
+        </w:rPr>
+        <w:t xml:space="preserve"> requirements. This was chosen because</w:t>
+      </w:r>
+      <w:r>
+        <w:rPr>
+          <w:rFonts w:cs="Times New Roman"/>
+          <w:highlight w:val="yellow"/>
+        </w:rPr>
+        <w:t xml:space="preserve"> discord is our preferred communication device</w:t>
+      </w:r>
+      <w:r>
+        <w:rPr>
+          <w:rFonts w:cs="Times New Roman"/>
+          <w:highlight w:val="yellow"/>
+        </w:rPr>
+        <w:t xml:space="preserve"> that we are well comfortable with as we have all used it in the </w:t>
+      </w:r>
+      <w:proofErr w:type="gramStart"/>
+      <w:r>
+        <w:rPr>
+          <w:rFonts w:cs="Times New Roman"/>
+          <w:highlight w:val="yellow"/>
+        </w:rPr>
+        <w:t>past, and</w:t>
+      </w:r>
+      <w:proofErr w:type="gramEnd"/>
+      <w:r>
+        <w:rPr>
+          <w:rFonts w:cs="Times New Roman"/>
+          <w:highlight w:val="yellow"/>
+        </w:rPr>
+        <w:t xml:space="preserve"> will be used to host</w:t>
+      </w:r>
+      <w:r>
+        <w:rPr>
+          <w:rFonts w:cs="Times New Roman"/>
+          <w:highlight w:val="yellow"/>
+        </w:rPr>
+        <w:t xml:space="preserve"> our team meetings</w:t>
+      </w:r>
+      <w:r>
+        <w:rPr>
+          <w:rFonts w:cs="Times New Roman"/>
+          <w:highlight w:val="yellow"/>
         </w:rPr>
         <w:t>.</w:t>
       </w:r>
@@ -8284,7 +8385,6 @@
         </w:rPr>
         <w:t xml:space="preserve">CyberChef is a simple, intuitive web app for carrying out all manner of "cyber" operations within a web browser. These operations include simple encoding like XOR and Base64, more complex encryption like AES, DES and Blowfish, creating binary and </w:t>
       </w:r>
-      <w:proofErr w:type="spellStart"/>
       <w:r>
         <w:rPr>
           <w:rFonts w:ascii="Times New Roman" w:hAnsi="Times New Roman" w:cs="Times New Roman"/>
@@ -8292,9 +8392,8 @@
           <w:szCs w:val="24"/>
           <w:highlight w:val="cyan"/>
         </w:rPr>
-        <w:t>hexdumps</w:t>
-      </w:r>
-      <w:proofErr w:type="spellEnd"/>
+        <w:t>hex dumps</w:t>
+      </w:r>
       <w:r>
         <w:rPr>
           <w:rFonts w:ascii="Times New Roman" w:hAnsi="Times New Roman" w:cs="Times New Roman"/>
@@ -8302,25 +8401,7 @@
           <w:szCs w:val="24"/>
           <w:highlight w:val="cyan"/>
         </w:rPr>
-        <w:t>, compression and decompression of data, calculating hashes and checksums, IPv6 and X.509 parsing, changing character encodings, and much more.</w:t>
-      </w:r>
-      <w:r>
-        <w:rPr>
-          <w:rFonts w:ascii="Times New Roman" w:hAnsi="Times New Roman" w:cs="Times New Roman"/>
-          <w:sz w:val="24"/>
-          <w:szCs w:val="24"/>
-          <w:highlight w:val="cyan"/>
-        </w:rPr>
-        <w:t xml:space="preserve"> </w:t>
-      </w:r>
-      <w:r>
-        <w:rPr>
-          <w:rFonts w:ascii="Times New Roman" w:hAnsi="Times New Roman" w:cs="Times New Roman"/>
-          <w:sz w:val="24"/>
-          <w:szCs w:val="24"/>
-          <w:highlight w:val="cyan"/>
-        </w:rPr>
-        <w:t>The tool is designed to enable both technical and non-technical analysts to manipulate data in complex ways without having to deal with complex tools or algorithms</w:t>
+        <w:t>, compression and decompression of data, calculating hashes and checksums, IPv6 and X.509 parsing, changing character encodings, and much more. The tool is designed to enable both technical and non-technical analysts to manipulate data in complex ways without having to deal with complex tools or algorithms</w:t>
       </w:r>
       <w:r>
         <w:rPr>
@@ -8371,6 +8452,7 @@
           <w:sz w:val="24"/>
           <w:szCs w:val="24"/>
         </w:rPr>
+        <w:lastRenderedPageBreak/>
         <w:t>The version being used is:</w:t>
       </w:r>
     </w:p>
@@ -8419,7 +8501,6 @@
           <w:sz w:val="24"/>
           <w:szCs w:val="24"/>
         </w:rPr>
-        <w:lastRenderedPageBreak/>
         <w:t>Volatility</w:t>
       </w:r>
     </w:p>
@@ -8603,7 +8684,16 @@
           <w:sz w:val="24"/>
           <w:szCs w:val="24"/>
         </w:rPr>
-        <w:t>Exiftool is a platform independent command line application for reading writing and editing meta information in a wide variety of files, this primarily can be used for editing metadata. This is not an AI tool and therefor does not require the use of LLMs.</w:t>
+        <w:t xml:space="preserve">Exiftool is a platform independent command line application for reading writing and editing meta information in a wide variety of files, this primarily can be used for editing metadata. </w:t>
+      </w:r>
+      <w:r>
+        <w:rPr>
+          <w:rFonts w:ascii="Times New Roman" w:hAnsi="Times New Roman" w:cs="Times New Roman"/>
+          <w:sz w:val="24"/>
+          <w:szCs w:val="24"/>
+          <w:highlight w:val="darkYellow"/>
+        </w:rPr>
+        <w:t>This is not an AI tool and therefor does not require the use of LLMs.</w:t>
       </w:r>
     </w:p>
     <w:p>
@@ -8689,16 +8779,14 @@
         </w:rPr>
         <w:t xml:space="preserve">Foremost is a tool that is used as a digital forensic program to recover lost files based on their header’s footers and internal data structures, foremost works on image files, such as those generated by dd, </w:t>
       </w:r>
-      <w:proofErr w:type="spellStart"/>
       <w:r>
         <w:rPr>
           <w:rFonts w:ascii="Times New Roman" w:hAnsi="Times New Roman" w:cs="Times New Roman"/>
           <w:sz w:val="24"/>
           <w:szCs w:val="24"/>
         </w:rPr>
-        <w:t>safeback</w:t>
-      </w:r>
-      <w:proofErr w:type="spellEnd"/>
+        <w:t>safe back</w:t>
+      </w:r>
       <w:r>
         <w:rPr>
           <w:rFonts w:ascii="Times New Roman" w:hAnsi="Times New Roman" w:cs="Times New Roman"/>
@@ -8960,7 +9048,11 @@
         <w:t>an</w:t>
       </w:r>
       <w:r>
-        <w:t xml:space="preserve"> integrity score afterwards that can help inform the users decisions on whether or not the image has been manipulated. </w:t>
+        <w:t xml:space="preserve"> </w:t>
+      </w:r>
+      <w:r>
+        <w:lastRenderedPageBreak/>
+        <w:t xml:space="preserve">integrity score afterwards that can help inform the users decisions on whether or not the image has been manipulated. </w:t>
       </w:r>
       <w:r>
         <w:rPr>
@@ -9033,7 +9125,13 @@
         <w:jc w:val="both"/>
       </w:pPr>
       <w:r>
-        <w:t>Wireshark is a network monitoring tool that allows users to see what’s happening on their network at a microscopic level, this meaning that it enables users to see all the incoming and outgoing traffic to and from their computer as well as the network they are connected to, this means that packets can be inspected for malicious activity and any other nefarious work travelling through their network. This application does require the use of AI.</w:t>
+        <w:t xml:space="preserve">Wireshark is a network monitoring tool that allows users to see what’s happening on their network at a microscopic level, this meaning that it enables users to see all the incoming and outgoing traffic to and from their computer as well as the network they are connected to, this means that packets can be inspected for malicious activity and any other nefarious work travelling through their network. </w:t>
+      </w:r>
+      <w:r>
+        <w:rPr>
+          <w:highlight w:val="darkYellow"/>
+        </w:rPr>
+        <w:t>This application does require the use of AI.</w:t>
       </w:r>
     </w:p>
     <w:p>
@@ -9083,11 +9181,9 @@
       <w:r>
         <w:t xml:space="preserve">PassLLM is essentially a Large Language Model which uses Personally Identifiable Information (PII) – such as names, </w:t>
       </w:r>
-      <w:proofErr w:type="spellStart"/>
-      <w:r>
-        <w:t>birtdays</w:t>
-      </w:r>
-      <w:proofErr w:type="spellEnd"/>
+      <w:r>
+        <w:t>birthdays</w:t>
+      </w:r>
       <w:r>
         <w:t>, phone numbers, emails and previous passwords to predict passwords that targets are likely to use. The LLM uses this information and guesses passwords based on the information it has and supposedly outperforms other models by 15% to 45% in most scenarios meaning that this is a potentially capable system. Obviously due to the nature of LLMs this machine uses AI to achieve its outcomes.</w:t>
       </w:r>
@@ -9112,11 +9208,6 @@
     </w:p>
     <w:p>
       <w:pPr>
-        <w:jc w:val="both"/>
-      </w:pPr>
-    </w:p>
-    <w:p>
-      <w:pPr>
         <w:pStyle w:val="Heading5"/>
         <w:jc w:val="both"/>
         <w:rPr>
@@ -9138,6 +9229,39 @@
       <w:pPr>
         <w:jc w:val="both"/>
       </w:pPr>
+      <w:r>
+        <w:t>Unearth is digital forensics investigating platform designed to help investigators uncover hidden or deleted information from digital systems, it combines data recovery techniques with intelligent content analysis in a single environment. The platform can recover deleted files from modern file systems and analyse recovered data and assist investigators in understanding what happened in a system</w:t>
+      </w:r>
+      <w:r>
+        <w:rPr>
+          <w:highlight w:val="darkYellow"/>
+        </w:rPr>
+        <w:t>. This system includes AI based tools.</w:t>
+      </w:r>
+    </w:p>
+    <w:p>
+      <w:pPr>
+        <w:jc w:val="both"/>
+      </w:pPr>
+      <w:r>
+        <w:t>The version being used is:</w:t>
+      </w:r>
+    </w:p>
+    <w:p>
+      <w:pPr>
+        <w:jc w:val="both"/>
+      </w:pPr>
+      <w:hyperlink r:id="rId21" w:history="1">
+        <w:r>
+          <w:rPr>
+            <w:rStyle w:val="Hyperlink"/>
+          </w:rPr>
+          <w:t>https://github.com/rainlizard/Unearth/tree/main</w:t>
+        </w:r>
+      </w:hyperlink>
+      <w:r>
+        <w:t xml:space="preserve"> </w:t>
+      </w:r>
     </w:p>
     <w:p>
       <w:pPr>
@@ -9160,8 +9284,65 @@
     </w:p>
     <w:p>
       <w:pPr>
+        <w:tabs>
+          <w:tab w:val="left" w:pos="989"/>
+        </w:tabs>
         <w:jc w:val="both"/>
       </w:pPr>
+      <w:r>
+        <w:t xml:space="preserve">Valhuntir is an AI augmented but human driven program that turns a single incident response analyst into the manager of an agentic AI incident response team. A host of MCP tools allows for the AI to quickly ingest, process and analyse massive amounts of digital forensics artifacts while keeping the human in control of the investigation and decision-making process. This means that despite being </w:t>
+      </w:r>
+      <w:r>
+        <w:t>an</w:t>
+      </w:r>
+      <w:r>
+        <w:t xml:space="preserve"> AI tool it allows for the human in control to drive the process and steer it into the deliverables the human is seeking to </w:t>
+      </w:r>
+      <w:r>
+        <w:t>achieve.</w:t>
+      </w:r>
+      <w:r>
+        <w:t xml:space="preserve"> The AI must be hosted on your own system or on the same network and therefor will take advantage of our system that we have setup.</w:t>
+      </w:r>
+      <w:r>
+        <w:t xml:space="preserve"> </w:t>
+      </w:r>
+      <w:r>
+        <w:rPr>
+          <w:highlight w:val="darkYellow"/>
+        </w:rPr>
+        <w:t>This obviously uses AI tools</w:t>
+      </w:r>
+    </w:p>
+    <w:p>
+      <w:pPr>
+        <w:tabs>
+          <w:tab w:val="left" w:pos="989"/>
+        </w:tabs>
+        <w:jc w:val="both"/>
+      </w:pPr>
+      <w:r>
+        <w:t>The version being used is:</w:t>
+      </w:r>
+    </w:p>
+    <w:p>
+      <w:pPr>
+        <w:tabs>
+          <w:tab w:val="left" w:pos="989"/>
+        </w:tabs>
+        <w:jc w:val="both"/>
+      </w:pPr>
+      <w:hyperlink r:id="rId22" w:history="1">
+        <w:r>
+          <w:rPr>
+            <w:rStyle w:val="Hyperlink"/>
+          </w:rPr>
+          <w:t>https://github.com/AppliedIR/Valhuntir</w:t>
+        </w:r>
+      </w:hyperlink>
+      <w:r>
+        <w:t xml:space="preserve"> </w:t>
+      </w:r>
     </w:p>
     <w:p>
       <w:pPr>
@@ -9179,6 +9360,7 @@
           <w:sz w:val="24"/>
           <w:szCs w:val="24"/>
         </w:rPr>
+        <w:lastRenderedPageBreak/>
         <w:t>Unfold</w:t>
       </w:r>
     </w:p>
@@ -9186,6 +9368,46 @@
       <w:pPr>
         <w:jc w:val="both"/>
       </w:pPr>
+      <w:r>
+        <w:t xml:space="preserve">Unfold </w:t>
+      </w:r>
+      <w:r>
+        <w:t xml:space="preserve">is a tool that functions by using the volatility3 script in order to run Disk analysis digital forensics, it does this by running a script that invokes a python shell for volatility3 from where you can input the commands to receive the desired outcomes, this application is allegedly packaged with AI functionality however it seems that this is packaged in a manner that requires it to be outsourced to OpenAI or DeepSeek which leads us to believe that it is not the most secure tool. </w:t>
+      </w:r>
+      <w:r>
+        <w:rPr>
+          <w:color w:val="000000" w:themeColor="text1"/>
+          <w:highlight w:val="darkYellow"/>
+        </w:rPr>
+        <w:t>This tool has AI functionality but for the most part relies on Volatility3 for its capabilities and therefor is reflective of that tool</w:t>
+      </w:r>
+      <w:r>
+        <w:t>.</w:t>
+      </w:r>
+    </w:p>
+    <w:p>
+      <w:pPr>
+        <w:jc w:val="both"/>
+      </w:pPr>
+      <w:r>
+        <w:t>The version being used is:</w:t>
+      </w:r>
+    </w:p>
+    <w:p>
+      <w:pPr>
+        <w:jc w:val="both"/>
+      </w:pPr>
+      <w:hyperlink r:id="rId23" w:history="1">
+        <w:r>
+          <w:rPr>
+            <w:rStyle w:val="Hyperlink"/>
+          </w:rPr>
+          <w:t>https://github.com/arazazi/UNFOLD</w:t>
+        </w:r>
+      </w:hyperlink>
+      <w:r>
+        <w:t xml:space="preserve"> </w:t>
+      </w:r>
     </w:p>
     <w:p>
       <w:pPr>
@@ -9210,20 +9432,43 @@
       <w:pPr>
         <w:jc w:val="both"/>
       </w:pPr>
+      <w:r>
+        <w:t xml:space="preserve">autopsy is the premier open-source forensics platform, which is fast, easy to use, and capable of analysing all types of mobile devices and digital media. Its plugin architecture enables extensibility from community developed or custom-built modules. Autopsy evolves to meet the needs of hundreds of thousands of professionals in law enforcement, national security, litigation support and corporate investigation. </w:t>
+      </w:r>
+      <w:r>
+        <w:rPr>
+          <w:highlight w:val="darkYellow"/>
+        </w:rPr>
+        <w:t>This tool does not use AI:</w:t>
+      </w:r>
     </w:p>
     <w:p>
       <w:pPr>
         <w:jc w:val="both"/>
       </w:pPr>
-    </w:p>
-    <w:p>
-      <w:pPr>
-        <w:pStyle w:val="TNR"/>
-      </w:pPr>
-    </w:p>
-    <w:p>
-      <w:pPr>
-        <w:pStyle w:val="TNR"/>
+      <w:r>
+        <w:t>The version being used is:</w:t>
+      </w:r>
+    </w:p>
+    <w:p>
+      <w:pPr>
+        <w:jc w:val="both"/>
+      </w:pPr>
+      <w:hyperlink r:id="rId24" w:history="1">
+        <w:r>
+          <w:rPr>
+            <w:rStyle w:val="Hyperlink"/>
+          </w:rPr>
+          <w:t>https://www.autopsy.com/</w:t>
+        </w:r>
+      </w:hyperlink>
+      <w:r>
+        <w:t xml:space="preserve"> </w:t>
+      </w:r>
+    </w:p>
+    <w:p>
+      <w:pPr>
+        <w:jc w:val="both"/>
       </w:pPr>
     </w:p>
     <w:p>
@@ -9231,11 +9476,11 @@
         <w:pStyle w:val="Heading2"/>
         <w:jc w:val="both"/>
       </w:pPr>
-      <w:bookmarkStart w:id="11" w:name="_Toc236998687"/>
+      <w:bookmarkStart w:id="12" w:name="_Toc237963404"/>
       <w:r>
         <w:t>Project budget</w:t>
       </w:r>
-      <w:bookmarkEnd w:id="11"/>
+      <w:bookmarkEnd w:id="12"/>
     </w:p>
     <w:p>
       <w:pPr>
@@ -9280,26 +9525,26 @@
         <w:pStyle w:val="Heading1"/>
         <w:jc w:val="both"/>
       </w:pPr>
-      <w:bookmarkStart w:id="12" w:name="_Toc236665775"/>
-      <w:bookmarkStart w:id="13" w:name="_Toc236998688"/>
+      <w:bookmarkStart w:id="13" w:name="_Toc236665775"/>
+      <w:bookmarkStart w:id="14" w:name="_Toc237963405"/>
       <w:r>
         <w:t>Project Personnel</w:t>
       </w:r>
-      <w:bookmarkEnd w:id="12"/>
       <w:bookmarkEnd w:id="13"/>
+      <w:bookmarkEnd w:id="14"/>
     </w:p>
     <w:p>
       <w:pPr>
         <w:pStyle w:val="Heading2"/>
         <w:jc w:val="both"/>
       </w:pPr>
-      <w:bookmarkStart w:id="14" w:name="_Toc236665776"/>
-      <w:bookmarkStart w:id="15" w:name="_Toc236998689"/>
+      <w:bookmarkStart w:id="15" w:name="_Toc236665776"/>
+      <w:bookmarkStart w:id="16" w:name="_Toc237963406"/>
       <w:r>
         <w:t>Client details including organisation</w:t>
       </w:r>
-      <w:bookmarkEnd w:id="14"/>
       <w:bookmarkEnd w:id="15"/>
+      <w:bookmarkEnd w:id="16"/>
     </w:p>
     <w:p>
       <w:pPr>
@@ -9329,13 +9574,14 @@
       <w:pPr>
         <w:pStyle w:val="Heading2"/>
       </w:pPr>
-      <w:bookmarkStart w:id="16" w:name="_Toc236665777"/>
-      <w:bookmarkStart w:id="17" w:name="_Toc236998690"/>
-      <w:r>
+      <w:bookmarkStart w:id="17" w:name="_Toc236665777"/>
+      <w:bookmarkStart w:id="18" w:name="_Toc237963407"/>
+      <w:r>
+        <w:lastRenderedPageBreak/>
         <w:t>Group Members</w:t>
       </w:r>
-      <w:bookmarkEnd w:id="16"/>
       <w:bookmarkEnd w:id="17"/>
+      <w:bookmarkEnd w:id="18"/>
     </w:p>
     <w:p>
       <w:pPr>
@@ -9597,13 +9843,13 @@
       <w:pPr>
         <w:pStyle w:val="Heading2"/>
       </w:pPr>
-      <w:bookmarkStart w:id="18" w:name="_Toc236665778"/>
-      <w:bookmarkStart w:id="19" w:name="_Toc236998691"/>
+      <w:bookmarkStart w:id="19" w:name="_Toc236665778"/>
+      <w:bookmarkStart w:id="20" w:name="_Toc237963408"/>
       <w:r>
         <w:t>Project Advisor</w:t>
       </w:r>
-      <w:bookmarkEnd w:id="18"/>
       <w:bookmarkEnd w:id="19"/>
+      <w:bookmarkEnd w:id="20"/>
     </w:p>
     <w:p>
       <w:pPr>
@@ -9617,13 +9863,13 @@
       <w:pPr>
         <w:pStyle w:val="Heading3"/>
       </w:pPr>
-      <w:bookmarkStart w:id="20" w:name="_Toc236665779"/>
-      <w:bookmarkStart w:id="21" w:name="_Toc236998692"/>
+      <w:bookmarkStart w:id="21" w:name="_Toc236665779"/>
+      <w:bookmarkStart w:id="22" w:name="_Toc237963409"/>
       <w:r>
         <w:t>Communication plan</w:t>
       </w:r>
-      <w:bookmarkEnd w:id="20"/>
       <w:bookmarkEnd w:id="21"/>
+      <w:bookmarkEnd w:id="22"/>
     </w:p>
     <w:tbl>
       <w:tblPr>
@@ -9728,7 +9974,6 @@
               <w:pStyle w:val="TNR"/>
             </w:pPr>
             <w:r>
-              <w:lastRenderedPageBreak/>
               <w:t xml:space="preserve">Project advisor: Clement </w:t>
             </w:r>
             <w:proofErr w:type="spellStart"/>
@@ -9971,16 +10216,16 @@
       <w:pPr>
         <w:pStyle w:val="Heading2"/>
       </w:pPr>
-      <w:bookmarkStart w:id="22" w:name="_Toc236665780"/>
-      <w:bookmarkStart w:id="23" w:name="_Toc236998693"/>
+      <w:bookmarkStart w:id="23" w:name="_Toc236665780"/>
+      <w:bookmarkStart w:id="24" w:name="_Toc237963410"/>
       <w:r>
         <w:t xml:space="preserve">General </w:t>
       </w:r>
       <w:r>
         <w:t>Conflict of Interest statement</w:t>
       </w:r>
-      <w:bookmarkEnd w:id="22"/>
       <w:bookmarkEnd w:id="23"/>
+      <w:bookmarkEnd w:id="24"/>
     </w:p>
     <w:p>
       <w:pPr>
@@ -9995,7 +10240,11 @@
       </w:r>
       <w:proofErr w:type="spellEnd"/>
       <w:r>
-        <w:t xml:space="preserve"> staff, his employer is the same as the institution that runs this capstone course, this constitutes a conflict of interest. The prevailing vague familiarity with Geoff within the team also means a relationship exists that could compromise the sincerity of </w:t>
+        <w:t xml:space="preserve"> staff, his employer is the same as the institution that runs this capstone course, this constitutes a conflict of interest. The prevailing vague familiarity with Geoff </w:t>
+      </w:r>
+      <w:r>
+        <w:lastRenderedPageBreak/>
+        <w:t xml:space="preserve">within the team also means a relationship exists that could compromise the sincerity of </w:t>
       </w:r>
       <w:r>
         <w:t>professional</w:t>
@@ -10071,13 +10320,13 @@
       <w:pPr>
         <w:pStyle w:val="Heading2"/>
       </w:pPr>
-      <w:bookmarkStart w:id="24" w:name="_Toc236665781"/>
-      <w:bookmarkStart w:id="25" w:name="_Toc236998694"/>
+      <w:bookmarkStart w:id="25" w:name="_Toc236665781"/>
+      <w:bookmarkStart w:id="26" w:name="_Toc237963411"/>
       <w:r>
         <w:t>RACI assessment matrix</w:t>
       </w:r>
-      <w:bookmarkEnd w:id="24"/>
       <w:bookmarkEnd w:id="25"/>
+      <w:bookmarkEnd w:id="26"/>
     </w:p>
     <w:p>
       <w:pPr>
@@ -10484,7 +10733,6 @@
                 <w:b/>
                 <w:bCs/>
               </w:rPr>
-              <w:lastRenderedPageBreak/>
               <w:t>Acquisition of forensic datasets/disk images for analysis</w:t>
             </w:r>
           </w:p>
@@ -11025,6 +11273,7 @@
                 <w:b/>
                 <w:bCs/>
               </w:rPr>
+              <w:lastRenderedPageBreak/>
               <w:t xml:space="preserve">Design a consistent test environment, ensuring all variables are the same and that available processing power is consistent before testing. </w:t>
             </w:r>
           </w:p>
@@ -11141,14 +11390,14 @@
       <w:pPr>
         <w:pStyle w:val="Heading1"/>
       </w:pPr>
-      <w:bookmarkStart w:id="26" w:name="_Toc236998695"/>
+      <w:bookmarkStart w:id="27" w:name="_Toc237963412"/>
       <w:r>
         <w:t>P</w:t>
       </w:r>
       <w:r>
         <w:t>roject timeline and milestones</w:t>
       </w:r>
-      <w:bookmarkEnd w:id="26"/>
+      <w:bookmarkEnd w:id="27"/>
     </w:p>
     <w:p>
       <w:pPr>
@@ -11264,6 +11513,7 @@
               <w:rPr>
                 <w:rFonts w:cs="Arial"/>
               </w:rPr>
+              <w:lastRenderedPageBreak/>
               <w:t>Mid project proposal thing</w:t>
             </w:r>
           </w:p>
@@ -11439,11 +11689,11 @@
       <w:pPr>
         <w:pStyle w:val="Heading1"/>
       </w:pPr>
-      <w:bookmarkStart w:id="27" w:name="_Toc236998696"/>
+      <w:bookmarkStart w:id="28" w:name="_Toc237963413"/>
       <w:r>
         <w:t>Project Risk Analysis</w:t>
       </w:r>
-      <w:bookmarkEnd w:id="27"/>
+      <w:bookmarkEnd w:id="28"/>
     </w:p>
     <w:tbl>
       <w:tblPr>
@@ -12016,7 +12266,6 @@
               <w:pStyle w:val="TNR"/>
             </w:pPr>
             <w:r>
-              <w:lastRenderedPageBreak/>
               <w:t>R10 Advisor becomes unavailable.</w:t>
             </w:r>
           </w:p>
@@ -12039,7 +12288,6 @@
               <w:pStyle w:val="TNR"/>
             </w:pPr>
             <w:r>
-              <w:lastRenderedPageBreak/>
               <w:t xml:space="preserve">R07 Hardware stolen. </w:t>
             </w:r>
           </w:p>
@@ -12048,7 +12296,6 @@
               <w:pStyle w:val="TNR"/>
             </w:pPr>
             <w:r>
-              <w:lastRenderedPageBreak/>
               <w:t>R08 Data/File loss/corruption.</w:t>
             </w:r>
           </w:p>
@@ -12063,7 +12310,6 @@
               <w:pStyle w:val="TNR"/>
             </w:pPr>
             <w:r>
-              <w:lastRenderedPageBreak/>
               <w:t>R03 Academic integrity violation.</w:t>
             </w:r>
           </w:p>
@@ -12274,6 +12520,9 @@
             </w:r>
             <w:r>
               <w:br/>
+            </w:r>
+            <w:r>
+              <w:lastRenderedPageBreak/>
               <w:t>Break work into set milestones with internal deadlines.</w:t>
             </w:r>
           </w:p>
@@ -12289,6 +12538,7 @@
               <w:pStyle w:val="TNR"/>
             </w:pPr>
             <w:r>
+              <w:lastRenderedPageBreak/>
               <w:t>R02 Team member becomes unavailable</w:t>
             </w:r>
           </w:p>
@@ -12497,7 +12747,6 @@
               <w:pStyle w:val="TNR"/>
             </w:pPr>
             <w:r>
-              <w:lastRenderedPageBreak/>
               <w:t>R09 Client becomes unavailable</w:t>
             </w:r>
           </w:p>
@@ -12610,6 +12859,7 @@
               <w:pStyle w:val="TNR"/>
             </w:pPr>
             <w:r>
+              <w:lastRenderedPageBreak/>
               <w:t>R13 Natural disaster or pandemic</w:t>
             </w:r>
           </w:p>
@@ -12923,7 +13173,6 @@
               <w:pStyle w:val="TNR"/>
             </w:pPr>
             <w:r>
-              <w:lastRenderedPageBreak/>
               <w:t>R06 Software difficulties</w:t>
             </w:r>
           </w:p>
@@ -13056,6 +13305,7 @@
               <w:pStyle w:val="TNR"/>
             </w:pPr>
             <w:r>
+              <w:lastRenderedPageBreak/>
               <w:t>R10 Advisor becomes unavailable</w:t>
             </w:r>
           </w:p>
@@ -13262,7 +13512,7 @@
     <w:p/>
     <w:p/>
     <w:p/>
-    <w:bookmarkStart w:id="28" w:name="_Toc236998697" w:displacedByCustomXml="next"/>
+    <w:bookmarkStart w:id="29" w:name="_Toc237963414" w:displacedByCustomXml="next"/>
     <w:sdt>
       <w:sdtPr>
         <w:rPr>
@@ -13297,7 +13547,7 @@
           <w:r>
             <w:t>References</w:t>
           </w:r>
-          <w:bookmarkEnd w:id="28"/>
+          <w:bookmarkEnd w:id="29"/>
         </w:p>
         <w:sdt>
           <w:sdtPr>
@@ -13443,7 +13693,7 @@
           <w:lang w:val="en-NZ"/>
         </w:rPr>
       </w:pPr>
-      <w:hyperlink r:id="rId21" w:history="1">
+      <w:hyperlink r:id="rId25" w:history="1">
         <w:r>
           <w:rPr>
             <w:rStyle w:val="Hyperlink"/>
@@ -13465,7 +13715,7 @@
           <w:lang w:val="en-NZ"/>
         </w:rPr>
       </w:pPr>
-      <w:hyperlink r:id="rId22" w:history="1">
+      <w:hyperlink r:id="rId26" w:history="1">
         <w:r>
           <w:rPr>
             <w:rStyle w:val="Hyperlink"/>
@@ -13487,7 +13737,7 @@
           <w:lang w:val="en-NZ"/>
         </w:rPr>
       </w:pPr>
-      <w:hyperlink r:id="rId23" w:history="1">
+      <w:hyperlink r:id="rId27" w:history="1">
         <w:r>
           <w:rPr>
             <w:rStyle w:val="Hyperlink"/>
@@ -13509,7 +13759,7 @@
           <w:lang w:val="en-NZ"/>
         </w:rPr>
       </w:pPr>
-      <w:hyperlink r:id="rId24" w:history="1">
+      <w:hyperlink r:id="rId28" w:history="1">
         <w:r>
           <w:rPr>
             <w:rStyle w:val="Hyperlink"/>
@@ -13525,7 +13775,7 @@
           <w:lang w:val="en-NZ"/>
         </w:rPr>
       </w:pPr>
-      <w:hyperlink r:id="rId25" w:history="1">
+      <w:hyperlink r:id="rId29" w:anchor="about-kali-linux" w:history="1">
         <w:r>
           <w:rPr>
             <w:rStyle w:val="Hyperlink"/>
@@ -13547,7 +13797,7 @@
           <w:lang w:val="en-NZ"/>
         </w:rPr>
       </w:pPr>
-      <w:hyperlink r:id="rId26" w:history="1">
+      <w:hyperlink r:id="rId30" w:history="1">
         <w:r>
           <w:rPr>
             <w:rStyle w:val="Hyperlink"/>
@@ -13575,7 +13825,7 @@
           <w:lang w:val="en-NZ"/>
         </w:rPr>
       </w:pPr>
-      <w:hyperlink r:id="rId27" w:history="1">
+      <w:hyperlink r:id="rId31" w:history="1">
         <w:r>
           <w:rPr>
             <w:rStyle w:val="Hyperlink"/>
@@ -13693,21 +13943,21 @@
       <w:pPr>
         <w:pStyle w:val="Heading1"/>
       </w:pPr>
-      <w:bookmarkStart w:id="29" w:name="_Toc236998698"/>
+      <w:bookmarkStart w:id="30" w:name="_Toc237963415"/>
       <w:r>
         <w:t>Appendices</w:t>
       </w:r>
-      <w:bookmarkEnd w:id="29"/>
+      <w:bookmarkEnd w:id="30"/>
     </w:p>
     <w:p>
       <w:pPr>
         <w:pStyle w:val="Heading2"/>
       </w:pPr>
-      <w:bookmarkStart w:id="30" w:name="_Toc236998699"/>
+      <w:bookmarkStart w:id="31" w:name="_Toc237963416"/>
       <w:r>
         <w:t>Appendix A</w:t>
       </w:r>
-      <w:bookmarkEnd w:id="30"/>
+      <w:bookmarkEnd w:id="31"/>
     </w:p>
     <w:p>
       <w:pPr>
@@ -13742,7 +13992,7 @@
                     <pic:cNvPicPr/>
                   </pic:nvPicPr>
                   <pic:blipFill>
-                    <a:blip r:embed="rId28"/>
+                    <a:blip r:embed="rId32"/>
                     <a:stretch>
                       <a:fillRect/>
                     </a:stretch>
@@ -13939,11 +14189,11 @@
       <w:pPr>
         <w:pStyle w:val="Heading2"/>
       </w:pPr>
-      <w:bookmarkStart w:id="31" w:name="_Toc236998700"/>
+      <w:bookmarkStart w:id="32" w:name="_Toc237963417"/>
       <w:r>
         <w:t>Appendix B</w:t>
       </w:r>
-      <w:bookmarkEnd w:id="31"/>
+      <w:bookmarkEnd w:id="32"/>
     </w:p>
     <w:p>
       <w:pPr>
@@ -14100,11 +14350,11 @@
         <w:pStyle w:val="Heading1"/>
         <w:ind w:left="279"/>
       </w:pPr>
-      <w:bookmarkStart w:id="32" w:name="_Toc236998701"/>
+      <w:bookmarkStart w:id="33" w:name="_Toc237963418"/>
       <w:r>
         <w:t>The Parties</w:t>
       </w:r>
-      <w:bookmarkEnd w:id="32"/>
+      <w:bookmarkEnd w:id="33"/>
       <w:r>
         <w:t xml:space="preserve"> </w:t>
       </w:r>
@@ -14293,7 +14543,6 @@
         <w:ind w:left="283"/>
       </w:pPr>
       <w:r>
-        <w:lastRenderedPageBreak/>
         <w:t xml:space="preserve"> </w:t>
       </w:r>
     </w:p>
@@ -14318,11 +14567,11 @@
       <w:pPr>
         <w:pStyle w:val="Heading1"/>
       </w:pPr>
-      <w:bookmarkStart w:id="33" w:name="_Toc236998702"/>
+      <w:bookmarkStart w:id="34" w:name="_Toc237963419"/>
       <w:r>
         <w:t>1. Effective Date</w:t>
       </w:r>
-      <w:bookmarkEnd w:id="33"/>
+      <w:bookmarkEnd w:id="34"/>
       <w:r>
         <w:t xml:space="preserve"> </w:t>
       </w:r>
@@ -14373,11 +14622,11 @@
         <w:pStyle w:val="Heading1"/>
         <w:ind w:left="279"/>
       </w:pPr>
-      <w:bookmarkStart w:id="34" w:name="_Toc236998703"/>
+      <w:bookmarkStart w:id="35" w:name="_Toc237963420"/>
       <w:r>
         <w:t>2. Undertakings</w:t>
       </w:r>
-      <w:bookmarkEnd w:id="34"/>
+      <w:bookmarkEnd w:id="35"/>
       <w:r>
         <w:t xml:space="preserve"> </w:t>
       </w:r>
@@ -14482,7 +14731,7 @@
           <w:tab w:val="center" w:pos="4390"/>
         </w:tabs>
       </w:pPr>
-      <w:bookmarkStart w:id="35" w:name="_Toc236998704"/>
+      <w:bookmarkStart w:id="36" w:name="_Toc237963421"/>
       <w:r>
         <w:t>3</w:t>
       </w:r>
@@ -14504,7 +14753,7 @@
       <w:r>
         <w:t xml:space="preserve"> and other Intellectual Property Rights</w:t>
       </w:r>
-      <w:bookmarkEnd w:id="35"/>
+      <w:bookmarkEnd w:id="36"/>
       <w:r>
         <w:t xml:space="preserve"> </w:t>
       </w:r>
@@ -14525,7 +14774,7 @@
           <w:tab w:val="center" w:pos="1980"/>
         </w:tabs>
       </w:pPr>
-      <w:bookmarkStart w:id="36" w:name="_Toc236998705"/>
+      <w:bookmarkStart w:id="37" w:name="_Toc237963422"/>
       <w:r>
         <w:t>4</w:t>
       </w:r>
@@ -14539,7 +14788,7 @@
         <w:tab/>
         <w:t>Confidential Information</w:t>
       </w:r>
-      <w:bookmarkEnd w:id="36"/>
+      <w:bookmarkEnd w:id="37"/>
       <w:r>
         <w:t xml:space="preserve"> </w:t>
       </w:r>
@@ -14563,7 +14812,6 @@
         <w:jc w:val="both"/>
       </w:pPr>
       <w:r>
-        <w:lastRenderedPageBreak/>
         <w:t xml:space="preserve">is not disclosed in writing or reduced to writing and marked with an appropriate confidentiality legend or designated in writing as Confidential Information within thirty (30) days of disclosure; </w:t>
       </w:r>
     </w:p>
@@ -14670,6 +14918,7 @@
         <w:jc w:val="both"/>
       </w:pPr>
       <w:r>
+        <w:lastRenderedPageBreak/>
         <w:t xml:space="preserve">If permission to use Confidential Information is withheld by a party, then that party will state the reason or basis for refusal of permission.  </w:t>
       </w:r>
     </w:p>
@@ -14681,7 +14930,7 @@
           <w:tab w:val="center" w:pos="2141"/>
         </w:tabs>
       </w:pPr>
-      <w:bookmarkStart w:id="37" w:name="_Toc236998706"/>
+      <w:bookmarkStart w:id="38" w:name="_Toc237963423"/>
       <w:r>
         <w:t>5</w:t>
       </w:r>
@@ -14695,7 +14944,7 @@
         <w:tab/>
         <w:t>Intellectual Property Rights</w:t>
       </w:r>
-      <w:bookmarkEnd w:id="37"/>
+      <w:bookmarkEnd w:id="38"/>
       <w:r>
         <w:t xml:space="preserve"> </w:t>
       </w:r>
@@ -14782,7 +15031,7 @@
                     </pic:cNvPicPr>
                   </pic:nvPicPr>
                   <pic:blipFill>
-                    <a:blip r:embed="rId29" cstate="print">
+                    <a:blip r:embed="rId33" cstate="print">
                       <a:extLst>
                         <a:ext uri="{28A0092B-C50C-407E-A947-70E740481C1C}">
                           <a14:useLocalDpi xmlns:a14="http://schemas.microsoft.com/office/drawing/2010/main" val="0"/>
@@ -15007,7 +15256,7 @@
           <w:tab w:val="center" w:pos="1633"/>
         </w:tabs>
       </w:pPr>
-      <w:bookmarkStart w:id="38" w:name="_Toc236998707"/>
+      <w:bookmarkStart w:id="39" w:name="_Toc237963424"/>
       <w:r>
         <w:t>6</w:t>
       </w:r>
@@ -15021,7 +15270,7 @@
         <w:tab/>
         <w:t>Signatures</w:t>
       </w:r>
-      <w:bookmarkEnd w:id="38"/>
+      <w:bookmarkEnd w:id="39"/>
       <w:r>
         <w:t xml:space="preserve"> </w:t>
       </w:r>
@@ -15392,7 +15641,6 @@
               <w:rPr>
                 <w:rFonts w:ascii="Times New Roman" w:hAnsi="Times New Roman" w:cs="Times New Roman"/>
               </w:rPr>
-              <w:lastRenderedPageBreak/>
               <w:t xml:space="preserve">Representative of Whitireia New Zealand/ </w:t>
             </w:r>
             <w:r>
@@ -15823,6 +16071,7 @@
               <w:rPr>
                 <w:rFonts w:ascii="Times New Roman" w:hAnsi="Times New Roman" w:cs="Times New Roman"/>
               </w:rPr>
+              <w:lastRenderedPageBreak/>
               <w:t>Student</w:t>
             </w:r>
           </w:p>
@@ -15903,11 +16152,11 @@
       <w:pPr>
         <w:pStyle w:val="Heading2"/>
       </w:pPr>
-      <w:bookmarkStart w:id="39" w:name="_Toc236998708"/>
+      <w:bookmarkStart w:id="40" w:name="_Toc237963425"/>
       <w:r>
         <w:t>Appendix C</w:t>
       </w:r>
-      <w:bookmarkEnd w:id="39"/>
+      <w:bookmarkEnd w:id="40"/>
     </w:p>
     <w:p>
       <w:pPr>
@@ -15927,11 +16176,11 @@
       <w:pPr>
         <w:pStyle w:val="Heading2"/>
       </w:pPr>
-      <w:bookmarkStart w:id="40" w:name="_Toc236998709"/>
+      <w:bookmarkStart w:id="41" w:name="_Toc237963426"/>
       <w:r>
         <w:t>Appendix D</w:t>
       </w:r>
-      <w:bookmarkEnd w:id="40"/>
+      <w:bookmarkEnd w:id="41"/>
     </w:p>
     <w:p>
       <w:pPr>
@@ -15997,7 +16246,7 @@
       </w:pPr>
     </w:p>
     <w:sectPr>
-      <w:footerReference w:type="default" r:id="rId30"/>
+      <w:footerReference w:type="default" r:id="rId34"/>
       <w:pgSz w:w="11906" w:h="16838"/>
       <w:pgMar w:top="720" w:right="720" w:bottom="720" w:left="720" w:header="708" w:footer="708" w:gutter="0"/>
       <w:pgNumType w:start="0"/>

</xml_diff>

<commit_message>
more updates to sam bhb proposal
</commit_message>
<xml_diff>
--- a/Proposal working/Sam - BHB - Capstone Proposal.docx
+++ b/Proposal working/Sam - BHB - Capstone Proposal.docx
@@ -4913,7 +4913,21 @@
                 <w:rStyle w:val="Hyperlink"/>
                 <w:noProof/>
               </w:rPr>
-              <w:t>Project Personnel</w:t>
+              <w:t>Proj</w:t>
+            </w:r>
+            <w:r>
+              <w:rPr>
+                <w:rStyle w:val="Hyperlink"/>
+                <w:noProof/>
+              </w:rPr>
+              <w:t>e</w:t>
+            </w:r>
+            <w:r>
+              <w:rPr>
+                <w:rStyle w:val="Hyperlink"/>
+                <w:noProof/>
+              </w:rPr>
+              <w:t>ct Personnel</w:t>
             </w:r>
             <w:r>
               <w:rPr>
@@ -7991,15 +8005,13 @@
         </w:rPr>
         <w:t xml:space="preserve"> that we are well comfortable with as we have all used it in the </w:t>
       </w:r>
-      <w:proofErr w:type="gramStart"/>
       <w:r>
         <w:rPr>
           <w:rFonts w:cs="Times New Roman"/>
           <w:highlight w:val="yellow"/>
         </w:rPr>
-        <w:t>past, and</w:t>
-      </w:r>
-      <w:proofErr w:type="gramEnd"/>
+        <w:t>past and</w:t>
+      </w:r>
       <w:r>
         <w:rPr>
           <w:rFonts w:cs="Times New Roman"/>
@@ -8072,6 +8084,14 @@
           <w:szCs w:val="24"/>
         </w:rPr>
         <w:t>analysis should they work.</w:t>
+      </w:r>
+      <w:r>
+        <w:rPr>
+          <w:rFonts w:ascii="Times New Roman" w:hAnsi="Times New Roman" w:cs="Times New Roman"/>
+          <w:sz w:val="24"/>
+          <w:szCs w:val="24"/>
+        </w:rPr>
+        <w:t xml:space="preserve"> The tools listed below are either AI augmented tools or tools that are not AI augmented.</w:t>
       </w:r>
     </w:p>
     <w:p>
@@ -8216,6 +8236,30 @@
           <w:szCs w:val="24"/>
         </w:rPr>
         <w:t xml:space="preserve">The version being used is: </w:t>
+      </w:r>
+      <w:r>
+        <w:rPr>
+          <w:rFonts w:ascii="Times New Roman" w:hAnsi="Times New Roman" w:cs="Times New Roman"/>
+          <w:sz w:val="24"/>
+          <w:szCs w:val="24"/>
+        </w:rPr>
+        <w:t xml:space="preserve">HashCat </w:t>
+      </w:r>
+      <w:r>
+        <w:rPr>
+          <w:rFonts w:ascii="Times New Roman" w:hAnsi="Times New Roman" w:cs="Times New Roman"/>
+          <w:sz w:val="24"/>
+          <w:szCs w:val="24"/>
+        </w:rPr>
+        <w:t>v</w:t>
+      </w:r>
+      <w:r>
+        <w:rPr>
+          <w:rFonts w:ascii="Times New Roman" w:hAnsi="Times New Roman" w:cs="Times New Roman"/>
+          <w:sz w:val="24"/>
+          <w:szCs w:val="24"/>
+        </w:rPr>
+        <w:t>7.1.2+ds1-4</w:t>
       </w:r>
     </w:p>
     <w:p>
@@ -8316,7 +8360,49 @@
           <w:sz w:val="24"/>
           <w:szCs w:val="24"/>
         </w:rPr>
-        <w:t xml:space="preserve">The version being used is: </w:t>
+        <w:t xml:space="preserve">The version being used </w:t>
+      </w:r>
+      <w:proofErr w:type="gramStart"/>
+      <w:r>
+        <w:rPr>
+          <w:rFonts w:ascii="Times New Roman" w:hAnsi="Times New Roman" w:cs="Times New Roman"/>
+          <w:sz w:val="24"/>
+          <w:szCs w:val="24"/>
+        </w:rPr>
+        <w:t>is:</w:t>
+      </w:r>
+      <w:proofErr w:type="gramEnd"/>
+      <w:r>
+        <w:rPr>
+          <w:rFonts w:ascii="Times New Roman" w:hAnsi="Times New Roman" w:cs="Times New Roman"/>
+          <w:sz w:val="24"/>
+          <w:szCs w:val="24"/>
+        </w:rPr>
+        <w:t xml:space="preserve"> </w:t>
+      </w:r>
+      <w:r>
+        <w:rPr>
+          <w:rFonts w:ascii="Times New Roman" w:hAnsi="Times New Roman" w:cs="Times New Roman"/>
+          <w:sz w:val="24"/>
+          <w:szCs w:val="24"/>
+        </w:rPr>
+        <w:t xml:space="preserve">John the Ripper </w:t>
+      </w:r>
+      <w:r>
+        <w:rPr>
+          <w:rFonts w:ascii="Times New Roman" w:hAnsi="Times New Roman" w:cs="Times New Roman"/>
+          <w:sz w:val="24"/>
+          <w:szCs w:val="24"/>
+        </w:rPr>
+        <w:t>v</w:t>
+      </w:r>
+      <w:r>
+        <w:rPr>
+          <w:rFonts w:ascii="Times New Roman" w:hAnsi="Times New Roman" w:cs="Times New Roman"/>
+          <w:sz w:val="24"/>
+          <w:szCs w:val="24"/>
+        </w:rPr>
+        <w:t>1.9.0-jumbo-1+bleeding-aec1328d6c</w:t>
       </w:r>
     </w:p>
     <w:p>
@@ -8442,8 +8528,9 @@
         <w:jc w:val="both"/>
         <w:rPr>
           <w:rFonts w:ascii="Times New Roman" w:hAnsi="Times New Roman" w:cs="Times New Roman"/>
-          <w:sz w:val="24"/>
-          <w:szCs w:val="24"/>
+          <w:b/>
+          <w:bCs/>
+          <w:lang w:val="en-NZ"/>
         </w:rPr>
       </w:pPr>
       <w:r>
@@ -8455,17 +8542,54 @@
         <w:lastRenderedPageBreak/>
         <w:t>The version being used is:</w:t>
       </w:r>
-    </w:p>
-    <w:p>
-      <w:pPr>
-        <w:jc w:val="both"/>
+      <w:r>
         <w:rPr>
           <w:rFonts w:ascii="Times New Roman" w:hAnsi="Times New Roman" w:cs="Times New Roman"/>
           <w:sz w:val="24"/>
           <w:szCs w:val="24"/>
         </w:rPr>
-      </w:pPr>
+        <w:t xml:space="preserve"> CyberChef </w:t>
+      </w:r>
+      <w:r>
+        <w:rPr>
+          <w:rFonts w:ascii="Times New Roman" w:hAnsi="Times New Roman" w:cs="Times New Roman"/>
+          <w:sz w:val="24"/>
+          <w:szCs w:val="24"/>
+        </w:rPr>
+        <w:t>v</w:t>
+      </w:r>
       <w:hyperlink r:id="rId13" w:history="1">
+        <w:r>
+          <w:rPr>
+            <w:rStyle w:val="Hyperlink"/>
+            <w:rFonts w:ascii="Times New Roman" w:hAnsi="Times New Roman" w:cs="Times New Roman"/>
+            <w:b/>
+            <w:bCs/>
+            <w:lang w:val="en-NZ"/>
+          </w:rPr>
+          <w:t>11.3.0</w:t>
+        </w:r>
+      </w:hyperlink>
+      <w:r>
+        <w:rPr>
+          <w:rFonts w:ascii="Times New Roman" w:hAnsi="Times New Roman" w:cs="Times New Roman"/>
+          <w:b/>
+          <w:bCs/>
+          <w:lang w:val="en-NZ"/>
+        </w:rPr>
+        <w:t xml:space="preserve"> - 2026-07-24</w:t>
+      </w:r>
+    </w:p>
+    <w:p>
+      <w:pPr>
+        <w:jc w:val="both"/>
+        <w:rPr>
+          <w:rFonts w:ascii="Times New Roman" w:hAnsi="Times New Roman" w:cs="Times New Roman"/>
+          <w:sz w:val="24"/>
+          <w:szCs w:val="24"/>
+        </w:rPr>
+      </w:pPr>
+      <w:hyperlink r:id="rId14" w:history="1">
         <w:r>
           <w:rPr>
             <w:rStyle w:val="Hyperlink"/>
@@ -8602,19 +8726,61 @@
           <w:sz w:val="24"/>
           <w:szCs w:val="24"/>
         </w:rPr>
-        <w:t xml:space="preserve">The version being used is: </w:t>
-      </w:r>
-    </w:p>
-    <w:p>
-      <w:pPr>
-        <w:jc w:val="both"/>
+        <w:t xml:space="preserve">The version being used </w:t>
+      </w:r>
+      <w:proofErr w:type="gramStart"/>
+      <w:r>
         <w:rPr>
           <w:rFonts w:ascii="Times New Roman" w:hAnsi="Times New Roman" w:cs="Times New Roman"/>
           <w:sz w:val="24"/>
           <w:szCs w:val="24"/>
         </w:rPr>
-      </w:pPr>
-      <w:hyperlink r:id="rId14" w:history="1">
+        <w:t>is:</w:t>
+      </w:r>
+      <w:proofErr w:type="gramEnd"/>
+      <w:r>
+        <w:rPr>
+          <w:rFonts w:ascii="Times New Roman" w:hAnsi="Times New Roman" w:cs="Times New Roman"/>
+          <w:sz w:val="24"/>
+          <w:szCs w:val="24"/>
+        </w:rPr>
+        <w:t xml:space="preserve"> </w:t>
+      </w:r>
+      <w:r>
+        <w:rPr>
+          <w:rFonts w:ascii="Times New Roman" w:hAnsi="Times New Roman" w:cs="Times New Roman"/>
+          <w:sz w:val="24"/>
+          <w:szCs w:val="24"/>
+        </w:rPr>
+        <w:t xml:space="preserve">Volatility 3 Framework </w:t>
+      </w:r>
+      <w:r>
+        <w:rPr>
+          <w:rFonts w:ascii="Times New Roman" w:hAnsi="Times New Roman" w:cs="Times New Roman"/>
+          <w:sz w:val="24"/>
+          <w:szCs w:val="24"/>
+        </w:rPr>
+        <w:t>v</w:t>
+      </w:r>
+      <w:r>
+        <w:rPr>
+          <w:rFonts w:ascii="Times New Roman" w:hAnsi="Times New Roman" w:cs="Times New Roman"/>
+          <w:sz w:val="24"/>
+          <w:szCs w:val="24"/>
+        </w:rPr>
+        <w:t>2.28.2</w:t>
+      </w:r>
+    </w:p>
+    <w:p>
+      <w:pPr>
+        <w:jc w:val="both"/>
+        <w:rPr>
+          <w:rFonts w:ascii="Times New Roman" w:hAnsi="Times New Roman" w:cs="Times New Roman"/>
+          <w:sz w:val="24"/>
+          <w:szCs w:val="24"/>
+        </w:rPr>
+      </w:pPr>
+      <w:hyperlink r:id="rId15" w:history="1">
         <w:r>
           <w:rPr>
             <w:rStyle w:val="Hyperlink"/>
@@ -8713,17 +8879,41 @@
         </w:rPr>
         <w:t>The version being used is:</w:t>
       </w:r>
-    </w:p>
-    <w:p>
-      <w:pPr>
-        <w:jc w:val="both"/>
+      <w:r>
         <w:rPr>
           <w:rFonts w:ascii="Times New Roman" w:hAnsi="Times New Roman" w:cs="Times New Roman"/>
           <w:sz w:val="24"/>
           <w:szCs w:val="24"/>
         </w:rPr>
-      </w:pPr>
-      <w:hyperlink r:id="rId15" w:history="1">
+        <w:t xml:space="preserve"> ExifTool </w:t>
+      </w:r>
+      <w:r>
+        <w:rPr>
+          <w:rFonts w:ascii="Times New Roman" w:hAnsi="Times New Roman" w:cs="Times New Roman"/>
+          <w:sz w:val="24"/>
+          <w:szCs w:val="24"/>
+        </w:rPr>
+        <w:t>v</w:t>
+      </w:r>
+      <w:r>
+        <w:rPr>
+          <w:rFonts w:ascii="Times New Roman" w:hAnsi="Times New Roman" w:cs="Times New Roman"/>
+          <w:sz w:val="24"/>
+          <w:szCs w:val="24"/>
+        </w:rPr>
+        <w:t>13.55</w:t>
+      </w:r>
+    </w:p>
+    <w:p>
+      <w:pPr>
+        <w:jc w:val="both"/>
+        <w:rPr>
+          <w:rFonts w:ascii="Times New Roman" w:hAnsi="Times New Roman" w:cs="Times New Roman"/>
+          <w:sz w:val="24"/>
+          <w:szCs w:val="24"/>
+        </w:rPr>
+      </w:pPr>
+      <w:hyperlink r:id="rId16" w:history="1">
         <w:r>
           <w:rPr>
             <w:rStyle w:val="Hyperlink"/>
@@ -8828,19 +9018,51 @@
           <w:sz w:val="24"/>
           <w:szCs w:val="24"/>
         </w:rPr>
-        <w:t>The version being used is:</w:t>
-      </w:r>
-    </w:p>
-    <w:p>
-      <w:pPr>
-        <w:jc w:val="both"/>
+        <w:t xml:space="preserve">The version being used </w:t>
+      </w:r>
+      <w:r>
         <w:rPr>
           <w:rFonts w:ascii="Times New Roman" w:hAnsi="Times New Roman" w:cs="Times New Roman"/>
           <w:sz w:val="24"/>
           <w:szCs w:val="24"/>
         </w:rPr>
-      </w:pPr>
-      <w:hyperlink r:id="rId16" w:history="1">
+        <w:t xml:space="preserve">is </w:t>
+      </w:r>
+      <w:r>
+        <w:rPr>
+          <w:rFonts w:ascii="Times New Roman" w:hAnsi="Times New Roman" w:cs="Times New Roman"/>
+          <w:sz w:val="24"/>
+          <w:szCs w:val="24"/>
+        </w:rPr>
+        <w:t xml:space="preserve">foremost version </w:t>
+      </w:r>
+      <w:r>
+        <w:rPr>
+          <w:rFonts w:ascii="Times New Roman" w:hAnsi="Times New Roman" w:cs="Times New Roman"/>
+          <w:sz w:val="24"/>
+          <w:szCs w:val="24"/>
+        </w:rPr>
+        <w:t>v</w:t>
+      </w:r>
+      <w:r>
+        <w:rPr>
+          <w:rFonts w:ascii="Times New Roman" w:hAnsi="Times New Roman" w:cs="Times New Roman"/>
+          <w:sz w:val="24"/>
+          <w:szCs w:val="24"/>
+        </w:rPr>
+        <w:t>1.5.7</w:t>
+      </w:r>
+    </w:p>
+    <w:p>
+      <w:pPr>
+        <w:jc w:val="both"/>
+        <w:rPr>
+          <w:rFonts w:ascii="Times New Roman" w:hAnsi="Times New Roman" w:cs="Times New Roman"/>
+          <w:sz w:val="24"/>
+          <w:szCs w:val="24"/>
+        </w:rPr>
+      </w:pPr>
+      <w:hyperlink r:id="rId17" w:history="1">
         <w:r>
           <w:rPr>
             <w:rStyle w:val="Hyperlink"/>
@@ -8955,17 +9177,49 @@
         </w:rPr>
         <w:t>The version being used is:</w:t>
       </w:r>
-    </w:p>
-    <w:p>
-      <w:pPr>
-        <w:jc w:val="both"/>
+      <w:r>
         <w:rPr>
           <w:rFonts w:ascii="Times New Roman" w:hAnsi="Times New Roman" w:cs="Times New Roman"/>
           <w:sz w:val="24"/>
           <w:szCs w:val="24"/>
         </w:rPr>
-      </w:pPr>
-      <w:hyperlink r:id="rId17" w:history="1">
+        <w:t xml:space="preserve"> </w:t>
+      </w:r>
+      <w:r>
+        <w:rPr>
+          <w:rFonts w:ascii="Times New Roman" w:hAnsi="Times New Roman" w:cs="Times New Roman"/>
+          <w:sz w:val="24"/>
+          <w:szCs w:val="24"/>
+        </w:rPr>
+        <w:t xml:space="preserve">Sherloq </w:t>
+      </w:r>
+      <w:r>
+        <w:rPr>
+          <w:rFonts w:ascii="Times New Roman" w:hAnsi="Times New Roman" w:cs="Times New Roman"/>
+          <w:sz w:val="24"/>
+          <w:szCs w:val="24"/>
+        </w:rPr>
+        <w:t>v</w:t>
+      </w:r>
+      <w:r>
+        <w:rPr>
+          <w:rFonts w:ascii="Times New Roman" w:hAnsi="Times New Roman" w:cs="Times New Roman"/>
+          <w:sz w:val="24"/>
+          <w:szCs w:val="24"/>
+        </w:rPr>
+        <w:t>0.94F</w:t>
+      </w:r>
+    </w:p>
+    <w:p>
+      <w:pPr>
+        <w:jc w:val="both"/>
+        <w:rPr>
+          <w:rFonts w:ascii="Times New Roman" w:hAnsi="Times New Roman" w:cs="Times New Roman"/>
+          <w:sz w:val="24"/>
+          <w:szCs w:val="24"/>
+        </w:rPr>
+      </w:pPr>
+      <w:hyperlink r:id="rId18" w:history="1">
         <w:r>
           <w:rPr>
             <w:rStyle w:val="Hyperlink"/>
@@ -9068,17 +9322,44 @@
       <w:r>
         <w:t>The version being used is:</w:t>
       </w:r>
+      <w:r>
+        <w:t xml:space="preserve"> TruFor</w:t>
+      </w:r>
+      <w:r>
+        <w:t xml:space="preserve"> </w:t>
+      </w:r>
+      <w:r>
+        <w:t>commit ae54475df6f41a491d7615100feb19263dec13f7</w:t>
+      </w:r>
+      <w:r>
+        <w:t xml:space="preserve">, </w:t>
+      </w:r>
+      <w:r>
+        <w:t>Date:   Thu May 29 09:46:01 2025 +0200</w:t>
+      </w:r>
     </w:p>
     <w:p>
       <w:pPr>
         <w:jc w:val="both"/>
       </w:pPr>
-      <w:hyperlink r:id="rId18" w:history="1">
+      <w:hyperlink r:id="rId19" w:history="1">
         <w:r>
           <w:rPr>
             <w:rStyle w:val="Hyperlink"/>
           </w:rPr>
-          <w:t>https://github.com/grip-unina/TruFor/tree/main</w:t>
+          <w:t>https://github.com/grip-unina/T</w:t>
+        </w:r>
+        <w:r>
+          <w:rPr>
+            <w:rStyle w:val="Hyperlink"/>
+          </w:rPr>
+          <w:t>r</w:t>
+        </w:r>
+        <w:r>
+          <w:rPr>
+            <w:rStyle w:val="Hyperlink"/>
+          </w:rPr>
+          <w:t>uFor/tree/main</w:t>
         </w:r>
       </w:hyperlink>
       <w:r>
@@ -9141,12 +9422,21 @@
       <w:r>
         <w:t>The version being run is:</w:t>
       </w:r>
+      <w:r>
+        <w:t xml:space="preserve"> WireShark </w:t>
+      </w:r>
+      <w:r>
+        <w:t>v</w:t>
+      </w:r>
+      <w:r>
+        <w:t>4.6.6</w:t>
+      </w:r>
     </w:p>
     <w:p>
       <w:pPr>
         <w:jc w:val="both"/>
       </w:pPr>
-      <w:hyperlink r:id="rId19" w:history="1">
+      <w:hyperlink r:id="rId20" w:history="1">
         <w:r>
           <w:rPr>
             <w:rStyle w:val="Hyperlink"/>
@@ -9192,9 +9482,15 @@
       <w:r>
         <w:t>The version being used is:</w:t>
       </w:r>
-    </w:p>
-    <w:p>
-      <w:hyperlink r:id="rId20" w:history="1">
+      <w:r>
+        <w:t xml:space="preserve"> </w:t>
+      </w:r>
+      <w:r>
+        <w:t>PassLLM v1.3.0</w:t>
+      </w:r>
+    </w:p>
+    <w:p>
+      <w:hyperlink r:id="rId21" w:history="1">
         <w:r>
           <w:rPr>
             <w:rStyle w:val="Hyperlink"/>
@@ -9246,22 +9542,38 @@
       <w:r>
         <w:t>The version being used is:</w:t>
       </w:r>
-    </w:p>
-    <w:p>
-      <w:pPr>
-        <w:jc w:val="both"/>
-      </w:pPr>
-      <w:hyperlink r:id="rId21" w:history="1">
+      <w:r>
+        <w:t xml:space="preserve"> Unearth version </w:t>
+      </w:r>
+      <w:r>
+        <w:t>v</w:t>
+      </w:r>
+      <w:r>
+        <w:t>1.0.0</w:t>
+      </w:r>
+    </w:p>
+    <w:p>
+      <w:hyperlink r:id="rId22" w:history="1">
         <w:r>
           <w:rPr>
             <w:rStyle w:val="Hyperlink"/>
           </w:rPr>
-          <w:t>https://github.com/rainlizard/Unearth/tree/main</w:t>
+          <w:t>https://github.com/bhargavgajare1479/Unearth</w:t>
         </w:r>
       </w:hyperlink>
       <w:r>
         <w:t xml:space="preserve"> </w:t>
       </w:r>
+    </w:p>
+    <w:p>
+      <w:pPr>
+        <w:pStyle w:val="Heading5"/>
+        <w:jc w:val="both"/>
+        <w:rPr>
+          <w:rFonts w:ascii="Arial" w:eastAsiaTheme="minorHAnsi" w:hAnsi="Arial" w:cstheme="minorBidi"/>
+          <w:color w:val="auto"/>
+        </w:rPr>
+      </w:pPr>
     </w:p>
     <w:p>
       <w:pPr>
@@ -9324,6 +9636,9 @@
       <w:r>
         <w:t>The version being used is:</w:t>
       </w:r>
+      <w:r>
+        <w:t xml:space="preserve"> Valhuntir v0.6.1</w:t>
+      </w:r>
     </w:p>
     <w:p>
       <w:pPr>
@@ -9332,7 +9647,7 @@
         </w:tabs>
         <w:jc w:val="both"/>
       </w:pPr>
-      <w:hyperlink r:id="rId22" w:history="1">
+      <w:hyperlink r:id="rId23" w:history="1">
         <w:r>
           <w:rPr>
             <w:rStyle w:val="Hyperlink"/>
@@ -9392,12 +9707,18 @@
       <w:r>
         <w:t>The version being used is:</w:t>
       </w:r>
+      <w:r>
+        <w:t xml:space="preserve"> </w:t>
+      </w:r>
+      <w:r>
+        <w:t>Unfold v3</w:t>
+      </w:r>
     </w:p>
     <w:p>
       <w:pPr>
         <w:jc w:val="both"/>
       </w:pPr>
-      <w:hyperlink r:id="rId23" w:history="1">
+      <w:hyperlink r:id="rId24" w:history="1">
         <w:r>
           <w:rPr>
             <w:rStyle w:val="Hyperlink"/>
@@ -9447,14 +9768,22 @@
         <w:jc w:val="both"/>
       </w:pPr>
       <w:r>
-        <w:t>The version being used is:</w:t>
+        <w:t xml:space="preserve">The version being used </w:t>
+      </w:r>
+      <w:proofErr w:type="gramStart"/>
+      <w:r>
+        <w:t>is:</w:t>
+      </w:r>
+      <w:proofErr w:type="gramEnd"/>
+      <w:r>
+        <w:t xml:space="preserve"> Autopsy v2.24</w:t>
       </w:r>
     </w:p>
     <w:p>
       <w:pPr>
         <w:jc w:val="both"/>
       </w:pPr>
-      <w:hyperlink r:id="rId24" w:history="1">
+      <w:hyperlink r:id="rId25" w:history="1">
         <w:r>
           <w:rPr>
             <w:rStyle w:val="Hyperlink"/>
@@ -9572,6 +9901,16 @@
     </w:p>
     <w:p>
       <w:pPr>
+        <w:pStyle w:val="TNR"/>
+      </w:pPr>
+    </w:p>
+    <w:p>
+      <w:pPr>
+        <w:pStyle w:val="TNR"/>
+      </w:pPr>
+    </w:p>
+    <w:p>
+      <w:pPr>
         <w:pStyle w:val="Heading2"/>
       </w:pPr>
       <w:bookmarkStart w:id="17" w:name="_Toc236665777"/>
@@ -9586,8 +9925,34 @@
     <w:p>
       <w:pPr>
         <w:pStyle w:val="Caption"/>
-        <w:keepNext/>
-      </w:pPr>
+        <w:rPr>
+          <w:lang w:val="en-NZ"/>
+        </w:rPr>
+      </w:pPr>
+      <w:r>
+        <w:t xml:space="preserve">Table </w:t>
+      </w:r>
+      <w:r>
+        <w:fldChar w:fldCharType="begin"/>
+      </w:r>
+      <w:r>
+        <w:instrText xml:space="preserve"> SEQ Table \* ARABIC </w:instrText>
+      </w:r>
+      <w:r>
+        <w:fldChar w:fldCharType="separate"/>
+      </w:r>
+      <w:r>
+        <w:rPr>
+          <w:noProof/>
+        </w:rPr>
+        <w:t>1</w:t>
+      </w:r>
+      <w:r>
+        <w:fldChar w:fldCharType="end"/>
+      </w:r>
+      <w:r>
+        <w:t xml:space="preserve"> - Group members</w:t>
+      </w:r>
     </w:p>
     <w:tbl>
       <w:tblPr>
@@ -9809,38 +10174,6 @@
     </w:tbl>
     <w:p>
       <w:pPr>
-        <w:pStyle w:val="Caption"/>
-        <w:rPr>
-          <w:lang w:val="en-NZ"/>
-        </w:rPr>
-      </w:pPr>
-      <w:r>
-        <w:t xml:space="preserve">Table </w:t>
-      </w:r>
-      <w:r>
-        <w:fldChar w:fldCharType="begin"/>
-      </w:r>
-      <w:r>
-        <w:instrText xml:space="preserve"> SEQ Table \* ARABIC </w:instrText>
-      </w:r>
-      <w:r>
-        <w:fldChar w:fldCharType="separate"/>
-      </w:r>
-      <w:r>
-        <w:rPr>
-          <w:noProof/>
-        </w:rPr>
-        <w:t>1</w:t>
-      </w:r>
-      <w:r>
-        <w:fldChar w:fldCharType="end"/>
-      </w:r>
-      <w:r>
-        <w:t xml:space="preserve"> - Group members</w:t>
-      </w:r>
-    </w:p>
-    <w:p>
-      <w:pPr>
         <w:pStyle w:val="Heading2"/>
       </w:pPr>
       <w:bookmarkStart w:id="19" w:name="_Toc236665778"/>
@@ -9870,6 +10203,35 @@
       </w:r>
       <w:bookmarkEnd w:id="21"/>
       <w:bookmarkEnd w:id="22"/>
+    </w:p>
+    <w:p>
+      <w:pPr>
+        <w:pStyle w:val="Caption"/>
+      </w:pPr>
+      <w:r>
+        <w:t xml:space="preserve">Table </w:t>
+      </w:r>
+      <w:r>
+        <w:fldChar w:fldCharType="begin"/>
+      </w:r>
+      <w:r>
+        <w:instrText xml:space="preserve"> SEQ Table \* ARABIC </w:instrText>
+      </w:r>
+      <w:r>
+        <w:fldChar w:fldCharType="separate"/>
+      </w:r>
+      <w:r>
+        <w:rPr>
+          <w:noProof/>
+        </w:rPr>
+        <w:t>2</w:t>
+      </w:r>
+      <w:r>
+        <w:fldChar w:fldCharType="end"/>
+      </w:r>
+      <w:r>
+        <w:t xml:space="preserve"> - Communications plan table</w:t>
+      </w:r>
     </w:p>
     <w:tbl>
       <w:tblPr>
@@ -10183,35 +10545,6 @@
         </w:tc>
       </w:tr>
     </w:tbl>
-    <w:p>
-      <w:pPr>
-        <w:pStyle w:val="Caption"/>
-      </w:pPr>
-      <w:r>
-        <w:t xml:space="preserve">Table </w:t>
-      </w:r>
-      <w:r>
-        <w:fldChar w:fldCharType="begin"/>
-      </w:r>
-      <w:r>
-        <w:instrText xml:space="preserve"> SEQ Table \* ARABIC </w:instrText>
-      </w:r>
-      <w:r>
-        <w:fldChar w:fldCharType="separate"/>
-      </w:r>
-      <w:r>
-        <w:rPr>
-          <w:noProof/>
-        </w:rPr>
-        <w:t>2</w:t>
-      </w:r>
-      <w:r>
-        <w:fldChar w:fldCharType="end"/>
-      </w:r>
-      <w:r>
-        <w:t xml:space="preserve"> - Communications plan table</w:t>
-      </w:r>
-    </w:p>
     <w:p>
       <w:pPr>
         <w:pStyle w:val="Heading2"/>
@@ -13690,13 +14023,15 @@
     <w:p>
       <w:pPr>
         <w:rPr>
+          <w:highlight w:val="yellow"/>
           <w:lang w:val="en-NZ"/>
         </w:rPr>
       </w:pPr>
-      <w:hyperlink r:id="rId25" w:history="1">
+      <w:hyperlink r:id="rId26" w:history="1">
         <w:r>
           <w:rPr>
             <w:rStyle w:val="Hyperlink"/>
+            <w:highlight w:val="yellow"/>
             <w:lang w:val="en-NZ"/>
           </w:rPr>
           <w:t>https://www.scrum.org/learning-series/what-is-scrum/</w:t>
@@ -13704,6 +14039,7 @@
       </w:hyperlink>
       <w:r>
         <w:rPr>
+          <w:highlight w:val="yellow"/>
           <w:lang w:val="en-NZ"/>
         </w:rPr>
         <w:t xml:space="preserve"> </w:t>
@@ -13712,13 +14048,15 @@
     <w:p>
       <w:pPr>
         <w:rPr>
+          <w:highlight w:val="yellow"/>
           <w:lang w:val="en-NZ"/>
         </w:rPr>
       </w:pPr>
-      <w:hyperlink r:id="rId26" w:history="1">
+      <w:hyperlink r:id="rId27" w:history="1">
         <w:r>
           <w:rPr>
             <w:rStyle w:val="Hyperlink"/>
+            <w:highlight w:val="yellow"/>
             <w:lang w:val="en-NZ"/>
           </w:rPr>
           <w:t>https://www.atlassian.com/agile</w:t>
@@ -13726,6 +14064,7 @@
       </w:hyperlink>
       <w:r>
         <w:rPr>
+          <w:highlight w:val="yellow"/>
           <w:lang w:val="en-NZ"/>
         </w:rPr>
         <w:t xml:space="preserve"> </w:t>
@@ -13734,13 +14073,15 @@
     <w:p>
       <w:pPr>
         <w:rPr>
+          <w:highlight w:val="yellow"/>
           <w:lang w:val="en-NZ"/>
         </w:rPr>
       </w:pPr>
-      <w:hyperlink r:id="rId27" w:history="1">
+      <w:hyperlink r:id="rId28" w:history="1">
         <w:r>
           <w:rPr>
             <w:rStyle w:val="Hyperlink"/>
+            <w:highlight w:val="yellow"/>
             <w:lang w:val="en-NZ"/>
           </w:rPr>
           <w:t>https://lmstudio.ai/</w:t>
@@ -13748,6 +14089,7 @@
       </w:hyperlink>
       <w:r>
         <w:rPr>
+          <w:highlight w:val="yellow"/>
           <w:lang w:val="en-NZ"/>
         </w:rPr>
         <w:t xml:space="preserve"> </w:t>
@@ -13756,13 +14098,15 @@
     <w:p>
       <w:pPr>
         <w:rPr>
+          <w:highlight w:val="yellow"/>
           <w:lang w:val="en-NZ"/>
         </w:rPr>
       </w:pPr>
-      <w:hyperlink r:id="rId28" w:history="1">
+      <w:hyperlink r:id="rId29" w:history="1">
         <w:r>
           <w:rPr>
             <w:rStyle w:val="Hyperlink"/>
+            <w:highlight w:val="yellow"/>
             <w:lang w:val="en-NZ"/>
           </w:rPr>
           <w:t>https://ollama.com/</w:t>
@@ -13772,13 +14116,15 @@
     <w:p>
       <w:pPr>
         <w:rPr>
+          <w:highlight w:val="yellow"/>
           <w:lang w:val="en-NZ"/>
         </w:rPr>
       </w:pPr>
-      <w:hyperlink r:id="rId29" w:anchor="about-kali-linux" w:history="1">
+      <w:hyperlink r:id="rId30" w:anchor="about-kali-linux" w:history="1">
         <w:r>
           <w:rPr>
             <w:rStyle w:val="Hyperlink"/>
+            <w:highlight w:val="yellow"/>
             <w:lang w:val="en-NZ"/>
           </w:rPr>
           <w:t>https://www.kali.org/docs/introduction/what-is-kali-linux/#about-kali-linux</w:t>
@@ -13786,6 +14132,7 @@
       </w:hyperlink>
       <w:r>
         <w:rPr>
+          <w:highlight w:val="yellow"/>
           <w:lang w:val="en-NZ"/>
         </w:rPr>
         <w:t xml:space="preserve"> </w:t>
@@ -13794,13 +14141,15 @@
     <w:p>
       <w:pPr>
         <w:rPr>
+          <w:highlight w:val="yellow"/>
           <w:lang w:val="en-NZ"/>
         </w:rPr>
       </w:pPr>
-      <w:hyperlink r:id="rId30" w:history="1">
+      <w:hyperlink r:id="rId31" w:history="1">
         <w:r>
           <w:rPr>
             <w:rStyle w:val="Hyperlink"/>
+            <w:highlight w:val="yellow"/>
             <w:lang w:val="en-NZ"/>
           </w:rPr>
           <w:t>https://www.geeksforgeeks.org/artificial-intelligence/large-language-model-llm/</w:t>
@@ -13808,12 +14157,14 @@
       </w:hyperlink>
       <w:r>
         <w:rPr>
+          <w:highlight w:val="yellow"/>
           <w:lang w:val="en-NZ"/>
         </w:rPr>
         <w:t xml:space="preserve"> </w:t>
       </w:r>
       <w:r>
         <w:rPr>
+          <w:highlight w:val="yellow"/>
           <w:lang w:val="en-NZ"/>
         </w:rPr>
         <w:t xml:space="preserve"> </w:t>
@@ -13825,10 +14176,11 @@
           <w:lang w:val="en-NZ"/>
         </w:rPr>
       </w:pPr>
-      <w:hyperlink r:id="rId31" w:history="1">
+      <w:hyperlink r:id="rId32" w:history="1">
         <w:r>
           <w:rPr>
             <w:rStyle w:val="Hyperlink"/>
+            <w:highlight w:val="yellow"/>
             <w:lang w:val="en-NZ"/>
           </w:rPr>
           <w:t>https://www.digitalcitizen.life/what-is-lm-studio-and-what-are-its-use-cases/</w:t>
@@ -13992,7 +14344,7 @@
                     <pic:cNvPicPr/>
                   </pic:nvPicPr>
                   <pic:blipFill>
-                    <a:blip r:embed="rId32"/>
+                    <a:blip r:embed="rId33"/>
                     <a:stretch>
                       <a:fillRect/>
                     </a:stretch>
@@ -15031,7 +15383,7 @@
                     </pic:cNvPicPr>
                   </pic:nvPicPr>
                   <pic:blipFill>
-                    <a:blip r:embed="rId33" cstate="print">
+                    <a:blip r:embed="rId34" cstate="print">
                       <a:extLst>
                         <a:ext uri="{28A0092B-C50C-407E-A947-70E740481C1C}">
                           <a14:useLocalDpi xmlns:a14="http://schemas.microsoft.com/office/drawing/2010/main" val="0"/>
@@ -16174,6 +16526,11 @@
     </w:p>
     <w:p>
       <w:pPr>
+        <w:pStyle w:val="TNR"/>
+      </w:pPr>
+    </w:p>
+    <w:p>
+      <w:pPr>
         <w:pStyle w:val="Heading2"/>
       </w:pPr>
       <w:bookmarkStart w:id="41" w:name="_Toc237963426"/>
@@ -16246,7 +16603,7 @@
       </w:pPr>
     </w:p>
     <w:sectPr>
-      <w:footerReference w:type="default" r:id="rId34"/>
+      <w:footerReference w:type="default" r:id="rId35"/>
       <w:pgSz w:w="11906" w:h="16838"/>
       <w:pgMar w:top="720" w:right="720" w:bottom="720" w:left="720" w:header="708" w:footer="708" w:gutter="0"/>
       <w:pgNumType w:start="0"/>
@@ -18059,7 +18416,6 @@
   <w:style w:type="character" w:default="1" w:styleId="DefaultParagraphFont">
     <w:name w:val="Default Paragraph Font"/>
     <w:uiPriority w:val="1"/>
-    <w:semiHidden/>
     <w:unhideWhenUsed/>
   </w:style>
   <w:style w:type="table" w:default="1" w:styleId="TableNormal">

</xml_diff>

<commit_message>
Edited proposal: Client background key problem, Scope statement on IRDF and difference between investigator and examiner + ref, statement on use of AI in the project
</commit_message>
<xml_diff>
--- a/Proposal working/Sam - BHB - Capstone Proposal.docx
+++ b/Proposal working/Sam - BHB - Capstone Proposal.docx
@@ -3945,7 +3945,7 @@
           <w:r>
             <w:fldChar w:fldCharType="separate"/>
           </w:r>
-          <w:hyperlink w:anchor="_Toc237963392" w:history="1">
+          <w:hyperlink w:anchor="_Toc238027946" w:history="1">
             <w:r>
               <w:rPr>
                 <w:rStyle w:val="Hyperlink"/>
@@ -3972,7 +3972,7 @@
                 <w:noProof/>
                 <w:webHidden/>
               </w:rPr>
-              <w:instrText xml:space="preserve"> PAGEREF _Toc237963392 \h </w:instrText>
+              <w:instrText xml:space="preserve"> PAGEREF _Toc238027946 \h </w:instrText>
             </w:r>
             <w:r>
               <w:rPr>
@@ -4019,7 +4019,7 @@
               <w14:ligatures w14:val="standardContextual"/>
             </w:rPr>
           </w:pPr>
-          <w:hyperlink w:anchor="_Toc237963393" w:history="1">
+          <w:hyperlink w:anchor="_Toc238027947" w:history="1">
             <w:r>
               <w:rPr>
                 <w:rStyle w:val="Hyperlink"/>
@@ -4046,7 +4046,7 @@
                 <w:noProof/>
                 <w:webHidden/>
               </w:rPr>
-              <w:instrText xml:space="preserve"> PAGEREF _Toc237963393 \h </w:instrText>
+              <w:instrText xml:space="preserve"> PAGEREF _Toc238027947 \h </w:instrText>
             </w:r>
             <w:r>
               <w:rPr>
@@ -4093,7 +4093,7 @@
               <w14:ligatures w14:val="standardContextual"/>
             </w:rPr>
           </w:pPr>
-          <w:hyperlink w:anchor="_Toc237963394" w:history="1">
+          <w:hyperlink w:anchor="_Toc238027948" w:history="1">
             <w:r>
               <w:rPr>
                 <w:rStyle w:val="Hyperlink"/>
@@ -4120,7 +4120,7 @@
                 <w:noProof/>
                 <w:webHidden/>
               </w:rPr>
-              <w:instrText xml:space="preserve"> PAGEREF _Toc237963394 \h </w:instrText>
+              <w:instrText xml:space="preserve"> PAGEREF _Toc238027948 \h </w:instrText>
             </w:r>
             <w:r>
               <w:rPr>
@@ -4167,7 +4167,7 @@
               <w14:ligatures w14:val="standardContextual"/>
             </w:rPr>
           </w:pPr>
-          <w:hyperlink w:anchor="_Toc237963395" w:history="1">
+          <w:hyperlink w:anchor="_Toc238027949" w:history="1">
             <w:r>
               <w:rPr>
                 <w:rStyle w:val="Hyperlink"/>
@@ -4194,7 +4194,7 @@
                 <w:noProof/>
                 <w:webHidden/>
               </w:rPr>
-              <w:instrText xml:space="preserve"> PAGEREF _Toc237963395 \h </w:instrText>
+              <w:instrText xml:space="preserve"> PAGEREF _Toc238027949 \h </w:instrText>
             </w:r>
             <w:r>
               <w:rPr>
@@ -4241,7 +4241,7 @@
               <w14:ligatures w14:val="standardContextual"/>
             </w:rPr>
           </w:pPr>
-          <w:hyperlink w:anchor="_Toc237963396" w:history="1">
+          <w:hyperlink w:anchor="_Toc238027950" w:history="1">
             <w:r>
               <w:rPr>
                 <w:rStyle w:val="Hyperlink"/>
@@ -4268,7 +4268,7 @@
                 <w:noProof/>
                 <w:webHidden/>
               </w:rPr>
-              <w:instrText xml:space="preserve"> PAGEREF _Toc237963396 \h </w:instrText>
+              <w:instrText xml:space="preserve"> PAGEREF _Toc238027950 \h </w:instrText>
             </w:r>
             <w:r>
               <w:rPr>
@@ -4315,7 +4315,7 @@
               <w14:ligatures w14:val="standardContextual"/>
             </w:rPr>
           </w:pPr>
-          <w:hyperlink w:anchor="_Toc237963397" w:history="1">
+          <w:hyperlink w:anchor="_Toc238027951" w:history="1">
             <w:r>
               <w:rPr>
                 <w:rStyle w:val="Hyperlink"/>
@@ -4342,7 +4342,7 @@
                 <w:noProof/>
                 <w:webHidden/>
               </w:rPr>
-              <w:instrText xml:space="preserve"> PAGEREF _Toc237963397 \h </w:instrText>
+              <w:instrText xml:space="preserve"> PAGEREF _Toc238027951 \h </w:instrText>
             </w:r>
             <w:r>
               <w:rPr>
@@ -4389,7 +4389,7 @@
               <w14:ligatures w14:val="standardContextual"/>
             </w:rPr>
           </w:pPr>
-          <w:hyperlink w:anchor="_Toc237963398" w:history="1">
+          <w:hyperlink w:anchor="_Toc238027952" w:history="1">
             <w:r>
               <w:rPr>
                 <w:rStyle w:val="Hyperlink"/>
@@ -4416,7 +4416,7 @@
                 <w:noProof/>
                 <w:webHidden/>
               </w:rPr>
-              <w:instrText xml:space="preserve"> PAGEREF _Toc237963398 \h </w:instrText>
+              <w:instrText xml:space="preserve"> PAGEREF _Toc238027952 \h </w:instrText>
             </w:r>
             <w:r>
               <w:rPr>
@@ -4463,7 +4463,7 @@
               <w14:ligatures w14:val="standardContextual"/>
             </w:rPr>
           </w:pPr>
-          <w:hyperlink w:anchor="_Toc237963399" w:history="1">
+          <w:hyperlink w:anchor="_Toc238027953" w:history="1">
             <w:r>
               <w:rPr>
                 <w:rStyle w:val="Hyperlink"/>
@@ -4490,7 +4490,7 @@
                 <w:noProof/>
                 <w:webHidden/>
               </w:rPr>
-              <w:instrText xml:space="preserve"> PAGEREF _Toc237963399 \h </w:instrText>
+              <w:instrText xml:space="preserve"> PAGEREF _Toc238027953 \h </w:instrText>
             </w:r>
             <w:r>
               <w:rPr>
@@ -4537,7 +4537,7 @@
               <w14:ligatures w14:val="standardContextual"/>
             </w:rPr>
           </w:pPr>
-          <w:hyperlink w:anchor="_Toc237963400" w:history="1">
+          <w:hyperlink w:anchor="_Toc238027954" w:history="1">
             <w:r>
               <w:rPr>
                 <w:rStyle w:val="Hyperlink"/>
@@ -4564,7 +4564,7 @@
                 <w:noProof/>
                 <w:webHidden/>
               </w:rPr>
-              <w:instrText xml:space="preserve"> PAGEREF _Toc237963400 \h </w:instrText>
+              <w:instrText xml:space="preserve"> PAGEREF _Toc238027954 \h </w:instrText>
             </w:r>
             <w:r>
               <w:rPr>
@@ -4611,7 +4611,7 @@
               <w14:ligatures w14:val="standardContextual"/>
             </w:rPr>
           </w:pPr>
-          <w:hyperlink w:anchor="_Toc237963401" w:history="1">
+          <w:hyperlink w:anchor="_Toc238027955" w:history="1">
             <w:r>
               <w:rPr>
                 <w:rStyle w:val="Hyperlink"/>
@@ -4638,7 +4638,7 @@
                 <w:noProof/>
                 <w:webHidden/>
               </w:rPr>
-              <w:instrText xml:space="preserve"> PAGEREF _Toc237963401 \h </w:instrText>
+              <w:instrText xml:space="preserve"> PAGEREF _Toc238027955 \h </w:instrText>
             </w:r>
             <w:r>
               <w:rPr>
@@ -4685,7 +4685,7 @@
               <w14:ligatures w14:val="standardContextual"/>
             </w:rPr>
           </w:pPr>
-          <w:hyperlink w:anchor="_Toc237963402" w:history="1">
+          <w:hyperlink w:anchor="_Toc238027956" w:history="1">
             <w:r>
               <w:rPr>
                 <w:rStyle w:val="Hyperlink"/>
@@ -4712,7 +4712,7 @@
                 <w:noProof/>
                 <w:webHidden/>
               </w:rPr>
-              <w:instrText xml:space="preserve"> PAGEREF _Toc237963402 \h </w:instrText>
+              <w:instrText xml:space="preserve"> PAGEREF _Toc238027956 \h </w:instrText>
             </w:r>
             <w:r>
               <w:rPr>
@@ -4759,7 +4759,7 @@
               <w14:ligatures w14:val="standardContextual"/>
             </w:rPr>
           </w:pPr>
-          <w:hyperlink w:anchor="_Toc237963403" w:history="1">
+          <w:hyperlink w:anchor="_Toc238027957" w:history="1">
             <w:r>
               <w:rPr>
                 <w:rStyle w:val="Hyperlink"/>
@@ -4786,7 +4786,7 @@
                 <w:noProof/>
                 <w:webHidden/>
               </w:rPr>
-              <w:instrText xml:space="preserve"> PAGEREF _Toc237963403 \h </w:instrText>
+              <w:instrText xml:space="preserve"> PAGEREF _Toc238027957 \h </w:instrText>
             </w:r>
             <w:r>
               <w:rPr>
@@ -4833,7 +4833,7 @@
               <w14:ligatures w14:val="standardContextual"/>
             </w:rPr>
           </w:pPr>
-          <w:hyperlink w:anchor="_Toc237963404" w:history="1">
+          <w:hyperlink w:anchor="_Toc238027958" w:history="1">
             <w:r>
               <w:rPr>
                 <w:rStyle w:val="Hyperlink"/>
@@ -4860,7 +4860,7 @@
                 <w:noProof/>
                 <w:webHidden/>
               </w:rPr>
-              <w:instrText xml:space="preserve"> PAGEREF _Toc237963404 \h </w:instrText>
+              <w:instrText xml:space="preserve"> PAGEREF _Toc238027958 \h </w:instrText>
             </w:r>
             <w:r>
               <w:rPr>
@@ -4907,27 +4907,13 @@
               <w14:ligatures w14:val="standardContextual"/>
             </w:rPr>
           </w:pPr>
-          <w:hyperlink w:anchor="_Toc237963405" w:history="1">
+          <w:hyperlink w:anchor="_Toc238027959" w:history="1">
             <w:r>
               <w:rPr>
                 <w:rStyle w:val="Hyperlink"/>
                 <w:noProof/>
               </w:rPr>
-              <w:t>Proj</w:t>
-            </w:r>
-            <w:r>
-              <w:rPr>
-                <w:rStyle w:val="Hyperlink"/>
-                <w:noProof/>
-              </w:rPr>
-              <w:t>e</w:t>
-            </w:r>
-            <w:r>
-              <w:rPr>
-                <w:rStyle w:val="Hyperlink"/>
-                <w:noProof/>
-              </w:rPr>
-              <w:t>ct Personnel</w:t>
+              <w:t>Project Personnel</w:t>
             </w:r>
             <w:r>
               <w:rPr>
@@ -4948,7 +4934,7 @@
                 <w:noProof/>
                 <w:webHidden/>
               </w:rPr>
-              <w:instrText xml:space="preserve"> PAGEREF _Toc237963405 \h </w:instrText>
+              <w:instrText xml:space="preserve"> PAGEREF _Toc238027959 \h </w:instrText>
             </w:r>
             <w:r>
               <w:rPr>
@@ -4995,7 +4981,7 @@
               <w14:ligatures w14:val="standardContextual"/>
             </w:rPr>
           </w:pPr>
-          <w:hyperlink w:anchor="_Toc237963406" w:history="1">
+          <w:hyperlink w:anchor="_Toc238027960" w:history="1">
             <w:r>
               <w:rPr>
                 <w:rStyle w:val="Hyperlink"/>
@@ -5022,7 +5008,7 @@
                 <w:noProof/>
                 <w:webHidden/>
               </w:rPr>
-              <w:instrText xml:space="preserve"> PAGEREF _Toc237963406 \h </w:instrText>
+              <w:instrText xml:space="preserve"> PAGEREF _Toc238027960 \h </w:instrText>
             </w:r>
             <w:r>
               <w:rPr>
@@ -5069,7 +5055,7 @@
               <w14:ligatures w14:val="standardContextual"/>
             </w:rPr>
           </w:pPr>
-          <w:hyperlink w:anchor="_Toc237963407" w:history="1">
+          <w:hyperlink w:anchor="_Toc238027961" w:history="1">
             <w:r>
               <w:rPr>
                 <w:rStyle w:val="Hyperlink"/>
@@ -5096,7 +5082,7 @@
                 <w:noProof/>
                 <w:webHidden/>
               </w:rPr>
-              <w:instrText xml:space="preserve"> PAGEREF _Toc237963407 \h </w:instrText>
+              <w:instrText xml:space="preserve"> PAGEREF _Toc238027961 \h </w:instrText>
             </w:r>
             <w:r>
               <w:rPr>
@@ -5116,7 +5102,7 @@
                 <w:noProof/>
                 <w:webHidden/>
               </w:rPr>
-              <w:t>9</w:t>
+              <w:t>10</w:t>
             </w:r>
             <w:r>
               <w:rPr>
@@ -5143,7 +5129,7 @@
               <w14:ligatures w14:val="standardContextual"/>
             </w:rPr>
           </w:pPr>
-          <w:hyperlink w:anchor="_Toc237963408" w:history="1">
+          <w:hyperlink w:anchor="_Toc238027962" w:history="1">
             <w:r>
               <w:rPr>
                 <w:rStyle w:val="Hyperlink"/>
@@ -5170,7 +5156,7 @@
                 <w:noProof/>
                 <w:webHidden/>
               </w:rPr>
-              <w:instrText xml:space="preserve"> PAGEREF _Toc237963408 \h </w:instrText>
+              <w:instrText xml:space="preserve"> PAGEREF _Toc238027962 \h </w:instrText>
             </w:r>
             <w:r>
               <w:rPr>
@@ -5217,7 +5203,7 @@
               <w14:ligatures w14:val="standardContextual"/>
             </w:rPr>
           </w:pPr>
-          <w:hyperlink w:anchor="_Toc237963409" w:history="1">
+          <w:hyperlink w:anchor="_Toc238027963" w:history="1">
             <w:r>
               <w:rPr>
                 <w:rStyle w:val="Hyperlink"/>
@@ -5244,7 +5230,7 @@
                 <w:noProof/>
                 <w:webHidden/>
               </w:rPr>
-              <w:instrText xml:space="preserve"> PAGEREF _Toc237963409 \h </w:instrText>
+              <w:instrText xml:space="preserve"> PAGEREF _Toc238027963 \h </w:instrText>
             </w:r>
             <w:r>
               <w:rPr>
@@ -5291,7 +5277,7 @@
               <w14:ligatures w14:val="standardContextual"/>
             </w:rPr>
           </w:pPr>
-          <w:hyperlink w:anchor="_Toc237963410" w:history="1">
+          <w:hyperlink w:anchor="_Toc238027964" w:history="1">
             <w:r>
               <w:rPr>
                 <w:rStyle w:val="Hyperlink"/>
@@ -5318,7 +5304,7 @@
                 <w:noProof/>
                 <w:webHidden/>
               </w:rPr>
-              <w:instrText xml:space="preserve"> PAGEREF _Toc237963410 \h </w:instrText>
+              <w:instrText xml:space="preserve"> PAGEREF _Toc238027964 \h </w:instrText>
             </w:r>
             <w:r>
               <w:rPr>
@@ -5365,7 +5351,7 @@
               <w14:ligatures w14:val="standardContextual"/>
             </w:rPr>
           </w:pPr>
-          <w:hyperlink w:anchor="_Toc237963411" w:history="1">
+          <w:hyperlink w:anchor="_Toc238027965" w:history="1">
             <w:r>
               <w:rPr>
                 <w:rStyle w:val="Hyperlink"/>
@@ -5392,7 +5378,7 @@
                 <w:noProof/>
                 <w:webHidden/>
               </w:rPr>
-              <w:instrText xml:space="preserve"> PAGEREF _Toc237963411 \h </w:instrText>
+              <w:instrText xml:space="preserve"> PAGEREF _Toc238027965 \h </w:instrText>
             </w:r>
             <w:r>
               <w:rPr>
@@ -5439,7 +5425,7 @@
               <w14:ligatures w14:val="standardContextual"/>
             </w:rPr>
           </w:pPr>
-          <w:hyperlink w:anchor="_Toc237963412" w:history="1">
+          <w:hyperlink w:anchor="_Toc238027966" w:history="1">
             <w:r>
               <w:rPr>
                 <w:rStyle w:val="Hyperlink"/>
@@ -5466,7 +5452,7 @@
                 <w:noProof/>
                 <w:webHidden/>
               </w:rPr>
-              <w:instrText xml:space="preserve"> PAGEREF _Toc237963412 \h </w:instrText>
+              <w:instrText xml:space="preserve"> PAGEREF _Toc238027966 \h </w:instrText>
             </w:r>
             <w:r>
               <w:rPr>
@@ -5513,7 +5499,7 @@
               <w14:ligatures w14:val="standardContextual"/>
             </w:rPr>
           </w:pPr>
-          <w:hyperlink w:anchor="_Toc237963413" w:history="1">
+          <w:hyperlink w:anchor="_Toc238027967" w:history="1">
             <w:r>
               <w:rPr>
                 <w:rStyle w:val="Hyperlink"/>
@@ -5540,7 +5526,7 @@
                 <w:noProof/>
                 <w:webHidden/>
               </w:rPr>
-              <w:instrText xml:space="preserve"> PAGEREF _Toc237963413 \h </w:instrText>
+              <w:instrText xml:space="preserve"> PAGEREF _Toc238027967 \h </w:instrText>
             </w:r>
             <w:r>
               <w:rPr>
@@ -5587,7 +5573,7 @@
               <w14:ligatures w14:val="standardContextual"/>
             </w:rPr>
           </w:pPr>
-          <w:hyperlink w:anchor="_Toc237963414" w:history="1">
+          <w:hyperlink w:anchor="_Toc238027968" w:history="1">
             <w:r>
               <w:rPr>
                 <w:rStyle w:val="Hyperlink"/>
@@ -5614,7 +5600,7 @@
                 <w:noProof/>
                 <w:webHidden/>
               </w:rPr>
-              <w:instrText xml:space="preserve"> PAGEREF _Toc237963414 \h </w:instrText>
+              <w:instrText xml:space="preserve"> PAGEREF _Toc238027968 \h </w:instrText>
             </w:r>
             <w:r>
               <w:rPr>
@@ -5634,7 +5620,7 @@
                 <w:noProof/>
                 <w:webHidden/>
               </w:rPr>
-              <w:t>16</w:t>
+              <w:t>17</w:t>
             </w:r>
             <w:r>
               <w:rPr>
@@ -5661,7 +5647,7 @@
               <w14:ligatures w14:val="standardContextual"/>
             </w:rPr>
           </w:pPr>
-          <w:hyperlink w:anchor="_Toc237963415" w:history="1">
+          <w:hyperlink w:anchor="_Toc238027969" w:history="1">
             <w:r>
               <w:rPr>
                 <w:rStyle w:val="Hyperlink"/>
@@ -5688,7 +5674,7 @@
                 <w:noProof/>
                 <w:webHidden/>
               </w:rPr>
-              <w:instrText xml:space="preserve"> PAGEREF _Toc237963415 \h </w:instrText>
+              <w:instrText xml:space="preserve"> PAGEREF _Toc238027969 \h </w:instrText>
             </w:r>
             <w:r>
               <w:rPr>
@@ -5708,7 +5694,7 @@
                 <w:noProof/>
                 <w:webHidden/>
               </w:rPr>
-              <w:t>17</w:t>
+              <w:t>18</w:t>
             </w:r>
             <w:r>
               <w:rPr>
@@ -5735,7 +5721,7 @@
               <w14:ligatures w14:val="standardContextual"/>
             </w:rPr>
           </w:pPr>
-          <w:hyperlink w:anchor="_Toc237963416" w:history="1">
+          <w:hyperlink w:anchor="_Toc238027970" w:history="1">
             <w:r>
               <w:rPr>
                 <w:rStyle w:val="Hyperlink"/>
@@ -5762,7 +5748,7 @@
                 <w:noProof/>
                 <w:webHidden/>
               </w:rPr>
-              <w:instrText xml:space="preserve"> PAGEREF _Toc237963416 \h </w:instrText>
+              <w:instrText xml:space="preserve"> PAGEREF _Toc238027970 \h </w:instrText>
             </w:r>
             <w:r>
               <w:rPr>
@@ -5782,7 +5768,7 @@
                 <w:noProof/>
                 <w:webHidden/>
               </w:rPr>
-              <w:t>17</w:t>
+              <w:t>18</w:t>
             </w:r>
             <w:r>
               <w:rPr>
@@ -5809,7 +5795,7 @@
               <w14:ligatures w14:val="standardContextual"/>
             </w:rPr>
           </w:pPr>
-          <w:hyperlink w:anchor="_Toc237963417" w:history="1">
+          <w:hyperlink w:anchor="_Toc238027971" w:history="1">
             <w:r>
               <w:rPr>
                 <w:rStyle w:val="Hyperlink"/>
@@ -5836,7 +5822,7 @@
                 <w:noProof/>
                 <w:webHidden/>
               </w:rPr>
-              <w:instrText xml:space="preserve"> PAGEREF _Toc237963417 \h </w:instrText>
+              <w:instrText xml:space="preserve"> PAGEREF _Toc238027971 \h </w:instrText>
             </w:r>
             <w:r>
               <w:rPr>
@@ -5856,7 +5842,7 @@
                 <w:noProof/>
                 <w:webHidden/>
               </w:rPr>
-              <w:t>18</w:t>
+              <w:t>19</w:t>
             </w:r>
             <w:r>
               <w:rPr>
@@ -5883,7 +5869,7 @@
               <w14:ligatures w14:val="standardContextual"/>
             </w:rPr>
           </w:pPr>
-          <w:hyperlink w:anchor="_Toc237963418" w:history="1">
+          <w:hyperlink w:anchor="_Toc238027972" w:history="1">
             <w:r>
               <w:rPr>
                 <w:rStyle w:val="Hyperlink"/>
@@ -5910,7 +5896,7 @@
                 <w:noProof/>
                 <w:webHidden/>
               </w:rPr>
-              <w:instrText xml:space="preserve"> PAGEREF _Toc237963418 \h </w:instrText>
+              <w:instrText xml:space="preserve"> PAGEREF _Toc238027972 \h </w:instrText>
             </w:r>
             <w:r>
               <w:rPr>
@@ -5957,7 +5943,7 @@
               <w14:ligatures w14:val="standardContextual"/>
             </w:rPr>
           </w:pPr>
-          <w:hyperlink w:anchor="_Toc237963419" w:history="1">
+          <w:hyperlink w:anchor="_Toc238027973" w:history="1">
             <w:r>
               <w:rPr>
                 <w:rStyle w:val="Hyperlink"/>
@@ -5984,7 +5970,7 @@
                 <w:noProof/>
                 <w:webHidden/>
               </w:rPr>
-              <w:instrText xml:space="preserve"> PAGEREF _Toc237963419 \h </w:instrText>
+              <w:instrText xml:space="preserve"> PAGEREF _Toc238027973 \h </w:instrText>
             </w:r>
             <w:r>
               <w:rPr>
@@ -6031,7 +6017,7 @@
               <w14:ligatures w14:val="standardContextual"/>
             </w:rPr>
           </w:pPr>
-          <w:hyperlink w:anchor="_Toc237963420" w:history="1">
+          <w:hyperlink w:anchor="_Toc238027974" w:history="1">
             <w:r>
               <w:rPr>
                 <w:rStyle w:val="Hyperlink"/>
@@ -6058,7 +6044,7 @@
                 <w:noProof/>
                 <w:webHidden/>
               </w:rPr>
-              <w:instrText xml:space="preserve"> PAGEREF _Toc237963420 \h </w:instrText>
+              <w:instrText xml:space="preserve"> PAGEREF _Toc238027974 \h </w:instrText>
             </w:r>
             <w:r>
               <w:rPr>
@@ -6078,7 +6064,7 @@
                 <w:noProof/>
                 <w:webHidden/>
               </w:rPr>
-              <w:t>19</w:t>
+              <w:t>20</w:t>
             </w:r>
             <w:r>
               <w:rPr>
@@ -6106,7 +6092,7 @@
               <w14:ligatures w14:val="standardContextual"/>
             </w:rPr>
           </w:pPr>
-          <w:hyperlink w:anchor="_Toc237963421" w:history="1">
+          <w:hyperlink w:anchor="_Toc238027975" w:history="1">
             <w:r>
               <w:rPr>
                 <w:rStyle w:val="Hyperlink"/>
@@ -6152,7 +6138,7 @@
                 <w:noProof/>
                 <w:webHidden/>
               </w:rPr>
-              <w:instrText xml:space="preserve"> PAGEREF _Toc237963421 \h </w:instrText>
+              <w:instrText xml:space="preserve"> PAGEREF _Toc238027975 \h </w:instrText>
             </w:r>
             <w:r>
               <w:rPr>
@@ -6200,7 +6186,7 @@
               <w14:ligatures w14:val="standardContextual"/>
             </w:rPr>
           </w:pPr>
-          <w:hyperlink w:anchor="_Toc237963422" w:history="1">
+          <w:hyperlink w:anchor="_Toc238027976" w:history="1">
             <w:r>
               <w:rPr>
                 <w:rStyle w:val="Hyperlink"/>
@@ -6246,7 +6232,7 @@
                 <w:noProof/>
                 <w:webHidden/>
               </w:rPr>
-              <w:instrText xml:space="preserve"> PAGEREF _Toc237963422 \h </w:instrText>
+              <w:instrText xml:space="preserve"> PAGEREF _Toc238027976 \h </w:instrText>
             </w:r>
             <w:r>
               <w:rPr>
@@ -6294,7 +6280,7 @@
               <w14:ligatures w14:val="standardContextual"/>
             </w:rPr>
           </w:pPr>
-          <w:hyperlink w:anchor="_Toc237963423" w:history="1">
+          <w:hyperlink w:anchor="_Toc238027977" w:history="1">
             <w:r>
               <w:rPr>
                 <w:rStyle w:val="Hyperlink"/>
@@ -6340,7 +6326,7 @@
                 <w:noProof/>
                 <w:webHidden/>
               </w:rPr>
-              <w:instrText xml:space="preserve"> PAGEREF _Toc237963423 \h </w:instrText>
+              <w:instrText xml:space="preserve"> PAGEREF _Toc238027977 \h </w:instrText>
             </w:r>
             <w:r>
               <w:rPr>
@@ -6388,7 +6374,7 @@
               <w14:ligatures w14:val="standardContextual"/>
             </w:rPr>
           </w:pPr>
-          <w:hyperlink w:anchor="_Toc237963424" w:history="1">
+          <w:hyperlink w:anchor="_Toc238027978" w:history="1">
             <w:r>
               <w:rPr>
                 <w:rStyle w:val="Hyperlink"/>
@@ -6434,7 +6420,7 @@
                 <w:noProof/>
                 <w:webHidden/>
               </w:rPr>
-              <w:instrText xml:space="preserve"> PAGEREF _Toc237963424 \h </w:instrText>
+              <w:instrText xml:space="preserve"> PAGEREF _Toc238027978 \h </w:instrText>
             </w:r>
             <w:r>
               <w:rPr>
@@ -6481,7 +6467,7 @@
               <w14:ligatures w14:val="standardContextual"/>
             </w:rPr>
           </w:pPr>
-          <w:hyperlink w:anchor="_Toc237963425" w:history="1">
+          <w:hyperlink w:anchor="_Toc238027979" w:history="1">
             <w:r>
               <w:rPr>
                 <w:rStyle w:val="Hyperlink"/>
@@ -6508,7 +6494,7 @@
                 <w:noProof/>
                 <w:webHidden/>
               </w:rPr>
-              <w:instrText xml:space="preserve"> PAGEREF _Toc237963425 \h </w:instrText>
+              <w:instrText xml:space="preserve"> PAGEREF _Toc238027979 \h </w:instrText>
             </w:r>
             <w:r>
               <w:rPr>
@@ -6555,7 +6541,7 @@
               <w14:ligatures w14:val="standardContextual"/>
             </w:rPr>
           </w:pPr>
-          <w:hyperlink w:anchor="_Toc237963426" w:history="1">
+          <w:hyperlink w:anchor="_Toc238027980" w:history="1">
             <w:r>
               <w:rPr>
                 <w:rStyle w:val="Hyperlink"/>
@@ -6582,7 +6568,7 @@
                 <w:noProof/>
                 <w:webHidden/>
               </w:rPr>
-              <w:instrText xml:space="preserve"> PAGEREF _Toc237963426 \h </w:instrText>
+              <w:instrText xml:space="preserve"> PAGEREF _Toc238027980 \h </w:instrText>
             </w:r>
             <w:r>
               <w:rPr>
@@ -6631,7 +6617,7 @@
       <w:pPr>
         <w:pStyle w:val="Heading1"/>
       </w:pPr>
-      <w:bookmarkStart w:id="0" w:name="_Toc237963392"/>
+      <w:bookmarkStart w:id="0" w:name="_Toc238027946"/>
       <w:r>
         <w:t>Project Objective</w:t>
       </w:r>
@@ -6641,7 +6627,7 @@
       <w:pPr>
         <w:pStyle w:val="Heading2"/>
       </w:pPr>
-      <w:bookmarkStart w:id="1" w:name="_Toc237963393"/>
+      <w:bookmarkStart w:id="1" w:name="_Toc238027947"/>
       <w:r>
         <w:t>Client background</w:t>
       </w:r>
@@ -6652,72 +6638,181 @@
         <w:pStyle w:val="TNR"/>
       </w:pPr>
       <w:r>
-        <w:t xml:space="preserve">The client for this project is Geoff Gordon who is a Network Administrator for </w:t>
-      </w:r>
-      <w:proofErr w:type="spellStart"/>
-      <w:r>
-        <w:t>WelTec</w:t>
-      </w:r>
-      <w:proofErr w:type="spellEnd"/>
-      <w:r>
-        <w:t xml:space="preserve"> and Whitireia, a local Polytechnic that is </w:t>
-      </w:r>
-      <w:r>
-        <w:t xml:space="preserve">a subsidiary of </w:t>
-      </w:r>
-      <w:proofErr w:type="spellStart"/>
-      <w:r>
-        <w:t>Te</w:t>
-      </w:r>
-      <w:proofErr w:type="spellEnd"/>
+        <w:t xml:space="preserve">The client for this project is Geoff Gordon who is a Network Administrator for WelTec and Whitireia, a local Polytechnic that is </w:t>
+      </w:r>
+      <w:r>
+        <w:t>a subsidiary of Te Pūkenga – New Zealand</w:t>
+      </w:r>
+      <w:r>
+        <w:t>’s</w:t>
+      </w:r>
+      <w:r>
+        <w:t xml:space="preserve"> Institute of Skills and Technology</w:t>
+      </w:r>
+      <w:r>
+        <w:t>. Geoff offers technical support to staff, students and lecturers’ and is an on-site “fix-it” man for delivering technical solutions and helpful ideas (Whitireia &amp; Weltec, n.d</w:t>
+      </w:r>
+      <w:r>
+        <w:t>.</w:t>
+      </w:r>
+      <w:r>
+        <w:t>).</w:t>
+      </w:r>
+    </w:p>
+    <w:p>
+      <w:pPr>
+        <w:pStyle w:val="TNR"/>
+      </w:pPr>
+      <w:r>
+        <w:t xml:space="preserve">The key problem </w:t>
+      </w:r>
+      <w:r>
+        <w:t>Geoff</w:t>
+      </w:r>
+      <w:r>
+        <w:t xml:space="preserve"> would like solved is the comparison of traditional </w:t>
+      </w:r>
+      <w:r>
+        <w:t xml:space="preserve">digital </w:t>
+      </w:r>
+      <w:r>
+        <w:t>forensic</w:t>
+      </w:r>
+      <w:r>
+        <w:t>s</w:t>
+      </w:r>
+      <w:r>
+        <w:t xml:space="preserve"> tools to </w:t>
+      </w:r>
+      <w:r>
+        <w:t xml:space="preserve">digital </w:t>
+      </w:r>
+      <w:r>
+        <w:t xml:space="preserve">forensic tools </w:t>
+      </w:r>
+      <w:r>
+        <w:t>that employ modern Large Language Model</w:t>
+      </w:r>
+      <w:r>
+        <w:t>s</w:t>
+      </w:r>
+      <w:r>
+        <w:t xml:space="preserve"> (LLM</w:t>
+      </w:r>
+      <w:r>
+        <w:t>s</w:t>
+      </w:r>
+      <w:r>
+        <w:t>)</w:t>
+      </w:r>
+      <w:r>
+        <w:t xml:space="preserve"> in the course of forensic artifact discovery</w:t>
+      </w:r>
+      <w:r>
+        <w:t xml:space="preserve"> for both Incident Response and Digital Forensics activities</w:t>
+      </w:r>
+      <w:r>
+        <w:t xml:space="preserve">. </w:t>
+      </w:r>
+      <w:r>
+        <w:t>W</w:t>
+      </w:r>
+      <w:r>
+        <w:t>hether</w:t>
+      </w:r>
+      <w:r>
+        <w:t xml:space="preserve"> AI </w:t>
+      </w:r>
+      <w:r>
+        <w:t xml:space="preserve">belongs in this </w:t>
+      </w:r>
+      <w:r>
+        <w:t xml:space="preserve">domain </w:t>
+      </w:r>
+      <w:r>
+        <w:t xml:space="preserve">or </w:t>
+      </w:r>
+      <w:r>
+        <w:t>not will depend on whether AI-augmented tools</w:t>
+      </w:r>
+      <w:r>
+        <w:t xml:space="preserve"> use an unreasonable </w:t>
+      </w:r>
+      <w:r>
+        <w:t>quantity</w:t>
+      </w:r>
+      <w:r>
+        <w:t xml:space="preserve"> of </w:t>
+      </w:r>
+      <w:r>
+        <w:t xml:space="preserve">hardware </w:t>
+      </w:r>
+      <w:r>
+        <w:t>resources</w:t>
+      </w:r>
+      <w:r>
+        <w:t xml:space="preserve"> and time</w:t>
+      </w:r>
+      <w:r>
+        <w:t xml:space="preserve"> to produce </w:t>
+      </w:r>
+      <w:r>
+        <w:t>at best</w:t>
+      </w:r>
+      <w:r>
+        <w:t xml:space="preserve"> lesser quality </w:t>
+      </w:r>
+      <w:r>
+        <w:t>and at worst</w:t>
+      </w:r>
+      <w:r>
+        <w:t xml:space="preserve"> erroneous forensic evidence</w:t>
+      </w:r>
+      <w:r>
+        <w:t xml:space="preserve"> or insights</w:t>
+      </w:r>
+      <w:r>
+        <w:t xml:space="preserve"> that </w:t>
+      </w:r>
+      <w:r>
+        <w:t xml:space="preserve">are far </w:t>
+      </w:r>
+      <w:r>
+        <w:t>below what is expected</w:t>
+      </w:r>
       <w:r>
         <w:t xml:space="preserve"> </w:t>
       </w:r>
-      <w:proofErr w:type="spellStart"/>
-      <w:r>
-        <w:t>Pūkenga</w:t>
-      </w:r>
-      <w:proofErr w:type="spellEnd"/>
-      <w:r>
-        <w:t xml:space="preserve"> – New Zealand</w:t>
-      </w:r>
-      <w:r>
-        <w:t>’s</w:t>
-      </w:r>
-      <w:r>
-        <w:t xml:space="preserve"> Institute of Skills and Technology</w:t>
-      </w:r>
-      <w:r>
-        <w:t>. Geoff offers technical support to staff, students and lecturers’ and is an on-site “fix-it” man for delivering technical solutions and helpful ideas (Whitireia &amp; Weltec, n.d</w:t>
+      <w:r>
+        <w:t xml:space="preserve">in </w:t>
+      </w:r>
+      <w:r>
+        <w:t>field</w:t>
+      </w:r>
+      <w:r>
+        <w:t>s</w:t>
+      </w:r>
+      <w:r>
+        <w:t xml:space="preserve"> that demand</w:t>
+      </w:r>
+      <w:r>
+        <w:t xml:space="preserve"> high standards of</w:t>
+      </w:r>
+      <w:r>
+        <w:t xml:space="preserve"> both ethical and evidentiary</w:t>
+      </w:r>
+      <w:r>
+        <w:t xml:space="preserve"> integrity</w:t>
       </w:r>
       <w:r>
         <w:t>.</w:t>
       </w:r>
-      <w:r>
-        <w:t>).</w:t>
-      </w:r>
-    </w:p>
-    <w:p>
-      <w:pPr>
-        <w:pStyle w:val="TNR"/>
-      </w:pPr>
-      <w:r>
-        <w:t xml:space="preserve">The key problem they would like solved is the comparison of traditional forensic tools to AI versions of forensic tools so that we may develop an analysis of whether or not AI is a worthwhile venture for forensics or if it uses an unreasonable </w:t>
-      </w:r>
-      <w:proofErr w:type="gramStart"/>
-      <w:r>
-        <w:t>amount</w:t>
-      </w:r>
-      <w:proofErr w:type="gramEnd"/>
-      <w:r>
-        <w:t xml:space="preserve"> of resources. </w:t>
-      </w:r>
     </w:p>
     <w:p>
       <w:pPr>
         <w:pStyle w:val="Heading2"/>
       </w:pPr>
-      <w:bookmarkStart w:id="2" w:name="_Toc237963394"/>
+      <w:bookmarkStart w:id="2" w:name="_Toc238027948"/>
       <w:r>
         <w:t>Deliverables</w:t>
       </w:r>
@@ -6739,7 +6834,7 @@
       <w:pPr>
         <w:pStyle w:val="Heading2"/>
       </w:pPr>
-      <w:bookmarkStart w:id="3" w:name="_Toc237963395"/>
+      <w:bookmarkStart w:id="3" w:name="_Toc238027949"/>
       <w:r>
         <w:t>Must haves</w:t>
       </w:r>
@@ -6757,7 +6852,7 @@
       <w:pPr>
         <w:pStyle w:val="Heading2"/>
       </w:pPr>
-      <w:bookmarkStart w:id="4" w:name="_Toc237963396"/>
+      <w:bookmarkStart w:id="4" w:name="_Toc238027950"/>
       <w:r>
         <w:t>Nice to haves</w:t>
       </w:r>
@@ -6825,256 +6920,1047 @@
       <w:pPr>
         <w:pStyle w:val="Heading2"/>
       </w:pPr>
-      <w:bookmarkStart w:id="5" w:name="_Toc237963397"/>
+      <w:bookmarkStart w:id="5" w:name="_Toc238027951"/>
+      <w:r>
+        <w:t>Scope</w:t>
+      </w:r>
+      <w:bookmarkEnd w:id="5"/>
+    </w:p>
+    <w:p>
+      <w:pPr>
+        <w:pStyle w:val="TNR"/>
+      </w:pPr>
+      <w:r>
+        <w:t xml:space="preserve">Tools that can be run in the Kali Linux environment for the intended uses of performing digital forensics against publicly available datasets are within the scope of this project. Forensic testing and analysis will be performed on OS and mobile-based datasets. As forensics expands a wide variety of activities such as data-carving, memory forensics and network forensics, these will all be considered in-scope for this project as we are looking to test these tools against a variety of different datasets to display their strengths and weaknesses.  The testing of legacy forensics tools and tools that are aided by artificial intelligence are in scope as we are looking to compare the two types of </w:t>
+      </w:r>
+      <w:r>
+        <w:t>tools</w:t>
+      </w:r>
+      <w:r>
+        <w:t xml:space="preserve">. The analysis and documentation of said testing is also within scope. </w:t>
+      </w:r>
+    </w:p>
+    <w:p>
+      <w:pPr>
+        <w:pStyle w:val="TNR"/>
+      </w:pPr>
+      <w:r>
+        <w:t>Incident Response</w:t>
+      </w:r>
+      <w:r>
+        <w:t xml:space="preserve"> (IR)</w:t>
+      </w:r>
+      <w:r>
+        <w:t xml:space="preserve"> and Digital Forensics</w:t>
+      </w:r>
+      <w:r>
+        <w:t xml:space="preserve"> (DF)</w:t>
+      </w:r>
+      <w:r>
+        <w:t xml:space="preserve"> are fields which are closely related, they both involve the discovery</w:t>
+      </w:r>
+      <w:r>
+        <w:t xml:space="preserve"> and analysis</w:t>
+      </w:r>
+      <w:r>
+        <w:t xml:space="preserve"> of digital artifacts, </w:t>
+      </w:r>
+      <w:r>
+        <w:t>however</w:t>
+      </w:r>
+      <w:r>
+        <w:t>,</w:t>
+      </w:r>
+      <w:r>
+        <w:t xml:space="preserve"> they tend to prize different properties of tools.</w:t>
+      </w:r>
+      <w:r>
+        <w:t xml:space="preserve"> Digital Forensics values the integrity and quality of evidence for use in criminal investigations</w:t>
+      </w:r>
+      <w:r>
+        <w:t>.</w:t>
+      </w:r>
+      <w:r>
+        <w:t xml:space="preserve"> </w:t>
+      </w:r>
+      <w:r>
+        <w:t>If c</w:t>
+      </w:r>
+      <w:r>
+        <w:t>hains of custody</w:t>
+      </w:r>
+      <w:r>
+        <w:t xml:space="preserve"> and audit trails are not </w:t>
+      </w:r>
+      <w:r>
+        <w:t>producible</w:t>
+      </w:r>
+      <w:r>
+        <w:t xml:space="preserve"> </w:t>
+      </w:r>
+      <w:r>
+        <w:t xml:space="preserve">by or </w:t>
+      </w:r>
+      <w:r>
+        <w:t>based on the output of LLM-</w:t>
+      </w:r>
+      <w:r>
+        <w:t>augmented</w:t>
+      </w:r>
+      <w:r>
+        <w:t xml:space="preserve"> tools, then the use of that tool can potentially compromise a criminal case. Alternatively, Incident Response </w:t>
+      </w:r>
+      <w:r>
+        <w:t xml:space="preserve">values the swiftness required to detect, analyse, diagnose, and quarantine during an ongoing security incident, and </w:t>
+      </w:r>
+      <w:r>
+        <w:t>particularly to gather and consolidate digital evidence during this time to assist incident recovery by identifying attack vectors, exploits, indicators of compromise, and attacker identity. For this project, both Incident Response and Digital Forensics are in scope, but will likely require separate test cases</w:t>
+      </w:r>
+      <w:r>
+        <w:t xml:space="preserve"> to reflect the </w:t>
+      </w:r>
+      <w:r>
+        <w:t>quality</w:t>
+      </w:r>
+      <w:r>
+        <w:t xml:space="preserve"> of their preferred metrics respectively.</w:t>
+      </w:r>
+    </w:p>
+    <w:p>
+      <w:pPr>
+        <w:pStyle w:val="TNR"/>
+      </w:pPr>
+      <w:r>
+        <w:t xml:space="preserve">The development of our own tools for forensics purposes isn’t considered within the scope of the project; we will be using publicly available ones instead. </w:t>
+      </w:r>
+      <w:r>
+        <w:t xml:space="preserve">While a </w:t>
+      </w:r>
+      <w:r>
+        <w:t>brief discussion on e</w:t>
+      </w:r>
+      <w:r>
+        <w:t xml:space="preserve">thics and risks of data leakages </w:t>
+      </w:r>
+      <w:r>
+        <w:t xml:space="preserve">is </w:t>
+      </w:r>
+      <w:r>
+        <w:t xml:space="preserve">considered a nice to have inclusion, </w:t>
+      </w:r>
+      <w:r>
+        <w:t>a full investigation into them is</w:t>
+      </w:r>
+      <w:r>
+        <w:t xml:space="preserve"> considered to be outside the scope of this project. Cloud-based tools are also out of </w:t>
+      </w:r>
+      <w:r>
+        <w:t>scope;</w:t>
+      </w:r>
+      <w:r>
+        <w:t xml:space="preserve"> this is because the machine we will be working on is a locally hosted machine on a local network.</w:t>
+      </w:r>
+    </w:p>
+    <w:p>
+      <w:pPr>
+        <w:pStyle w:val="TNR"/>
+      </w:pPr>
+      <w:r>
+        <w:t>We are not interested in our model’s abilities to generate reports, or come to conclusions based on our evidence, our investigation into the efficacy of these tools is in their empirical capacity. Essentially their usefulness to an examiner as opposed to an investigator.</w:t>
+      </w:r>
+      <w:r>
+        <w:t xml:space="preserve"> An examiner in Digital Forensics </w:t>
+      </w:r>
+      <w:r>
+        <w:t xml:space="preserve">employs specialized forensics tools to collect evidence from a range of digital sources and mediums, in criminal investigations, the evidence </w:t>
+      </w:r>
+      <w:r>
+        <w:t>retrieved</w:t>
+      </w:r>
+      <w:r>
+        <w:t xml:space="preserve"> by forensic examiners is </w:t>
+      </w:r>
+      <w:r>
+        <w:t xml:space="preserve">used in a court of law as a foundation for legal proceedings.  </w:t>
+      </w:r>
+      <w:sdt>
+        <w:sdtPr>
+          <w:id w:val="1341508552"/>
+          <w:citation/>
+        </w:sdtPr>
+        <w:sdtContent>
+          <w:r>
+            <w:fldChar w:fldCharType="begin"/>
+          </w:r>
+          <w:r>
+            <w:rPr>
+              <w:lang w:val="en-US"/>
+            </w:rPr>
+            <w:instrText xml:space="preserve"> CITATION PEC \l 1033 </w:instrText>
+          </w:r>
+          <w:r>
+            <w:fldChar w:fldCharType="separate"/>
+          </w:r>
+          <w:r>
+            <w:rPr>
+              <w:noProof/>
+              <w:lang w:val="en-US"/>
+            </w:rPr>
+            <w:t>(PECB, n.d.)</w:t>
+          </w:r>
+          <w:r>
+            <w:fldChar w:fldCharType="end"/>
+          </w:r>
+        </w:sdtContent>
+      </w:sdt>
+      <w:r>
+        <w:t>. A forensics investigator</w:t>
+      </w:r>
+      <w:r>
+        <w:t>, who could also be the examiner, consolidates this evidence into the report that is displayed in court, they produce the big picture and connections between forensic artifacts, they are more concerned with how the evidence fits together and generates criminal liability.</w:t>
+      </w:r>
+    </w:p>
+    <w:p>
+      <w:pPr>
+        <w:pStyle w:val="TNR"/>
+      </w:pPr>
+    </w:p>
+    <w:p>
+      <w:pPr>
+        <w:pStyle w:val="TNR"/>
+      </w:pPr>
+    </w:p>
+    <w:p>
+      <w:pPr>
+        <w:pStyle w:val="TNR"/>
+      </w:pPr>
+    </w:p>
+    <w:p>
+      <w:pPr>
+        <w:pStyle w:val="TNR"/>
+      </w:pPr>
+    </w:p>
+    <w:p>
+      <w:pPr>
+        <w:pStyle w:val="TNR"/>
+      </w:pPr>
+    </w:p>
+    <w:p>
+      <w:pPr>
+        <w:pStyle w:val="TNR"/>
+      </w:pPr>
+    </w:p>
+    <w:p>
+      <w:pPr>
+        <w:pStyle w:val="Heading2"/>
+      </w:pPr>
+      <w:bookmarkStart w:id="6" w:name="_Toc238027952"/>
       <w:r>
         <w:lastRenderedPageBreak/>
-        <w:t>Scope</w:t>
-      </w:r>
-      <w:bookmarkEnd w:id="5"/>
+        <w:t>Use of AI</w:t>
+      </w:r>
+      <w:bookmarkEnd w:id="6"/>
+      <w:r>
+        <w:t xml:space="preserve"> (LLMs)</w:t>
+      </w:r>
+    </w:p>
+    <w:p>
+      <w:pPr>
+        <w:rPr>
+          <w:lang w:val="en-NZ"/>
+        </w:rPr>
+      </w:pPr>
+      <w:r>
+        <w:rPr>
+          <w:lang w:val="en-NZ"/>
+        </w:rPr>
+        <w:t>The first distinction that is important to define is the differences in technologies that can be categorized under the superset of “AI”</w:t>
+      </w:r>
+      <w:r>
+        <w:rPr>
+          <w:lang w:val="en-NZ"/>
+        </w:rPr>
+        <w:t>.</w:t>
+      </w:r>
+    </w:p>
+    <w:p>
+      <w:pPr>
+        <w:pStyle w:val="Caption"/>
+        <w:keepNext/>
+      </w:pPr>
+      <w:bookmarkStart w:id="7" w:name="_Ref238033325"/>
+      <w:r>
+        <w:t xml:space="preserve">Figure </w:t>
+      </w:r>
+      <w:r>
+        <w:fldChar w:fldCharType="begin"/>
+      </w:r>
+      <w:r>
+        <w:instrText xml:space="preserve"> SEQ Figure \* ARABIC </w:instrText>
+      </w:r>
+      <w:r>
+        <w:fldChar w:fldCharType="separate"/>
+      </w:r>
+      <w:r>
+        <w:rPr>
+          <w:noProof/>
+        </w:rPr>
+        <w:t>1</w:t>
+      </w:r>
+      <w:r>
+        <w:fldChar w:fldCharType="end"/>
+      </w:r>
+      <w:bookmarkEnd w:id="7"/>
+    </w:p>
+    <w:p>
+      <w:pPr>
+        <w:rPr>
+          <w:lang w:val="en-NZ"/>
+        </w:rPr>
+      </w:pPr>
+      <w:r>
+        <w:rPr>
+          <w:noProof/>
+        </w:rPr>
+        <w:drawing>
+          <wp:inline distT="0" distB="0" distL="0" distR="0" wp14:anchorId="06BE5127" wp14:editId="633D9012">
+            <wp:extent cx="3395207" cy="3395207"/>
+            <wp:effectExtent l="0" t="0" r="0" b="0"/>
+            <wp:docPr id="1983357167" name="Picture 29"/>
+            <wp:cNvGraphicFramePr>
+              <a:graphicFrameLocks xmlns:a="http://schemas.openxmlformats.org/drawingml/2006/main" noChangeAspect="1"/>
+            </wp:cNvGraphicFramePr>
+            <a:graphic xmlns:a="http://schemas.openxmlformats.org/drawingml/2006/main">
+              <a:graphicData uri="http://schemas.openxmlformats.org/drawingml/2006/picture">
+                <pic:pic xmlns:pic="http://schemas.openxmlformats.org/drawingml/2006/picture">
+                  <pic:nvPicPr>
+                    <pic:cNvPr id="0" name="Picture 1"/>
+                    <pic:cNvPicPr>
+                      <a:picLocks noChangeAspect="1" noChangeArrowheads="1"/>
+                    </pic:cNvPicPr>
+                  </pic:nvPicPr>
+                  <pic:blipFill>
+                    <a:blip r:embed="rId10" cstate="print">
+                      <a:extLst>
+                        <a:ext uri="{28A0092B-C50C-407E-A947-70E740481C1C}">
+                          <a14:useLocalDpi xmlns:a14="http://schemas.microsoft.com/office/drawing/2010/main" val="0"/>
+                        </a:ext>
+                      </a:extLst>
+                    </a:blip>
+                    <a:srcRect/>
+                    <a:stretch>
+                      <a:fillRect/>
+                    </a:stretch>
+                  </pic:blipFill>
+                  <pic:spPr bwMode="auto">
+                    <a:xfrm>
+                      <a:off x="0" y="0"/>
+                      <a:ext cx="3412492" cy="3412492"/>
+                    </a:xfrm>
+                    <a:prstGeom prst="rect">
+                      <a:avLst/>
+                    </a:prstGeom>
+                    <a:noFill/>
+                    <a:ln>
+                      <a:noFill/>
+                    </a:ln>
+                  </pic:spPr>
+                </pic:pic>
+              </a:graphicData>
+            </a:graphic>
+          </wp:inline>
+        </w:drawing>
+      </w:r>
+    </w:p>
+    <w:p>
+      <w:pPr>
+        <w:rPr>
+          <w:lang w:val="en-NZ"/>
+        </w:rPr>
+      </w:pPr>
+      <w:sdt>
+        <w:sdtPr>
+          <w:rPr>
+            <w:lang w:val="en-NZ"/>
+          </w:rPr>
+          <w:id w:val="-1809770849"/>
+          <w:citation/>
+        </w:sdtPr>
+        <w:sdtContent>
+          <w:r>
+            <w:rPr>
+              <w:lang w:val="en-NZ"/>
+            </w:rPr>
+            <w:fldChar w:fldCharType="begin"/>
+          </w:r>
+          <w:r>
+            <w:rPr>
+              <w:lang w:val="en-US"/>
+            </w:rPr>
+            <w:instrText xml:space="preserve">CITATION Max26 \l 1033 </w:instrText>
+          </w:r>
+          <w:r>
+            <w:rPr>
+              <w:lang w:val="en-NZ"/>
+            </w:rPr>
+            <w:fldChar w:fldCharType="separate"/>
+          </w:r>
+          <w:r>
+            <w:rPr>
+              <w:noProof/>
+              <w:lang w:val="en-US"/>
+            </w:rPr>
+            <w:t>(Maxim Chernyshev, Baig, Naeem Syed, Robin Doss, &amp; Shore, 2026)</w:t>
+          </w:r>
+          <w:r>
+            <w:rPr>
+              <w:lang w:val="en-NZ"/>
+            </w:rPr>
+            <w:fldChar w:fldCharType="end"/>
+          </w:r>
+        </w:sdtContent>
+      </w:sdt>
+    </w:p>
+    <w:p>
+      <w:pPr>
+        <w:rPr>
+          <w:lang w:val="en-NZ"/>
+        </w:rPr>
+      </w:pPr>
+      <w:r>
+        <w:rPr>
+          <w:lang w:val="en-NZ"/>
+        </w:rPr>
+        <w:fldChar w:fldCharType="begin"/>
+      </w:r>
+      <w:r>
+        <w:rPr>
+          <w:lang w:val="en-NZ"/>
+        </w:rPr>
+        <w:instrText xml:space="preserve"> REF _Ref238033325 \h </w:instrText>
+      </w:r>
+      <w:r>
+        <w:rPr>
+          <w:lang w:val="en-NZ"/>
+        </w:rPr>
+      </w:r>
+      <w:r>
+        <w:rPr>
+          <w:lang w:val="en-NZ"/>
+        </w:rPr>
+        <w:fldChar w:fldCharType="separate"/>
+      </w:r>
+      <w:r>
+        <w:t xml:space="preserve">Figure </w:t>
+      </w:r>
+      <w:r>
+        <w:rPr>
+          <w:noProof/>
+        </w:rPr>
+        <w:t>1</w:t>
+      </w:r>
+      <w:r>
+        <w:rPr>
+          <w:lang w:val="en-NZ"/>
+        </w:rPr>
+        <w:fldChar w:fldCharType="end"/>
+      </w:r>
+      <w:r>
+        <w:rPr>
+          <w:lang w:val="en-NZ"/>
+        </w:rPr>
+        <w:t xml:space="preserve"> represents the consecutive subsets of AI technologies as they have evolved, artificial intelligence simply </w:t>
+      </w:r>
+      <w:r>
+        <w:rPr>
+          <w:lang w:val="en-NZ"/>
+        </w:rPr>
+        <w:t>describes “</w:t>
+      </w:r>
+      <w:r>
+        <w:rPr>
+          <w:lang w:val="en-NZ"/>
+        </w:rPr>
+        <w:t>computational systems designed to perform tasks that typically require human intelligence – such as reasoning,</w:t>
+      </w:r>
+      <w:r>
+        <w:rPr>
+          <w:lang w:val="en-NZ"/>
+        </w:rPr>
+        <w:t xml:space="preserve"> </w:t>
+      </w:r>
+      <w:r>
+        <w:rPr>
+          <w:lang w:val="en-NZ"/>
+        </w:rPr>
+        <w:t>learning, and problem-solvin</w:t>
+      </w:r>
+      <w:r>
+        <w:rPr>
+          <w:lang w:val="en-NZ"/>
+        </w:rPr>
+        <w:t xml:space="preserve">g.” </w:t>
+      </w:r>
+      <w:sdt>
+        <w:sdtPr>
+          <w:rPr>
+            <w:lang w:val="en-NZ"/>
+          </w:rPr>
+          <w:id w:val="-1792119850"/>
+          <w:citation/>
+        </w:sdtPr>
+        <w:sdtContent>
+          <w:r>
+            <w:rPr>
+              <w:lang w:val="en-NZ"/>
+            </w:rPr>
+            <w:fldChar w:fldCharType="begin"/>
+          </w:r>
+          <w:r>
+            <w:rPr>
+              <w:lang w:val="en-US"/>
+            </w:rPr>
+            <w:instrText xml:space="preserve"> CITATION Max26 \l 1033 </w:instrText>
+          </w:r>
+          <w:r>
+            <w:rPr>
+              <w:lang w:val="en-NZ"/>
+            </w:rPr>
+            <w:fldChar w:fldCharType="separate"/>
+          </w:r>
+          <w:r>
+            <w:rPr>
+              <w:noProof/>
+              <w:lang w:val="en-US"/>
+            </w:rPr>
+            <w:t>(Maxim Chernyshev, Baig, Naeem Syed, Robin Doss, &amp; Shore, 2026)</w:t>
+          </w:r>
+          <w:r>
+            <w:rPr>
+              <w:lang w:val="en-NZ"/>
+            </w:rPr>
+            <w:fldChar w:fldCharType="end"/>
+          </w:r>
+        </w:sdtContent>
+      </w:sdt>
+      <w:r>
+        <w:rPr>
+          <w:lang w:val="en-NZ"/>
+        </w:rPr>
+        <w:t xml:space="preserve">. </w:t>
+      </w:r>
+    </w:p>
+    <w:p>
+      <w:pPr>
+        <w:rPr>
+          <w:lang w:val="en-NZ"/>
+        </w:rPr>
+      </w:pPr>
+      <w:r>
+        <w:rPr>
+          <w:lang w:val="en-NZ"/>
+        </w:rPr>
+        <w:t xml:space="preserve">Machine learning furthers this effort by training machines to recognize patterns in the pursuit of specific tasks. In DFIR (Digital Forensics and Incident Response), this could be used to automatically detect forensically relevant artifacts within the large quantities of data that are present on hard drive disk images, memory dumps, and mobile phones, such as recognizing indicators of </w:t>
+      </w:r>
+      <w:r>
+        <w:rPr>
+          <w:lang w:val="en-NZ"/>
+        </w:rPr>
+        <w:t>malware based on large quantities of training data.</w:t>
+      </w:r>
+    </w:p>
+    <w:p>
+      <w:pPr>
+        <w:rPr>
+          <w:lang w:val="en-NZ"/>
+        </w:rPr>
+      </w:pPr>
+      <w:r>
+        <w:rPr>
+          <w:lang w:val="en-NZ"/>
+        </w:rPr>
+        <w:t xml:space="preserve">Deep learning is a further advancement designed to simulate the neural networks in a human brain, this technology is </w:t>
+      </w:r>
+      <w:r>
+        <w:rPr>
+          <w:lang w:val="en-NZ"/>
+        </w:rPr>
+        <w:t>produced</w:t>
+      </w:r>
+      <w:r>
+        <w:rPr>
+          <w:lang w:val="en-NZ"/>
+        </w:rPr>
+        <w:t xml:space="preserve"> by training the system</w:t>
+      </w:r>
+      <w:r>
+        <w:rPr>
+          <w:lang w:val="en-NZ"/>
+        </w:rPr>
+        <w:t xml:space="preserve"> on vast amounts of data to</w:t>
+      </w:r>
+      <w:r>
+        <w:rPr>
+          <w:lang w:val="en-NZ"/>
+        </w:rPr>
+        <w:t xml:space="preserve"> identify patterns to produce predictions by incrementally reducing the difference between “predicted outputs and true outputs”</w:t>
+      </w:r>
+      <w:sdt>
+        <w:sdtPr>
+          <w:rPr>
+            <w:lang w:val="en-NZ"/>
+          </w:rPr>
+          <w:id w:val="-1548904849"/>
+          <w:citation/>
+        </w:sdtPr>
+        <w:sdtContent>
+          <w:r>
+            <w:rPr>
+              <w:lang w:val="en-NZ"/>
+            </w:rPr>
+            <w:fldChar w:fldCharType="begin"/>
+          </w:r>
+          <w:r>
+            <w:rPr>
+              <w:lang w:val="en-US"/>
+            </w:rPr>
+            <w:instrText xml:space="preserve"> CITATION ISO \l 1033 </w:instrText>
+          </w:r>
+          <w:r>
+            <w:rPr>
+              <w:lang w:val="en-NZ"/>
+            </w:rPr>
+            <w:fldChar w:fldCharType="separate"/>
+          </w:r>
+          <w:r>
+            <w:rPr>
+              <w:noProof/>
+              <w:lang w:val="en-US"/>
+            </w:rPr>
+            <w:t xml:space="preserve"> (ISO, n.d.)</w:t>
+          </w:r>
+          <w:r>
+            <w:rPr>
+              <w:lang w:val="en-NZ"/>
+            </w:rPr>
+            <w:fldChar w:fldCharType="end"/>
+          </w:r>
+        </w:sdtContent>
+      </w:sdt>
+      <w:r>
+        <w:rPr>
+          <w:lang w:val="en-NZ"/>
+        </w:rPr>
+        <w:t xml:space="preserve">. </w:t>
+      </w:r>
+      <w:r>
+        <w:rPr>
+          <w:lang w:val="en-NZ"/>
+        </w:rPr>
+        <w:t>This could be something like identifying the difference between Kea’s and Kereru’s for 10,000 cycles, this incremental differentiation enforces a strong predictive capacity to the point where the system can identify a Kereru with a high degree of accuracy.</w:t>
+      </w:r>
+    </w:p>
+    <w:p>
+      <w:pPr>
+        <w:rPr>
+          <w:lang w:val="en-NZ"/>
+        </w:rPr>
+      </w:pPr>
+      <w:r>
+        <w:rPr>
+          <w:lang w:val="en-NZ"/>
+        </w:rPr>
+        <w:t xml:space="preserve">Generative AI is a subset of deep learning, now the AI is capable of drawing or describing a Kereru </w:t>
+      </w:r>
+      <w:r>
+        <w:rPr>
+          <w:lang w:val="en-NZ"/>
+        </w:rPr>
+        <w:t>by further learning the “</w:t>
+      </w:r>
+      <w:r>
+        <w:rPr>
+          <w:lang w:val="en-NZ"/>
+        </w:rPr>
+        <w:t xml:space="preserve">underlying probability distributions of their </w:t>
+      </w:r>
+      <w:r>
+        <w:rPr>
+          <w:lang w:val="en-NZ"/>
+        </w:rPr>
+        <w:t>training data</w:t>
+      </w:r>
+      <w:r>
+        <w:rPr>
+          <w:lang w:val="en-NZ"/>
+        </w:rPr>
+        <w:t xml:space="preserve"> to produce new instances resembling the original corpu</w:t>
+      </w:r>
+      <w:r>
+        <w:rPr>
+          <w:lang w:val="en-NZ"/>
+        </w:rPr>
+        <w:t>s”</w:t>
+      </w:r>
+      <w:sdt>
+        <w:sdtPr>
+          <w:rPr>
+            <w:lang w:val="en-NZ"/>
+          </w:rPr>
+          <w:id w:val="332106985"/>
+          <w:citation/>
+        </w:sdtPr>
+        <w:sdtContent>
+          <w:r>
+            <w:rPr>
+              <w:lang w:val="en-NZ"/>
+            </w:rPr>
+            <w:fldChar w:fldCharType="begin"/>
+          </w:r>
+          <w:r>
+            <w:rPr>
+              <w:lang w:val="en-US"/>
+            </w:rPr>
+            <w:instrText xml:space="preserve"> CITATION Max26 \l 1033 </w:instrText>
+          </w:r>
+          <w:r>
+            <w:rPr>
+              <w:lang w:val="en-NZ"/>
+            </w:rPr>
+            <w:fldChar w:fldCharType="separate"/>
+          </w:r>
+          <w:r>
+            <w:rPr>
+              <w:noProof/>
+              <w:lang w:val="en-US"/>
+            </w:rPr>
+            <w:t xml:space="preserve"> (Maxim Chernyshev, Baig, Naeem Syed, Robin Doss, &amp; Shore, 2026)</w:t>
+          </w:r>
+          <w:r>
+            <w:rPr>
+              <w:lang w:val="en-NZ"/>
+            </w:rPr>
+            <w:fldChar w:fldCharType="end"/>
+          </w:r>
+        </w:sdtContent>
+      </w:sdt>
+      <w:r>
+        <w:rPr>
+          <w:lang w:val="en-NZ"/>
+        </w:rPr>
+        <w:t xml:space="preserve">. </w:t>
+      </w:r>
+    </w:p>
+    <w:p>
+      <w:pPr>
+        <w:rPr>
+          <w:lang w:val="en-NZ"/>
+        </w:rPr>
+      </w:pPr>
+      <w:r>
+        <w:rPr>
+          <w:lang w:val="en-NZ"/>
+        </w:rPr>
+        <w:t>Large language models (LLMs)</w:t>
+      </w:r>
+    </w:p>
+    <w:p>
+      <w:pPr>
+        <w:rPr>
+          <w:lang w:val="en-NZ"/>
+        </w:rPr>
+      </w:pPr>
+    </w:p>
+    <w:p>
+      <w:pPr>
+        <w:rPr>
+          <w:lang w:val="en-NZ"/>
+        </w:rPr>
+      </w:pPr>
+      <w:r>
+        <w:rPr>
+          <w:lang w:val="en-NZ"/>
+        </w:rPr>
+        <w:lastRenderedPageBreak/>
+        <w:t>There are two fundamental principles under which we consider a DFIR tool "augmented by AI":</w:t>
+      </w:r>
+    </w:p>
+    <w:p>
+      <w:pPr>
+        <w:rPr>
+          <w:lang w:val="en-NZ"/>
+        </w:rPr>
+      </w:pPr>
+    </w:p>
+    <w:p>
+      <w:pPr>
+        <w:rPr>
+          <w:lang w:val="en-NZ"/>
+        </w:rPr>
+      </w:pPr>
+      <w:r>
+        <w:rPr>
+          <w:lang w:val="en-NZ"/>
+        </w:rPr>
+        <w:t xml:space="preserve">The Automation/optimization of existing DFIR tool/s by </w:t>
+      </w:r>
+      <w:r>
+        <w:rPr>
+          <w:lang w:val="en-NZ"/>
+        </w:rPr>
+        <w:t xml:space="preserve">advanced </w:t>
+      </w:r>
+      <w:r>
+        <w:rPr>
+          <w:lang w:val="en-NZ"/>
+        </w:rPr>
+        <w:t>machine learning algorithms</w:t>
+      </w:r>
+      <w:r>
+        <w:rPr>
+          <w:lang w:val="en-NZ"/>
+        </w:rPr>
+        <w:t xml:space="preserve"> and generative AI</w:t>
+      </w:r>
+      <w:r>
+        <w:rPr>
+          <w:lang w:val="en-NZ"/>
+        </w:rPr>
+        <w:t>:</w:t>
+      </w:r>
+    </w:p>
+    <w:p>
+      <w:pPr>
+        <w:rPr>
+          <w:lang w:val="en-NZ"/>
+        </w:rPr>
+      </w:pPr>
+      <w:r>
+        <w:rPr>
+          <w:lang w:val="en-NZ"/>
+        </w:rPr>
+        <w:t>-Unfold</w:t>
+      </w:r>
+    </w:p>
+    <w:p>
+      <w:pPr>
+        <w:rPr>
+          <w:lang w:val="en-NZ"/>
+        </w:rPr>
+      </w:pPr>
+      <w:r>
+        <w:rPr>
+          <w:lang w:val="en-NZ"/>
+        </w:rPr>
+        <w:t>-Unearth</w:t>
+      </w:r>
+    </w:p>
+    <w:p>
+      <w:pPr>
+        <w:rPr>
+          <w:lang w:val="en-NZ"/>
+        </w:rPr>
+      </w:pPr>
+      <w:r>
+        <w:rPr>
+          <w:lang w:val="en-NZ"/>
+        </w:rPr>
+        <w:t>-Mulder</w:t>
+      </w:r>
+    </w:p>
+    <w:p>
+      <w:pPr>
+        <w:rPr>
+          <w:lang w:val="en-NZ"/>
+        </w:rPr>
+      </w:pPr>
+      <w:r>
+        <w:rPr>
+          <w:lang w:val="en-NZ"/>
+        </w:rPr>
+        <w:t>An entirely new process of evidence discovery; employing the capacity of an AI model to uncover DFIR artifacts:</w:t>
+      </w:r>
     </w:p>
     <w:p>
       <w:pPr>
         <w:pStyle w:val="TNR"/>
       </w:pPr>
       <w:r>
-        <w:t xml:space="preserve">Tools that can be run in the Kali Linux environment for the intended uses of performing digital forensics against publicly available datasets are within the scope of this project. Forensic testing and analysis will be performed on OS and mobile-based datasets. As forensics expands a wide variety of activities such as data-carving, memory forensics and network forensics, these will all be considered in-scope for this project as we are looking to test these tools against a variety of different datasets to display their strengths and weaknesses.  The testing of legacy forensics tools and tools that are aided by artificial intelligence are in scope as we are looking to compare the two types of </w:t>
-      </w:r>
-      <w:r>
-        <w:t>tools</w:t>
-      </w:r>
-      <w:r>
-        <w:t xml:space="preserve">. The analysis and documentation of said testing is also within scope. </w:t>
+        <w:t>-PassGPT</w:t>
       </w:r>
     </w:p>
     <w:p>
       <w:pPr>
         <w:pStyle w:val="TNR"/>
       </w:pPr>
-      <w:r>
-        <w:t xml:space="preserve">The development of our own tools for forensics purposes isn’t considered within the scope of the project; we will be using publicly available ones instead. </w:t>
-      </w:r>
-      <w:r>
-        <w:t xml:space="preserve">While a </w:t>
-      </w:r>
-      <w:r>
-        <w:t>brief discussion on e</w:t>
-      </w:r>
-      <w:r>
-        <w:t xml:space="preserve">thics and risks of data leakages </w:t>
-      </w:r>
-      <w:r>
-        <w:t xml:space="preserve">is </w:t>
-      </w:r>
-      <w:r>
-        <w:t xml:space="preserve">considered a nice to have inclusion, </w:t>
-      </w:r>
-      <w:r>
-        <w:t>a full investigation into them is</w:t>
-      </w:r>
-      <w:r>
-        <w:t xml:space="preserve"> considered to be outside the scope of this project. Cloud-based tools are also out of </w:t>
-      </w:r>
-      <w:r>
-        <w:t>scope;</w:t>
-      </w:r>
-      <w:r>
-        <w:t xml:space="preserve"> this is because the machine we will be working on is a locally hosted machine on a local network.</w:t>
-      </w:r>
     </w:p>
     <w:p>
       <w:pPr>
         <w:pStyle w:val="TNR"/>
       </w:pPr>
       <w:r>
-        <w:t>We are not interested in our model’s abilities to generate reports, or come to conclusions based on our evidence, our investigation into the efficacy of these tools is in their empirical capacity. Essentially their usefulness to an examiner as opposed to an investigator.</w:t>
-      </w:r>
-      <w:r>
-        <w:t xml:space="preserve"> EXPLAIN WHAT THESE ROLES ARE/DO. NOT EVERYBODY IS DF BACKGROUND.</w:t>
-      </w:r>
+        <w:t xml:space="preserve">This requires interfacing locally hosted AI models on Ollama or LMStudio via the LiteLLM proxy to tools that are </w:t>
+      </w:r>
+      <w:r>
+        <w:t>designed to leverage this ability to specifically detect forensically relevant digital artifacts within our datasets</w:t>
+      </w:r>
+    </w:p>
+    <w:p>
+      <w:pPr>
+        <w:rPr>
+          <w:lang w:val="en-NZ"/>
+        </w:rPr>
+      </w:pPr>
+    </w:p>
+    <w:p>
+      <w:pPr>
+        <w:rPr>
+          <w:lang w:val="en-NZ"/>
+        </w:rPr>
+      </w:pPr>
+    </w:p>
+    <w:p>
+      <w:pPr>
+        <w:rPr>
+          <w:lang w:val="en-NZ"/>
+        </w:rPr>
+      </w:pPr>
+    </w:p>
+    <w:p>
+      <w:pPr>
+        <w:rPr>
+          <w:lang w:val="en-NZ"/>
+        </w:rPr>
+      </w:pPr>
+    </w:p>
+    <w:p>
+      <w:pPr>
+        <w:rPr>
+          <w:lang w:val="en-NZ"/>
+        </w:rPr>
+      </w:pPr>
+    </w:p>
+    <w:p>
+      <w:pPr>
+        <w:rPr>
+          <w:lang w:val="en-NZ"/>
+        </w:rPr>
+      </w:pPr>
+    </w:p>
+    <w:p>
+      <w:pPr>
+        <w:rPr>
+          <w:lang w:val="en-NZ"/>
+        </w:rPr>
+      </w:pPr>
+    </w:p>
+    <w:p>
+      <w:pPr>
+        <w:rPr>
+          <w:lang w:val="en-NZ"/>
+        </w:rPr>
+      </w:pPr>
+    </w:p>
+    <w:p>
+      <w:pPr>
+        <w:rPr>
+          <w:lang w:val="en-NZ"/>
+        </w:rPr>
+      </w:pPr>
+    </w:p>
+    <w:p>
+      <w:pPr>
+        <w:rPr>
+          <w:lang w:val="en-NZ"/>
+        </w:rPr>
+      </w:pPr>
+    </w:p>
+    <w:p>
+      <w:pPr>
+        <w:rPr>
+          <w:lang w:val="en-NZ"/>
+        </w:rPr>
+      </w:pPr>
+    </w:p>
+    <w:p>
+      <w:pPr>
+        <w:rPr>
+          <w:lang w:val="en-NZ"/>
+        </w:rPr>
+      </w:pPr>
+    </w:p>
+    <w:p>
+      <w:pPr>
+        <w:rPr>
+          <w:lang w:val="en-NZ"/>
+        </w:rPr>
+      </w:pPr>
+    </w:p>
+    <w:p>
+      <w:pPr>
+        <w:rPr>
+          <w:lang w:val="en-NZ"/>
+        </w:rPr>
+      </w:pPr>
+    </w:p>
+    <w:p>
+      <w:pPr>
+        <w:rPr>
+          <w:lang w:val="en-NZ"/>
+        </w:rPr>
+      </w:pPr>
+    </w:p>
+    <w:p>
+      <w:pPr>
+        <w:rPr>
+          <w:lang w:val="en-NZ"/>
+        </w:rPr>
+      </w:pPr>
+    </w:p>
+    <w:p>
+      <w:pPr>
+        <w:rPr>
+          <w:lang w:val="en-NZ"/>
+        </w:rPr>
+      </w:pPr>
+    </w:p>
+    <w:p>
+      <w:pPr>
+        <w:rPr>
+          <w:lang w:val="en-NZ"/>
+        </w:rPr>
+      </w:pPr>
+    </w:p>
+    <w:p>
+      <w:pPr>
+        <w:pStyle w:val="Heading1"/>
+      </w:pPr>
+      <w:bookmarkStart w:id="8" w:name="_Toc238027953"/>
+      <w:r>
+        <w:lastRenderedPageBreak/>
+        <w:t>Project Plan</w:t>
+      </w:r>
+      <w:bookmarkEnd w:id="8"/>
     </w:p>
     <w:p>
       <w:pPr>
         <w:pStyle w:val="Heading2"/>
       </w:pPr>
-      <w:bookmarkStart w:id="6" w:name="_Toc237963398"/>
-      <w:r>
-        <w:t>Use of AI</w:t>
-      </w:r>
-      <w:bookmarkEnd w:id="6"/>
-    </w:p>
-    <w:p>
-      <w:pPr>
-        <w:rPr>
-          <w:lang w:val="en-NZ"/>
-        </w:rPr>
-      </w:pPr>
-      <w:r>
-        <w:rPr>
-          <w:lang w:val="en-NZ"/>
-        </w:rPr>
-        <w:t>Half a page discussing how AI is relevant to this project. Needs citations.</w:t>
-      </w:r>
-    </w:p>
-    <w:p>
-      <w:pPr>
-        <w:pStyle w:val="TNR"/>
-      </w:pPr>
-    </w:p>
-    <w:p>
-      <w:pPr>
-        <w:rPr>
-          <w:lang w:val="en-NZ"/>
-        </w:rPr>
-      </w:pPr>
-    </w:p>
-    <w:p>
-      <w:pPr>
-        <w:rPr>
-          <w:lang w:val="en-NZ"/>
-        </w:rPr>
-      </w:pPr>
-    </w:p>
-    <w:p>
-      <w:pPr>
-        <w:rPr>
-          <w:lang w:val="en-NZ"/>
-        </w:rPr>
-      </w:pPr>
-    </w:p>
-    <w:p>
-      <w:pPr>
-        <w:rPr>
-          <w:lang w:val="en-NZ"/>
-        </w:rPr>
-      </w:pPr>
-    </w:p>
-    <w:p>
-      <w:pPr>
-        <w:rPr>
-          <w:lang w:val="en-NZ"/>
-        </w:rPr>
-      </w:pPr>
-    </w:p>
-    <w:p>
-      <w:pPr>
-        <w:rPr>
-          <w:lang w:val="en-NZ"/>
-        </w:rPr>
-      </w:pPr>
-    </w:p>
-    <w:p>
-      <w:pPr>
-        <w:rPr>
-          <w:lang w:val="en-NZ"/>
-        </w:rPr>
-      </w:pPr>
-    </w:p>
-    <w:p>
-      <w:pPr>
-        <w:rPr>
-          <w:lang w:val="en-NZ"/>
-        </w:rPr>
-      </w:pPr>
-    </w:p>
-    <w:p>
-      <w:pPr>
-        <w:rPr>
-          <w:lang w:val="en-NZ"/>
-        </w:rPr>
-      </w:pPr>
-    </w:p>
-    <w:p>
-      <w:pPr>
-        <w:rPr>
-          <w:lang w:val="en-NZ"/>
-        </w:rPr>
-      </w:pPr>
-    </w:p>
-    <w:p>
-      <w:pPr>
-        <w:rPr>
-          <w:lang w:val="en-NZ"/>
-        </w:rPr>
-      </w:pPr>
-    </w:p>
-    <w:p>
-      <w:pPr>
-        <w:rPr>
-          <w:lang w:val="en-NZ"/>
-        </w:rPr>
-      </w:pPr>
-    </w:p>
-    <w:p>
-      <w:pPr>
-        <w:rPr>
-          <w:lang w:val="en-NZ"/>
-        </w:rPr>
-      </w:pPr>
-    </w:p>
-    <w:p>
-      <w:pPr>
-        <w:rPr>
-          <w:lang w:val="en-NZ"/>
-        </w:rPr>
-      </w:pPr>
-    </w:p>
-    <w:p>
-      <w:pPr>
-        <w:rPr>
-          <w:lang w:val="en-NZ"/>
-        </w:rPr>
-      </w:pPr>
-    </w:p>
-    <w:p>
-      <w:pPr>
-        <w:rPr>
-          <w:lang w:val="en-NZ"/>
-        </w:rPr>
-      </w:pPr>
-    </w:p>
-    <w:p>
-      <w:pPr>
-        <w:rPr>
-          <w:lang w:val="en-NZ"/>
-        </w:rPr>
-      </w:pPr>
-    </w:p>
-    <w:p>
-      <w:pPr>
-        <w:rPr>
-          <w:lang w:val="en-NZ"/>
-        </w:rPr>
-      </w:pPr>
-    </w:p>
-    <w:p>
-      <w:pPr>
-        <w:pStyle w:val="Heading1"/>
-      </w:pPr>
-      <w:bookmarkStart w:id="7" w:name="_Toc237963399"/>
-      <w:r>
-        <w:t>Project Plan</w:t>
-      </w:r>
-      <w:bookmarkEnd w:id="7"/>
-    </w:p>
-    <w:p>
-      <w:pPr>
-        <w:pStyle w:val="Heading2"/>
-      </w:pPr>
-      <w:bookmarkStart w:id="8" w:name="_Toc237963400"/>
+      <w:bookmarkStart w:id="9" w:name="_Toc238027954"/>
       <w:r>
         <w:t>Methodology</w:t>
       </w:r>
-      <w:bookmarkEnd w:id="8"/>
+      <w:bookmarkEnd w:id="9"/>
     </w:p>
     <w:p>
       <w:pPr>
         <w:pStyle w:val="Heading3"/>
       </w:pPr>
-      <w:bookmarkStart w:id="9" w:name="_Toc237963401"/>
+      <w:bookmarkStart w:id="10" w:name="_Toc238027955"/>
       <w:r>
         <w:t>Kanban</w:t>
       </w:r>
-      <w:bookmarkEnd w:id="9"/>
+      <w:bookmarkEnd w:id="10"/>
     </w:p>
     <w:p>
       <w:pPr>
@@ -7267,12 +8153,11 @@
       <w:pPr>
         <w:pStyle w:val="Heading3"/>
       </w:pPr>
-      <w:bookmarkStart w:id="10" w:name="_Toc237963402"/>
-      <w:r>
-        <w:lastRenderedPageBreak/>
+      <w:bookmarkStart w:id="11" w:name="_Toc238027956"/>
+      <w:r>
         <w:t>NIST CTFF</w:t>
       </w:r>
-      <w:bookmarkEnd w:id="10"/>
+      <w:bookmarkEnd w:id="11"/>
     </w:p>
     <w:p>
       <w:pPr>
@@ -7424,7 +8309,11 @@
         <w:t xml:space="preserve"> reviews test report,</w:t>
       </w:r>
       <w:r>
-        <w:t xml:space="preserve"> Add findings to final report</w:t>
+        <w:t xml:space="preserve"> Add findings to final </w:t>
+      </w:r>
+      <w:r>
+        <w:lastRenderedPageBreak/>
+        <w:t>report</w:t>
       </w:r>
       <w:r>
         <w:t>. Using this testing process, we believe that we can achieve the outcomes required of our project as it is a testing process specific to tool testing.</w:t>
@@ -7439,11 +8328,11 @@
       <w:pPr>
         <w:pStyle w:val="Heading2"/>
       </w:pPr>
-      <w:bookmarkStart w:id="11" w:name="_Toc237963403"/>
+      <w:bookmarkStart w:id="12" w:name="_Toc238027957"/>
       <w:r>
         <w:t>Technologies</w:t>
       </w:r>
-      <w:bookmarkEnd w:id="11"/>
+      <w:bookmarkEnd w:id="12"/>
     </w:p>
     <w:p>
       <w:pPr>
@@ -7827,7 +8716,6 @@
         <w:rPr>
           <w:rFonts w:ascii="Times New Roman" w:hAnsi="Times New Roman" w:cs="Times New Roman"/>
         </w:rPr>
-        <w:lastRenderedPageBreak/>
         <w:t xml:space="preserve">Git </w:t>
       </w:r>
       <w:r>
@@ -7899,7 +8787,7 @@
         </w:rPr>
         <w:t xml:space="preserve">Git hub link: </w:t>
       </w:r>
-      <w:hyperlink r:id="rId10" w:history="1">
+      <w:hyperlink r:id="rId11" w:history="1">
         <w:r>
           <w:rPr>
             <w:rStyle w:val="Hyperlink"/>
@@ -7925,6 +8813,7 @@
           <w:sz w:val="24"/>
           <w:szCs w:val="24"/>
         </w:rPr>
+        <w:lastRenderedPageBreak/>
         <w:t>Discord</w:t>
       </w:r>
     </w:p>
@@ -8271,7 +9160,7 @@
           <w:szCs w:val="24"/>
         </w:rPr>
       </w:pPr>
-      <w:hyperlink r:id="rId11" w:history="1">
+      <w:hyperlink r:id="rId12" w:history="1">
         <w:r>
           <w:rPr>
             <w:rStyle w:val="Hyperlink"/>
@@ -8360,25 +9249,23 @@
           <w:sz w:val="24"/>
           <w:szCs w:val="24"/>
         </w:rPr>
-        <w:t xml:space="preserve">The version being used </w:t>
-      </w:r>
-      <w:proofErr w:type="gramStart"/>
+        <w:t xml:space="preserve">The version being used is: </w:t>
+      </w:r>
       <w:r>
         <w:rPr>
           <w:rFonts w:ascii="Times New Roman" w:hAnsi="Times New Roman" w:cs="Times New Roman"/>
           <w:sz w:val="24"/>
           <w:szCs w:val="24"/>
         </w:rPr>
-        <w:t>is:</w:t>
-      </w:r>
-      <w:proofErr w:type="gramEnd"/>
+        <w:t xml:space="preserve">John the Ripper </w:t>
+      </w:r>
       <w:r>
         <w:rPr>
           <w:rFonts w:ascii="Times New Roman" w:hAnsi="Times New Roman" w:cs="Times New Roman"/>
           <w:sz w:val="24"/>
           <w:szCs w:val="24"/>
         </w:rPr>
-        <w:t xml:space="preserve"> </w:t>
+        <w:t>v</w:t>
       </w:r>
       <w:r>
         <w:rPr>
@@ -8386,35 +9273,19 @@
           <w:sz w:val="24"/>
           <w:szCs w:val="24"/>
         </w:rPr>
-        <w:t xml:space="preserve">John the Ripper </w:t>
-      </w:r>
-      <w:r>
+        <w:t>1.9.0-jumbo-1+bleeding-aec1328d6c</w:t>
+      </w:r>
+    </w:p>
+    <w:p>
+      <w:pPr>
+        <w:jc w:val="both"/>
         <w:rPr>
           <w:rFonts w:ascii="Times New Roman" w:hAnsi="Times New Roman" w:cs="Times New Roman"/>
           <w:sz w:val="24"/>
           <w:szCs w:val="24"/>
         </w:rPr>
-        <w:t>v</w:t>
-      </w:r>
-      <w:r>
-        <w:rPr>
-          <w:rFonts w:ascii="Times New Roman" w:hAnsi="Times New Roman" w:cs="Times New Roman"/>
-          <w:sz w:val="24"/>
-          <w:szCs w:val="24"/>
-        </w:rPr>
-        <w:t>1.9.0-jumbo-1+bleeding-aec1328d6c</w:t>
-      </w:r>
-    </w:p>
-    <w:p>
-      <w:pPr>
-        <w:jc w:val="both"/>
-        <w:rPr>
-          <w:rFonts w:ascii="Times New Roman" w:hAnsi="Times New Roman" w:cs="Times New Roman"/>
-          <w:sz w:val="24"/>
-          <w:szCs w:val="24"/>
-        </w:rPr>
-      </w:pPr>
-      <w:hyperlink r:id="rId12" w:history="1">
+      </w:pPr>
+      <w:hyperlink r:id="rId13" w:history="1">
         <w:r>
           <w:rPr>
             <w:rStyle w:val="Hyperlink"/>
@@ -8539,7 +9410,6 @@
           <w:sz w:val="24"/>
           <w:szCs w:val="24"/>
         </w:rPr>
-        <w:lastRenderedPageBreak/>
         <w:t>The version being used is:</w:t>
       </w:r>
       <w:r>
@@ -8558,7 +9428,7 @@
         </w:rPr>
         <w:t>v</w:t>
       </w:r>
-      <w:hyperlink r:id="rId13" w:history="1">
+      <w:hyperlink r:id="rId14" w:history="1">
         <w:r>
           <w:rPr>
             <w:rStyle w:val="Hyperlink"/>
@@ -8589,7 +9459,7 @@
           <w:szCs w:val="24"/>
         </w:rPr>
       </w:pPr>
-      <w:hyperlink r:id="rId14" w:history="1">
+      <w:hyperlink r:id="rId15" w:history="1">
         <w:r>
           <w:rPr>
             <w:rStyle w:val="Hyperlink"/>
@@ -8683,7 +9553,16 @@
           <w:sz w:val="24"/>
           <w:szCs w:val="24"/>
         </w:rPr>
-        <w:t>tool that allows us to look at processes held inside of computers at the time the “screenshot” of volatile memory is taken, i.e. an image of the machines processes is taken and saved to be processed by Volatility. We have chosen this tool due to our familiarity with it also due to the fact that it is a memory forensics tool that can be compared to others that complete similar objectives.</w:t>
+        <w:t xml:space="preserve">tool that allows us to look at processes held inside of computers at the time the “screenshot” of volatile memory is taken, i.e. an image of the machines processes is taken and saved to be processed by Volatility. We have chosen this tool due to our familiarity with it also due to the fact </w:t>
+      </w:r>
+      <w:r>
+        <w:rPr>
+          <w:rFonts w:ascii="Times New Roman" w:hAnsi="Times New Roman" w:cs="Times New Roman"/>
+          <w:sz w:val="24"/>
+          <w:szCs w:val="24"/>
+        </w:rPr>
+        <w:lastRenderedPageBreak/>
+        <w:t>that it is a memory forensics tool that can be compared to others that complete similar objectives.</w:t>
       </w:r>
       <w:r>
         <w:rPr>
@@ -8726,25 +9605,23 @@
           <w:sz w:val="24"/>
           <w:szCs w:val="24"/>
         </w:rPr>
-        <w:t xml:space="preserve">The version being used </w:t>
-      </w:r>
-      <w:proofErr w:type="gramStart"/>
+        <w:t xml:space="preserve">The version being used is: </w:t>
+      </w:r>
       <w:r>
         <w:rPr>
           <w:rFonts w:ascii="Times New Roman" w:hAnsi="Times New Roman" w:cs="Times New Roman"/>
           <w:sz w:val="24"/>
           <w:szCs w:val="24"/>
         </w:rPr>
-        <w:t>is:</w:t>
-      </w:r>
-      <w:proofErr w:type="gramEnd"/>
+        <w:t xml:space="preserve">Volatility 3 Framework </w:t>
+      </w:r>
       <w:r>
         <w:rPr>
           <w:rFonts w:ascii="Times New Roman" w:hAnsi="Times New Roman" w:cs="Times New Roman"/>
           <w:sz w:val="24"/>
           <w:szCs w:val="24"/>
         </w:rPr>
-        <w:t xml:space="preserve"> </w:t>
+        <w:t>v</w:t>
       </w:r>
       <w:r>
         <w:rPr>
@@ -8752,35 +9629,19 @@
           <w:sz w:val="24"/>
           <w:szCs w:val="24"/>
         </w:rPr>
-        <w:t xml:space="preserve">Volatility 3 Framework </w:t>
-      </w:r>
-      <w:r>
+        <w:t>2.28.2</w:t>
+      </w:r>
+    </w:p>
+    <w:p>
+      <w:pPr>
+        <w:jc w:val="both"/>
         <w:rPr>
           <w:rFonts w:ascii="Times New Roman" w:hAnsi="Times New Roman" w:cs="Times New Roman"/>
           <w:sz w:val="24"/>
           <w:szCs w:val="24"/>
         </w:rPr>
-        <w:t>v</w:t>
-      </w:r>
-      <w:r>
-        <w:rPr>
-          <w:rFonts w:ascii="Times New Roman" w:hAnsi="Times New Roman" w:cs="Times New Roman"/>
-          <w:sz w:val="24"/>
-          <w:szCs w:val="24"/>
-        </w:rPr>
-        <w:t>2.28.2</w:t>
-      </w:r>
-    </w:p>
-    <w:p>
-      <w:pPr>
-        <w:jc w:val="both"/>
-        <w:rPr>
-          <w:rFonts w:ascii="Times New Roman" w:hAnsi="Times New Roman" w:cs="Times New Roman"/>
-          <w:sz w:val="24"/>
-          <w:szCs w:val="24"/>
-        </w:rPr>
-      </w:pPr>
-      <w:hyperlink r:id="rId15" w:history="1">
+      </w:pPr>
+      <w:hyperlink r:id="rId16" w:history="1">
         <w:r>
           <w:rPr>
             <w:rStyle w:val="Hyperlink"/>
@@ -8913,7 +9774,7 @@
           <w:szCs w:val="24"/>
         </w:rPr>
       </w:pPr>
-      <w:hyperlink r:id="rId16" w:history="1">
+      <w:hyperlink r:id="rId17" w:history="1">
         <w:r>
           <w:rPr>
             <w:rStyle w:val="Hyperlink"/>
@@ -9062,7 +9923,7 @@
           <w:szCs w:val="24"/>
         </w:rPr>
       </w:pPr>
-      <w:hyperlink r:id="rId17" w:history="1">
+      <w:hyperlink r:id="rId18" w:history="1">
         <w:r>
           <w:rPr>
             <w:rStyle w:val="Hyperlink"/>
@@ -9219,7 +10080,7 @@
           <w:szCs w:val="24"/>
         </w:rPr>
       </w:pPr>
-      <w:hyperlink r:id="rId18" w:history="1">
+      <w:hyperlink r:id="rId19" w:history="1">
         <w:r>
           <w:rPr>
             <w:rStyle w:val="Hyperlink"/>
@@ -9302,64 +10163,48 @@
         <w:t>an</w:t>
       </w:r>
       <w:r>
+        <w:t xml:space="preserve"> integrity score afterwards that can help inform the users decisions on whether or not the image has been manipulated. </w:t>
+      </w:r>
+      <w:r>
+        <w:rPr>
+          <w:highlight w:val="darkYellow"/>
+        </w:rPr>
+        <w:t>I do not know if this tool uses AI or not</w:t>
+      </w:r>
+    </w:p>
+    <w:p>
+      <w:pPr>
+        <w:jc w:val="both"/>
+      </w:pPr>
+      <w:r>
+        <w:t>The version being used is:</w:t>
+      </w:r>
+      <w:r>
+        <w:t xml:space="preserve"> TruFor</w:t>
+      </w:r>
+      <w:r>
         <w:t xml:space="preserve"> </w:t>
       </w:r>
       <w:r>
-        <w:lastRenderedPageBreak/>
-        <w:t xml:space="preserve">integrity score afterwards that can help inform the users decisions on whether or not the image has been manipulated. </w:t>
-      </w:r>
-      <w:r>
-        <w:rPr>
-          <w:highlight w:val="darkYellow"/>
-        </w:rPr>
-        <w:t>I do not know if this tool uses AI or not</w:t>
+        <w:t>commit ae54475df6f41a491d7615100feb19263dec13f7</w:t>
+      </w:r>
+      <w:r>
+        <w:t xml:space="preserve">, </w:t>
+      </w:r>
+      <w:r>
+        <w:t>Date:   Thu May 29 09:46:01 2025 +0200</w:t>
       </w:r>
     </w:p>
     <w:p>
       <w:pPr>
         <w:jc w:val="both"/>
       </w:pPr>
-      <w:r>
-        <w:t>The version being used is:</w:t>
-      </w:r>
-      <w:r>
-        <w:t xml:space="preserve"> TruFor</w:t>
-      </w:r>
-      <w:r>
-        <w:t xml:space="preserve"> </w:t>
-      </w:r>
-      <w:r>
-        <w:t>commit ae54475df6f41a491d7615100feb19263dec13f7</w:t>
-      </w:r>
-      <w:r>
-        <w:t xml:space="preserve">, </w:t>
-      </w:r>
-      <w:r>
-        <w:t>Date:   Thu May 29 09:46:01 2025 +0200</w:t>
-      </w:r>
-    </w:p>
-    <w:p>
-      <w:pPr>
-        <w:jc w:val="both"/>
-      </w:pPr>
-      <w:hyperlink r:id="rId19" w:history="1">
+      <w:hyperlink r:id="rId20" w:history="1">
         <w:r>
           <w:rPr>
             <w:rStyle w:val="Hyperlink"/>
           </w:rPr>
-          <w:t>https://github.com/grip-unina/T</w:t>
-        </w:r>
-        <w:r>
-          <w:rPr>
-            <w:rStyle w:val="Hyperlink"/>
-          </w:rPr>
-          <w:t>r</w:t>
-        </w:r>
-        <w:r>
-          <w:rPr>
-            <w:rStyle w:val="Hyperlink"/>
-          </w:rPr>
-          <w:t>uFor/tree/main</w:t>
+          <w:t>https://github.com/grip-unina/TruFor/tree/main</w:t>
         </w:r>
       </w:hyperlink>
       <w:r>
@@ -9382,6 +10227,7 @@
           <w:sz w:val="24"/>
           <w:szCs w:val="24"/>
         </w:rPr>
+        <w:lastRenderedPageBreak/>
         <w:t>Wire</w:t>
       </w:r>
       <w:r>
@@ -9436,7 +10282,7 @@
       <w:pPr>
         <w:jc w:val="both"/>
       </w:pPr>
-      <w:hyperlink r:id="rId20" w:history="1">
+      <w:hyperlink r:id="rId21" w:history="1">
         <w:r>
           <w:rPr>
             <w:rStyle w:val="Hyperlink"/>
@@ -9490,7 +10336,7 @@
       </w:r>
     </w:p>
     <w:p>
-      <w:hyperlink r:id="rId21" w:history="1">
+      <w:hyperlink r:id="rId22" w:history="1">
         <w:r>
           <w:rPr>
             <w:rStyle w:val="Hyperlink"/>
@@ -9553,7 +10399,7 @@
       </w:r>
     </w:p>
     <w:p>
-      <w:hyperlink r:id="rId22" w:history="1">
+      <w:hyperlink r:id="rId23" w:history="1">
         <w:r>
           <w:rPr>
             <w:rStyle w:val="Hyperlink"/>
@@ -9647,7 +10493,7 @@
         </w:tabs>
         <w:jc w:val="both"/>
       </w:pPr>
-      <w:hyperlink r:id="rId23" w:history="1">
+      <w:hyperlink r:id="rId24" w:history="1">
         <w:r>
           <w:rPr>
             <w:rStyle w:val="Hyperlink"/>
@@ -9675,19 +10521,22 @@
           <w:sz w:val="24"/>
           <w:szCs w:val="24"/>
         </w:rPr>
+        <w:t>Unfold</w:t>
+      </w:r>
+    </w:p>
+    <w:p>
+      <w:pPr>
+        <w:jc w:val="both"/>
+      </w:pPr>
+      <w:r>
+        <w:t xml:space="preserve">Unfold </w:t>
+      </w:r>
+      <w:r>
+        <w:t xml:space="preserve">is a tool that functions by using the volatility3 script in order to run Disk analysis digital forensics, it does this by running a script that invokes a python shell for volatility3 from where you can input the commands to receive the desired outcomes, this application is allegedly packaged with AI functionality however it seems that this is packaged in a manner that requires it to be outsourced to OpenAI or DeepSeek which leads us to </w:t>
+      </w:r>
+      <w:r>
         <w:lastRenderedPageBreak/>
-        <w:t>Unfold</w:t>
-      </w:r>
-    </w:p>
-    <w:p>
-      <w:pPr>
-        <w:jc w:val="both"/>
-      </w:pPr>
-      <w:r>
-        <w:t xml:space="preserve">Unfold </w:t>
-      </w:r>
-      <w:r>
-        <w:t xml:space="preserve">is a tool that functions by using the volatility3 script in order to run Disk analysis digital forensics, it does this by running a script that invokes a python shell for volatility3 from where you can input the commands to receive the desired outcomes, this application is allegedly packaged with AI functionality however it seems that this is packaged in a manner that requires it to be outsourced to OpenAI or DeepSeek which leads us to believe that it is not the most secure tool. </w:t>
+        <w:t xml:space="preserve">believe that it is not the most secure tool. </w:t>
       </w:r>
       <w:r>
         <w:rPr>
@@ -9718,7 +10567,7 @@
       <w:pPr>
         <w:jc w:val="both"/>
       </w:pPr>
-      <w:hyperlink r:id="rId24" w:history="1">
+      <w:hyperlink r:id="rId25" w:history="1">
         <w:r>
           <w:rPr>
             <w:rStyle w:val="Hyperlink"/>
@@ -9768,13 +10617,8 @@
         <w:jc w:val="both"/>
       </w:pPr>
       <w:r>
-        <w:t xml:space="preserve">The version being used </w:t>
-      </w:r>
-      <w:proofErr w:type="gramStart"/>
-      <w:r>
-        <w:t>is:</w:t>
-      </w:r>
-      <w:proofErr w:type="gramEnd"/>
+        <w:t>The version being used is:</w:t>
+      </w:r>
       <w:r>
         <w:t xml:space="preserve"> Autopsy v2.24</w:t>
       </w:r>
@@ -9783,7 +10627,7 @@
       <w:pPr>
         <w:jc w:val="both"/>
       </w:pPr>
-      <w:hyperlink r:id="rId25" w:history="1">
+      <w:hyperlink r:id="rId26" w:history="1">
         <w:r>
           <w:rPr>
             <w:rStyle w:val="Hyperlink"/>
@@ -9805,11 +10649,11 @@
         <w:pStyle w:val="Heading2"/>
         <w:jc w:val="both"/>
       </w:pPr>
-      <w:bookmarkStart w:id="12" w:name="_Toc237963404"/>
+      <w:bookmarkStart w:id="13" w:name="_Toc238027958"/>
       <w:r>
         <w:t>Project budget</w:t>
       </w:r>
-      <w:bookmarkEnd w:id="12"/>
+      <w:bookmarkEnd w:id="13"/>
     </w:p>
     <w:p>
       <w:pPr>
@@ -9854,41 +10698,33 @@
         <w:pStyle w:val="Heading1"/>
         <w:jc w:val="both"/>
       </w:pPr>
-      <w:bookmarkStart w:id="13" w:name="_Toc236665775"/>
-      <w:bookmarkStart w:id="14" w:name="_Toc237963405"/>
+      <w:bookmarkStart w:id="14" w:name="_Toc236665775"/>
+      <w:bookmarkStart w:id="15" w:name="_Toc238027959"/>
       <w:r>
         <w:t>Project Personnel</w:t>
       </w:r>
-      <w:bookmarkEnd w:id="13"/>
       <w:bookmarkEnd w:id="14"/>
+      <w:bookmarkEnd w:id="15"/>
     </w:p>
     <w:p>
       <w:pPr>
         <w:pStyle w:val="Heading2"/>
         <w:jc w:val="both"/>
       </w:pPr>
-      <w:bookmarkStart w:id="15" w:name="_Toc236665776"/>
-      <w:bookmarkStart w:id="16" w:name="_Toc237963406"/>
+      <w:bookmarkStart w:id="16" w:name="_Toc236665776"/>
+      <w:bookmarkStart w:id="17" w:name="_Toc238027960"/>
       <w:r>
         <w:t>Client details including organisation</w:t>
       </w:r>
-      <w:bookmarkEnd w:id="15"/>
       <w:bookmarkEnd w:id="16"/>
+      <w:bookmarkEnd w:id="17"/>
     </w:p>
     <w:p>
       <w:pPr>
         <w:pStyle w:val="TNR"/>
       </w:pPr>
       <w:r>
-        <w:t xml:space="preserve">Geoff Gordon is a staff member of </w:t>
-      </w:r>
-      <w:proofErr w:type="spellStart"/>
-      <w:r>
-        <w:t>WelTec</w:t>
-      </w:r>
-      <w:proofErr w:type="spellEnd"/>
-      <w:r>
-        <w:t>, he provides technical networking expertise in the context of the tertiary environment. He has familiarity, curiosity and deep interest in AI models and their behaviour, as well as their associated hardware/platforms. He is interested in whether AI is has a place in the field of digital forensics.</w:t>
+        <w:t>Geoff Gordon is a staff member of WelTec, he provides technical networking expertise in the context of the tertiary environment. He has familiarity, curiosity and deep interest in AI models and their behaviour, as well as their associated hardware/platforms. He is interested in whether AI is has a place in the field of digital forensics.</w:t>
       </w:r>
     </w:p>
     <w:p>
@@ -9913,14 +10749,13 @@
       <w:pPr>
         <w:pStyle w:val="Heading2"/>
       </w:pPr>
-      <w:bookmarkStart w:id="17" w:name="_Toc236665777"/>
-      <w:bookmarkStart w:id="18" w:name="_Toc237963407"/>
-      <w:r>
-        <w:lastRenderedPageBreak/>
+      <w:bookmarkStart w:id="18" w:name="_Toc236665777"/>
+      <w:bookmarkStart w:id="19" w:name="_Toc238027961"/>
+      <w:r>
         <w:t>Group Members</w:t>
       </w:r>
-      <w:bookmarkEnd w:id="17"/>
       <w:bookmarkEnd w:id="18"/>
+      <w:bookmarkEnd w:id="19"/>
     </w:p>
     <w:p>
       <w:pPr>
@@ -10016,6 +10851,7 @@
               <w:pStyle w:val="TNR"/>
             </w:pPr>
             <w:r>
+              <w:lastRenderedPageBreak/>
               <w:t>Matt Baker</w:t>
             </w:r>
           </w:p>
@@ -10176,13 +11012,13 @@
       <w:pPr>
         <w:pStyle w:val="Heading2"/>
       </w:pPr>
-      <w:bookmarkStart w:id="19" w:name="_Toc236665778"/>
-      <w:bookmarkStart w:id="20" w:name="_Toc237963408"/>
+      <w:bookmarkStart w:id="20" w:name="_Toc236665778"/>
+      <w:bookmarkStart w:id="21" w:name="_Toc238027962"/>
       <w:r>
         <w:t>Project Advisor</w:t>
       </w:r>
-      <w:bookmarkEnd w:id="19"/>
       <w:bookmarkEnd w:id="20"/>
+      <w:bookmarkEnd w:id="21"/>
     </w:p>
     <w:p>
       <w:pPr>
@@ -10196,13 +11032,13 @@
       <w:pPr>
         <w:pStyle w:val="Heading3"/>
       </w:pPr>
-      <w:bookmarkStart w:id="21" w:name="_Toc236665779"/>
-      <w:bookmarkStart w:id="22" w:name="_Toc237963409"/>
+      <w:bookmarkStart w:id="22" w:name="_Toc236665779"/>
+      <w:bookmarkStart w:id="23" w:name="_Toc238027963"/>
       <w:r>
         <w:t>Communication plan</w:t>
       </w:r>
-      <w:bookmarkEnd w:id="21"/>
       <w:bookmarkEnd w:id="22"/>
+      <w:bookmarkEnd w:id="23"/>
     </w:p>
     <w:p>
       <w:pPr>
@@ -10336,13 +11172,8 @@
               <w:pStyle w:val="TNR"/>
             </w:pPr>
             <w:r>
-              <w:t xml:space="preserve">Project advisor: Clement </w:t>
-            </w:r>
-            <w:proofErr w:type="spellStart"/>
-            <w:r>
-              <w:t>Swarnappa</w:t>
-            </w:r>
-            <w:proofErr w:type="spellEnd"/>
+              <w:t>Project advisor: Clement Swarnappa</w:t>
+            </w:r>
           </w:p>
         </w:tc>
         <w:tc>
@@ -10436,15 +11267,7 @@
               <w:pStyle w:val="TNR"/>
             </w:pPr>
             <w:r>
-              <w:t>Olivia-</w:t>
-            </w:r>
-            <w:proofErr w:type="gramStart"/>
-            <w:r>
-              <w:t>hey.hey</w:t>
-            </w:r>
-            <w:proofErr w:type="gramEnd"/>
-            <w:r>
-              <w:t>01</w:t>
+              <w:t>Olivia-hey.hey01</w:t>
             </w:r>
           </w:p>
         </w:tc>
@@ -10549,35 +11372,23 @@
       <w:pPr>
         <w:pStyle w:val="Heading2"/>
       </w:pPr>
-      <w:bookmarkStart w:id="23" w:name="_Toc236665780"/>
-      <w:bookmarkStart w:id="24" w:name="_Toc237963410"/>
+      <w:bookmarkStart w:id="24" w:name="_Toc236665780"/>
+      <w:bookmarkStart w:id="25" w:name="_Toc238027964"/>
       <w:r>
         <w:t xml:space="preserve">General </w:t>
       </w:r>
       <w:r>
         <w:t>Conflict of Interest statement</w:t>
       </w:r>
-      <w:bookmarkEnd w:id="23"/>
       <w:bookmarkEnd w:id="24"/>
+      <w:bookmarkEnd w:id="25"/>
     </w:p>
     <w:p>
       <w:pPr>
         <w:pStyle w:val="TNR"/>
       </w:pPr>
       <w:r>
-        <w:t xml:space="preserve">As our client Geoff Gordon is a member of the </w:t>
-      </w:r>
-      <w:proofErr w:type="spellStart"/>
-      <w:r>
-        <w:t>WelTec</w:t>
-      </w:r>
-      <w:proofErr w:type="spellEnd"/>
-      <w:r>
-        <w:t xml:space="preserve"> staff, his employer is the same as the institution that runs this capstone course, this constitutes a conflict of interest. The prevailing vague familiarity with Geoff </w:t>
-      </w:r>
-      <w:r>
-        <w:lastRenderedPageBreak/>
-        <w:t xml:space="preserve">within the team also means a relationship exists that could compromise the sincerity of </w:t>
+        <w:t xml:space="preserve">As our client Geoff Gordon is a member of the WelTec staff, his employer is the same as the institution that runs this capstone course, this constitutes a conflict of interest. The prevailing vague familiarity with Geoff within the team also means a relationship exists that could compromise the sincerity of </w:t>
       </w:r>
       <w:r>
         <w:t>professional</w:t>
@@ -10653,13 +11464,13 @@
       <w:pPr>
         <w:pStyle w:val="Heading2"/>
       </w:pPr>
-      <w:bookmarkStart w:id="25" w:name="_Toc236665781"/>
-      <w:bookmarkStart w:id="26" w:name="_Toc237963411"/>
+      <w:bookmarkStart w:id="26" w:name="_Toc236665781"/>
+      <w:bookmarkStart w:id="27" w:name="_Toc238027965"/>
       <w:r>
         <w:t>RACI assessment matrix</w:t>
       </w:r>
-      <w:bookmarkEnd w:id="25"/>
       <w:bookmarkEnd w:id="26"/>
+      <w:bookmarkEnd w:id="27"/>
     </w:p>
     <w:p>
       <w:pPr>
@@ -10730,15 +11541,7 @@
               <w:spacing w:after="0"/>
             </w:pPr>
             <w:r>
-              <w:t xml:space="preserve">Clement </w:t>
-            </w:r>
-            <w:proofErr w:type="spellStart"/>
-            <w:r>
-              <w:t>Swarnappa</w:t>
-            </w:r>
-            <w:proofErr w:type="spellEnd"/>
-            <w:r>
-              <w:t xml:space="preserve"> (Advisor)</w:t>
+              <w:t>Clement Swarnappa (Advisor)</w:t>
             </w:r>
           </w:p>
         </w:tc>
@@ -10926,39 +11729,223 @@
                 <w:b/>
                 <w:bCs/>
               </w:rPr>
-              <w:t>Installation/configuration of operating systems and software (</w:t>
-            </w:r>
-            <w:proofErr w:type="spellStart"/>
-            <w:r>
+              <w:t>Installation/configuration of operating systems and software (LMStudio, forensic tools such as volatility/exiftools/foremost)</w:t>
+            </w:r>
+          </w:p>
+        </w:tc>
+        <w:tc>
+          <w:tcPr>
+            <w:tcW w:w="947" w:type="dxa"/>
+            <w:shd w:val="clear" w:color="auto" w:fill="C1F0C7"/>
+          </w:tcPr>
+          <w:p>
+            <w:pPr>
+              <w:pStyle w:val="TNR"/>
+            </w:pPr>
+            <w:r>
+              <w:t>C</w:t>
+            </w:r>
+          </w:p>
+        </w:tc>
+        <w:tc>
+          <w:tcPr>
+            <w:tcW w:w="1283" w:type="dxa"/>
+            <w:shd w:val="clear" w:color="auto" w:fill="C1E4F5" w:themeFill="accent1" w:themeFillTint="33"/>
+          </w:tcPr>
+          <w:p>
+            <w:pPr>
+              <w:pStyle w:val="TNR"/>
+            </w:pPr>
+            <w:r>
+              <w:t>I</w:t>
+            </w:r>
+          </w:p>
+        </w:tc>
+        <w:tc>
+          <w:tcPr>
+            <w:tcW w:w="1176" w:type="dxa"/>
+            <w:shd w:val="clear" w:color="auto" w:fill="C1E4F5" w:themeFill="accent1" w:themeFillTint="33"/>
+          </w:tcPr>
+          <w:p>
+            <w:pPr>
+              <w:pStyle w:val="TNR"/>
+            </w:pPr>
+            <w:r>
+              <w:t>I</w:t>
+            </w:r>
+          </w:p>
+        </w:tc>
+        <w:tc>
+          <w:tcPr>
+            <w:tcW w:w="847" w:type="dxa"/>
+            <w:shd w:val="clear" w:color="auto" w:fill="F49A9A"/>
+          </w:tcPr>
+          <w:p>
+            <w:pPr>
+              <w:pStyle w:val="TNR"/>
+            </w:pPr>
+            <w:r>
+              <w:t>R</w:t>
+            </w:r>
+          </w:p>
+        </w:tc>
+        <w:tc>
+          <w:tcPr>
+            <w:tcW w:w="818" w:type="dxa"/>
+            <w:shd w:val="clear" w:color="auto" w:fill="F4EE9A"/>
+          </w:tcPr>
+          <w:p>
+            <w:pPr>
+              <w:pStyle w:val="TNR"/>
+            </w:pPr>
+            <w:r>
+              <w:t>A</w:t>
+            </w:r>
+          </w:p>
+        </w:tc>
+        <w:tc>
+          <w:tcPr>
+            <w:tcW w:w="883" w:type="dxa"/>
+            <w:shd w:val="clear" w:color="auto" w:fill="F4EE9A"/>
+          </w:tcPr>
+          <w:p>
+            <w:pPr>
+              <w:pStyle w:val="TNR"/>
+            </w:pPr>
+            <w:r>
+              <w:t>A</w:t>
+            </w:r>
+          </w:p>
+        </w:tc>
+      </w:tr>
+      <w:tr>
+        <w:tc>
+          <w:tcPr>
+            <w:tcW w:w="4673" w:type="dxa"/>
+          </w:tcPr>
+          <w:p>
+            <w:pPr>
+              <w:pStyle w:val="TNR"/>
+              <w:jc w:val="left"/>
               <w:rPr>
                 <w:b/>
                 <w:bCs/>
               </w:rPr>
-              <w:t>LMStudio</w:t>
-            </w:r>
-            <w:proofErr w:type="spellEnd"/>
+            </w:pPr>
             <w:r>
               <w:rPr>
                 <w:b/>
                 <w:bCs/>
               </w:rPr>
-              <w:t>, forensic tools such as volatility/</w:t>
-            </w:r>
-            <w:proofErr w:type="spellStart"/>
-            <w:r>
+              <w:t>Acquisition of forensic datasets/disk images for analysis</w:t>
+            </w:r>
+          </w:p>
+        </w:tc>
+        <w:tc>
+          <w:tcPr>
+            <w:tcW w:w="947" w:type="dxa"/>
+            <w:shd w:val="clear" w:color="auto" w:fill="C1E4F5" w:themeFill="accent1" w:themeFillTint="33"/>
+          </w:tcPr>
+          <w:p>
+            <w:pPr>
+              <w:pStyle w:val="TNR"/>
+            </w:pPr>
+            <w:r>
+              <w:t>I</w:t>
+            </w:r>
+          </w:p>
+        </w:tc>
+        <w:tc>
+          <w:tcPr>
+            <w:tcW w:w="1283" w:type="dxa"/>
+            <w:shd w:val="clear" w:color="auto" w:fill="C1E4F5" w:themeFill="accent1" w:themeFillTint="33"/>
+          </w:tcPr>
+          <w:p>
+            <w:pPr>
+              <w:pStyle w:val="TNR"/>
+            </w:pPr>
+            <w:r>
+              <w:t>I</w:t>
+            </w:r>
+          </w:p>
+        </w:tc>
+        <w:tc>
+          <w:tcPr>
+            <w:tcW w:w="1176" w:type="dxa"/>
+            <w:shd w:val="clear" w:color="auto" w:fill="C1F0C7"/>
+          </w:tcPr>
+          <w:p>
+            <w:pPr>
+              <w:pStyle w:val="TNR"/>
+            </w:pPr>
+            <w:r>
+              <w:t>C</w:t>
+            </w:r>
+          </w:p>
+        </w:tc>
+        <w:tc>
+          <w:tcPr>
+            <w:tcW w:w="847" w:type="dxa"/>
+            <w:shd w:val="clear" w:color="auto" w:fill="C1F0C7"/>
+          </w:tcPr>
+          <w:p>
+            <w:pPr>
+              <w:pStyle w:val="TNR"/>
+            </w:pPr>
+            <w:r>
+              <w:t>C</w:t>
+            </w:r>
+          </w:p>
+        </w:tc>
+        <w:tc>
+          <w:tcPr>
+            <w:tcW w:w="818" w:type="dxa"/>
+            <w:shd w:val="clear" w:color="auto" w:fill="F49A9A"/>
+          </w:tcPr>
+          <w:p>
+            <w:pPr>
+              <w:pStyle w:val="TNR"/>
+            </w:pPr>
+            <w:r>
+              <w:t>R</w:t>
+            </w:r>
+          </w:p>
+        </w:tc>
+        <w:tc>
+          <w:tcPr>
+            <w:tcW w:w="883" w:type="dxa"/>
+            <w:shd w:val="clear" w:color="auto" w:fill="C1F0C7"/>
+          </w:tcPr>
+          <w:p>
+            <w:pPr>
+              <w:pStyle w:val="TNR"/>
+            </w:pPr>
+            <w:r>
+              <w:t>C</w:t>
+            </w:r>
+          </w:p>
+        </w:tc>
+      </w:tr>
+      <w:tr>
+        <w:tc>
+          <w:tcPr>
+            <w:tcW w:w="4673" w:type="dxa"/>
+          </w:tcPr>
+          <w:p>
+            <w:pPr>
+              <w:pStyle w:val="TNR"/>
+              <w:jc w:val="left"/>
               <w:rPr>
                 <w:b/>
                 <w:bCs/>
               </w:rPr>
-              <w:t>exiftools</w:t>
-            </w:r>
-            <w:proofErr w:type="spellEnd"/>
+            </w:pPr>
             <w:r>
               <w:rPr>
                 <w:b/>
                 <w:bCs/>
               </w:rPr>
-              <w:t>/foremost)</w:t>
+              <w:t>AI integration with digital forensics tools</w:t>
             </w:r>
           </w:p>
         </w:tc>
@@ -10993,14 +11980,14 @@
         <w:tc>
           <w:tcPr>
             <w:tcW w:w="1176" w:type="dxa"/>
-            <w:shd w:val="clear" w:color="auto" w:fill="C1E4F5" w:themeFill="accent1" w:themeFillTint="33"/>
+            <w:shd w:val="clear" w:color="auto" w:fill="C1F0C7"/>
           </w:tcPr>
           <w:p>
             <w:pPr>
               <w:pStyle w:val="TNR"/>
             </w:pPr>
             <w:r>
-              <w:t>I</w:t>
+              <w:t>C</w:t>
             </w:r>
           </w:p>
         </w:tc>
@@ -11021,6 +12008,114 @@
         <w:tc>
           <w:tcPr>
             <w:tcW w:w="818" w:type="dxa"/>
+            <w:shd w:val="clear" w:color="auto" w:fill="C1F0C7"/>
+          </w:tcPr>
+          <w:p>
+            <w:pPr>
+              <w:pStyle w:val="TNR"/>
+            </w:pPr>
+            <w:r>
+              <w:t>C</w:t>
+            </w:r>
+          </w:p>
+        </w:tc>
+        <w:tc>
+          <w:tcPr>
+            <w:tcW w:w="883" w:type="dxa"/>
+            <w:shd w:val="clear" w:color="auto" w:fill="C1F0C7"/>
+          </w:tcPr>
+          <w:p>
+            <w:pPr>
+              <w:pStyle w:val="TNR"/>
+            </w:pPr>
+            <w:r>
+              <w:t>C</w:t>
+            </w:r>
+          </w:p>
+        </w:tc>
+      </w:tr>
+      <w:tr>
+        <w:tc>
+          <w:tcPr>
+            <w:tcW w:w="4673" w:type="dxa"/>
+          </w:tcPr>
+          <w:p>
+            <w:pPr>
+              <w:pStyle w:val="TNR"/>
+              <w:jc w:val="left"/>
+              <w:rPr>
+                <w:b/>
+                <w:bCs/>
+              </w:rPr>
+            </w:pPr>
+            <w:r>
+              <w:rPr>
+                <w:b/>
+                <w:bCs/>
+              </w:rPr>
+              <w:t>Creation or adaption of a process (CFTT) and metrics with which to objectively assess the efficacy of two or more tools.</w:t>
+            </w:r>
+          </w:p>
+        </w:tc>
+        <w:tc>
+          <w:tcPr>
+            <w:tcW w:w="947" w:type="dxa"/>
+            <w:shd w:val="clear" w:color="auto" w:fill="C1F0C7"/>
+          </w:tcPr>
+          <w:p>
+            <w:pPr>
+              <w:pStyle w:val="TNR"/>
+            </w:pPr>
+            <w:r>
+              <w:t>C</w:t>
+            </w:r>
+          </w:p>
+        </w:tc>
+        <w:tc>
+          <w:tcPr>
+            <w:tcW w:w="1283" w:type="dxa"/>
+            <w:shd w:val="clear" w:color="auto" w:fill="C1F0C7"/>
+          </w:tcPr>
+          <w:p>
+            <w:pPr>
+              <w:pStyle w:val="TNR"/>
+            </w:pPr>
+            <w:r>
+              <w:t>C</w:t>
+            </w:r>
+          </w:p>
+        </w:tc>
+        <w:tc>
+          <w:tcPr>
+            <w:tcW w:w="1176" w:type="dxa"/>
+            <w:shd w:val="clear" w:color="auto" w:fill="F49A9A"/>
+          </w:tcPr>
+          <w:p>
+            <w:pPr>
+              <w:pStyle w:val="TNR"/>
+            </w:pPr>
+            <w:r>
+              <w:t>R</w:t>
+            </w:r>
+          </w:p>
+        </w:tc>
+        <w:tc>
+          <w:tcPr>
+            <w:tcW w:w="847" w:type="dxa"/>
+            <w:shd w:val="clear" w:color="auto" w:fill="F4EE9A"/>
+          </w:tcPr>
+          <w:p>
+            <w:pPr>
+              <w:pStyle w:val="TNR"/>
+            </w:pPr>
+            <w:r>
+              <w:t>A</w:t>
+            </w:r>
+          </w:p>
+        </w:tc>
+        <w:tc>
+          <w:tcPr>
+            <w:tcW w:w="818" w:type="dxa"/>
             <w:shd w:val="clear" w:color="auto" w:fill="F4EE9A"/>
           </w:tcPr>
           <w:p>
@@ -11066,7 +12161,115 @@
                 <w:b/>
                 <w:bCs/>
               </w:rPr>
-              <w:t>Acquisition of forensic datasets/disk images for analysis</w:t>
+              <w:t>Documentation and measuring of results of testing.</w:t>
+            </w:r>
+          </w:p>
+        </w:tc>
+        <w:tc>
+          <w:tcPr>
+            <w:tcW w:w="947" w:type="dxa"/>
+            <w:shd w:val="clear" w:color="auto" w:fill="C1F0C7"/>
+          </w:tcPr>
+          <w:p>
+            <w:pPr>
+              <w:pStyle w:val="TNR"/>
+            </w:pPr>
+            <w:r>
+              <w:t>C</w:t>
+            </w:r>
+          </w:p>
+        </w:tc>
+        <w:tc>
+          <w:tcPr>
+            <w:tcW w:w="1283" w:type="dxa"/>
+            <w:shd w:val="clear" w:color="auto" w:fill="C1F0C7"/>
+          </w:tcPr>
+          <w:p>
+            <w:pPr>
+              <w:pStyle w:val="TNR"/>
+            </w:pPr>
+            <w:r>
+              <w:t>C</w:t>
+            </w:r>
+          </w:p>
+        </w:tc>
+        <w:tc>
+          <w:tcPr>
+            <w:tcW w:w="1176" w:type="dxa"/>
+            <w:shd w:val="clear" w:color="auto" w:fill="C1F0C7"/>
+          </w:tcPr>
+          <w:p>
+            <w:pPr>
+              <w:pStyle w:val="TNR"/>
+            </w:pPr>
+            <w:r>
+              <w:t>C</w:t>
+            </w:r>
+          </w:p>
+        </w:tc>
+        <w:tc>
+          <w:tcPr>
+            <w:tcW w:w="847" w:type="dxa"/>
+            <w:shd w:val="clear" w:color="auto" w:fill="F49A9A"/>
+          </w:tcPr>
+          <w:p>
+            <w:pPr>
+              <w:pStyle w:val="TNR"/>
+            </w:pPr>
+            <w:r>
+              <w:t>R</w:t>
+            </w:r>
+          </w:p>
+        </w:tc>
+        <w:tc>
+          <w:tcPr>
+            <w:tcW w:w="818" w:type="dxa"/>
+            <w:shd w:val="clear" w:color="auto" w:fill="F49A9A"/>
+          </w:tcPr>
+          <w:p>
+            <w:pPr>
+              <w:pStyle w:val="TNR"/>
+            </w:pPr>
+            <w:r>
+              <w:t>R</w:t>
+            </w:r>
+          </w:p>
+        </w:tc>
+        <w:tc>
+          <w:tcPr>
+            <w:tcW w:w="883" w:type="dxa"/>
+            <w:shd w:val="clear" w:color="auto" w:fill="F49A9A"/>
+          </w:tcPr>
+          <w:p>
+            <w:pPr>
+              <w:pStyle w:val="TNR"/>
+            </w:pPr>
+            <w:r>
+              <w:t>R</w:t>
+            </w:r>
+          </w:p>
+        </w:tc>
+      </w:tr>
+      <w:tr>
+        <w:tc>
+          <w:tcPr>
+            <w:tcW w:w="4673" w:type="dxa"/>
+          </w:tcPr>
+          <w:p>
+            <w:pPr>
+              <w:pStyle w:val="TNR"/>
+              <w:jc w:val="left"/>
+              <w:rPr>
+                <w:b/>
+                <w:bCs/>
+              </w:rPr>
+            </w:pPr>
+            <w:r>
+              <w:rPr>
+                <w:b/>
+                <w:bCs/>
+              </w:rPr>
+              <w:t>Testing in multiple evidence environments (mobile/desktop) on multiple types of target data (credentials, confidential information, intrusion indicators, suspicious processes/media)</w:t>
             </w:r>
           </w:p>
         </w:tc>
@@ -11115,14 +12318,14 @@
         <w:tc>
           <w:tcPr>
             <w:tcW w:w="847" w:type="dxa"/>
-            <w:shd w:val="clear" w:color="auto" w:fill="C1F0C7"/>
+            <w:shd w:val="clear" w:color="auto" w:fill="F49A9A"/>
           </w:tcPr>
           <w:p>
             <w:pPr>
               <w:pStyle w:val="TNR"/>
             </w:pPr>
             <w:r>
-              <w:t>C</w:t>
+              <w:t>R</w:t>
             </w:r>
           </w:p>
         </w:tc>
@@ -11174,331 +12377,15 @@
                 <w:b/>
                 <w:bCs/>
               </w:rPr>
-              <w:t>AI integration with digital forensics tools</w:t>
-            </w:r>
-          </w:p>
-        </w:tc>
-        <w:tc>
-          <w:tcPr>
-            <w:tcW w:w="947" w:type="dxa"/>
-            <w:shd w:val="clear" w:color="auto" w:fill="C1F0C7"/>
-          </w:tcPr>
-          <w:p>
-            <w:pPr>
-              <w:pStyle w:val="TNR"/>
-            </w:pPr>
-            <w:r>
-              <w:t>C</w:t>
-            </w:r>
-          </w:p>
-        </w:tc>
-        <w:tc>
-          <w:tcPr>
-            <w:tcW w:w="1283" w:type="dxa"/>
-            <w:shd w:val="clear" w:color="auto" w:fill="C1E4F5" w:themeFill="accent1" w:themeFillTint="33"/>
-          </w:tcPr>
-          <w:p>
-            <w:pPr>
-              <w:pStyle w:val="TNR"/>
-            </w:pPr>
-            <w:r>
-              <w:t>I</w:t>
-            </w:r>
-          </w:p>
-        </w:tc>
-        <w:tc>
-          <w:tcPr>
-            <w:tcW w:w="1176" w:type="dxa"/>
-            <w:shd w:val="clear" w:color="auto" w:fill="C1F0C7"/>
-          </w:tcPr>
-          <w:p>
-            <w:pPr>
-              <w:pStyle w:val="TNR"/>
-            </w:pPr>
-            <w:r>
-              <w:t>C</w:t>
-            </w:r>
-          </w:p>
-        </w:tc>
-        <w:tc>
-          <w:tcPr>
-            <w:tcW w:w="847" w:type="dxa"/>
-            <w:shd w:val="clear" w:color="auto" w:fill="F49A9A"/>
-          </w:tcPr>
-          <w:p>
-            <w:pPr>
-              <w:pStyle w:val="TNR"/>
-            </w:pPr>
-            <w:r>
-              <w:t>R</w:t>
-            </w:r>
-          </w:p>
-        </w:tc>
-        <w:tc>
-          <w:tcPr>
-            <w:tcW w:w="818" w:type="dxa"/>
-            <w:shd w:val="clear" w:color="auto" w:fill="C1F0C7"/>
-          </w:tcPr>
-          <w:p>
-            <w:pPr>
-              <w:pStyle w:val="TNR"/>
-            </w:pPr>
-            <w:r>
-              <w:t>C</w:t>
-            </w:r>
-          </w:p>
-        </w:tc>
-        <w:tc>
-          <w:tcPr>
-            <w:tcW w:w="883" w:type="dxa"/>
-            <w:shd w:val="clear" w:color="auto" w:fill="C1F0C7"/>
-          </w:tcPr>
-          <w:p>
-            <w:pPr>
-              <w:pStyle w:val="TNR"/>
-            </w:pPr>
-            <w:r>
-              <w:t>C</w:t>
-            </w:r>
-          </w:p>
-        </w:tc>
-      </w:tr>
-      <w:tr>
-        <w:tc>
-          <w:tcPr>
-            <w:tcW w:w="4673" w:type="dxa"/>
-          </w:tcPr>
-          <w:p>
-            <w:pPr>
-              <w:pStyle w:val="TNR"/>
-              <w:jc w:val="left"/>
+              <w:t xml:space="preserve">Design a consistent test environment, ensuring all variables are the same and </w:t>
+            </w:r>
+            <w:r>
               <w:rPr>
                 <w:b/>
                 <w:bCs/>
               </w:rPr>
-            </w:pPr>
-            <w:r>
-              <w:rPr>
-                <w:b/>
-                <w:bCs/>
-              </w:rPr>
-              <w:t>Creation or adaption of a process (CFTT) and metrics with which to objectively assess the efficacy of two or more tools.</w:t>
-            </w:r>
-          </w:p>
-        </w:tc>
-        <w:tc>
-          <w:tcPr>
-            <w:tcW w:w="947" w:type="dxa"/>
-            <w:shd w:val="clear" w:color="auto" w:fill="C1F0C7"/>
-          </w:tcPr>
-          <w:p>
-            <w:pPr>
-              <w:pStyle w:val="TNR"/>
-            </w:pPr>
-            <w:r>
-              <w:t>C</w:t>
-            </w:r>
-          </w:p>
-        </w:tc>
-        <w:tc>
-          <w:tcPr>
-            <w:tcW w:w="1283" w:type="dxa"/>
-            <w:shd w:val="clear" w:color="auto" w:fill="C1F0C7"/>
-          </w:tcPr>
-          <w:p>
-            <w:pPr>
-              <w:pStyle w:val="TNR"/>
-            </w:pPr>
-            <w:r>
-              <w:t>C</w:t>
-            </w:r>
-          </w:p>
-        </w:tc>
-        <w:tc>
-          <w:tcPr>
-            <w:tcW w:w="1176" w:type="dxa"/>
-            <w:shd w:val="clear" w:color="auto" w:fill="F49A9A"/>
-          </w:tcPr>
-          <w:p>
-            <w:pPr>
-              <w:pStyle w:val="TNR"/>
-            </w:pPr>
-            <w:r>
-              <w:t>R</w:t>
-            </w:r>
-          </w:p>
-        </w:tc>
-        <w:tc>
-          <w:tcPr>
-            <w:tcW w:w="847" w:type="dxa"/>
-            <w:shd w:val="clear" w:color="auto" w:fill="F4EE9A"/>
-          </w:tcPr>
-          <w:p>
-            <w:pPr>
-              <w:pStyle w:val="TNR"/>
-            </w:pPr>
-            <w:r>
-              <w:t>A</w:t>
-            </w:r>
-          </w:p>
-        </w:tc>
-        <w:tc>
-          <w:tcPr>
-            <w:tcW w:w="818" w:type="dxa"/>
-            <w:shd w:val="clear" w:color="auto" w:fill="F4EE9A"/>
-          </w:tcPr>
-          <w:p>
-            <w:pPr>
-              <w:pStyle w:val="TNR"/>
-            </w:pPr>
-            <w:r>
-              <w:t>A</w:t>
-            </w:r>
-          </w:p>
-        </w:tc>
-        <w:tc>
-          <w:tcPr>
-            <w:tcW w:w="883" w:type="dxa"/>
-            <w:shd w:val="clear" w:color="auto" w:fill="F4EE9A"/>
-          </w:tcPr>
-          <w:p>
-            <w:pPr>
-              <w:pStyle w:val="TNR"/>
-            </w:pPr>
-            <w:r>
-              <w:t>A</w:t>
-            </w:r>
-          </w:p>
-        </w:tc>
-      </w:tr>
-      <w:tr>
-        <w:tc>
-          <w:tcPr>
-            <w:tcW w:w="4673" w:type="dxa"/>
-          </w:tcPr>
-          <w:p>
-            <w:pPr>
-              <w:pStyle w:val="TNR"/>
-              <w:jc w:val="left"/>
-              <w:rPr>
-                <w:b/>
-                <w:bCs/>
-              </w:rPr>
-            </w:pPr>
-            <w:r>
-              <w:rPr>
-                <w:b/>
-                <w:bCs/>
-              </w:rPr>
-              <w:t>Documentation and measuring of results of testing.</w:t>
-            </w:r>
-          </w:p>
-        </w:tc>
-        <w:tc>
-          <w:tcPr>
-            <w:tcW w:w="947" w:type="dxa"/>
-            <w:shd w:val="clear" w:color="auto" w:fill="C1F0C7"/>
-          </w:tcPr>
-          <w:p>
-            <w:pPr>
-              <w:pStyle w:val="TNR"/>
-            </w:pPr>
-            <w:r>
-              <w:t>C</w:t>
-            </w:r>
-          </w:p>
-        </w:tc>
-        <w:tc>
-          <w:tcPr>
-            <w:tcW w:w="1283" w:type="dxa"/>
-            <w:shd w:val="clear" w:color="auto" w:fill="C1F0C7"/>
-          </w:tcPr>
-          <w:p>
-            <w:pPr>
-              <w:pStyle w:val="TNR"/>
-            </w:pPr>
-            <w:r>
-              <w:t>C</w:t>
-            </w:r>
-          </w:p>
-        </w:tc>
-        <w:tc>
-          <w:tcPr>
-            <w:tcW w:w="1176" w:type="dxa"/>
-            <w:shd w:val="clear" w:color="auto" w:fill="C1F0C7"/>
-          </w:tcPr>
-          <w:p>
-            <w:pPr>
-              <w:pStyle w:val="TNR"/>
-            </w:pPr>
-            <w:r>
-              <w:t>C</w:t>
-            </w:r>
-          </w:p>
-        </w:tc>
-        <w:tc>
-          <w:tcPr>
-            <w:tcW w:w="847" w:type="dxa"/>
-            <w:shd w:val="clear" w:color="auto" w:fill="F49A9A"/>
-          </w:tcPr>
-          <w:p>
-            <w:pPr>
-              <w:pStyle w:val="TNR"/>
-            </w:pPr>
-            <w:r>
-              <w:t>R</w:t>
-            </w:r>
-          </w:p>
-        </w:tc>
-        <w:tc>
-          <w:tcPr>
-            <w:tcW w:w="818" w:type="dxa"/>
-            <w:shd w:val="clear" w:color="auto" w:fill="F49A9A"/>
-          </w:tcPr>
-          <w:p>
-            <w:pPr>
-              <w:pStyle w:val="TNR"/>
-            </w:pPr>
-            <w:r>
-              <w:t>R</w:t>
-            </w:r>
-          </w:p>
-        </w:tc>
-        <w:tc>
-          <w:tcPr>
-            <w:tcW w:w="883" w:type="dxa"/>
-            <w:shd w:val="clear" w:color="auto" w:fill="F49A9A"/>
-          </w:tcPr>
-          <w:p>
-            <w:pPr>
-              <w:pStyle w:val="TNR"/>
-            </w:pPr>
-            <w:r>
-              <w:t>R</w:t>
-            </w:r>
-          </w:p>
-        </w:tc>
-      </w:tr>
-      <w:tr>
-        <w:tc>
-          <w:tcPr>
-            <w:tcW w:w="4673" w:type="dxa"/>
-          </w:tcPr>
-          <w:p>
-            <w:pPr>
-              <w:pStyle w:val="TNR"/>
-              <w:jc w:val="left"/>
-              <w:rPr>
-                <w:b/>
-                <w:bCs/>
-              </w:rPr>
-            </w:pPr>
-            <w:r>
-              <w:rPr>
-                <w:b/>
-                <w:bCs/>
-              </w:rPr>
-              <w:t>Testing in multiple evidence environments (mobile/desktop) on multiple types of target data (credentials, confidential information, intrusion indicators, suspicious processes/media)</w:t>
+              <w:lastRenderedPageBreak/>
+              <w:t xml:space="preserve">that available processing power is consistent before testing. </w:t>
             </w:r>
           </w:p>
         </w:tc>
@@ -11512,115 +12399,7 @@
               <w:pStyle w:val="TNR"/>
             </w:pPr>
             <w:r>
-              <w:t>I</w:t>
-            </w:r>
-          </w:p>
-        </w:tc>
-        <w:tc>
-          <w:tcPr>
-            <w:tcW w:w="1283" w:type="dxa"/>
-            <w:shd w:val="clear" w:color="auto" w:fill="C1E4F5" w:themeFill="accent1" w:themeFillTint="33"/>
-          </w:tcPr>
-          <w:p>
-            <w:pPr>
-              <w:pStyle w:val="TNR"/>
-            </w:pPr>
-            <w:r>
-              <w:t>I</w:t>
-            </w:r>
-          </w:p>
-        </w:tc>
-        <w:tc>
-          <w:tcPr>
-            <w:tcW w:w="1176" w:type="dxa"/>
-            <w:shd w:val="clear" w:color="auto" w:fill="C1F0C7"/>
-          </w:tcPr>
-          <w:p>
-            <w:pPr>
-              <w:pStyle w:val="TNR"/>
-            </w:pPr>
-            <w:r>
-              <w:t>C</w:t>
-            </w:r>
-          </w:p>
-        </w:tc>
-        <w:tc>
-          <w:tcPr>
-            <w:tcW w:w="847" w:type="dxa"/>
-            <w:shd w:val="clear" w:color="auto" w:fill="F49A9A"/>
-          </w:tcPr>
-          <w:p>
-            <w:pPr>
-              <w:pStyle w:val="TNR"/>
-            </w:pPr>
-            <w:r>
-              <w:t>R</w:t>
-            </w:r>
-          </w:p>
-        </w:tc>
-        <w:tc>
-          <w:tcPr>
-            <w:tcW w:w="818" w:type="dxa"/>
-            <w:shd w:val="clear" w:color="auto" w:fill="F49A9A"/>
-          </w:tcPr>
-          <w:p>
-            <w:pPr>
-              <w:pStyle w:val="TNR"/>
-            </w:pPr>
-            <w:r>
-              <w:t>R</w:t>
-            </w:r>
-          </w:p>
-        </w:tc>
-        <w:tc>
-          <w:tcPr>
-            <w:tcW w:w="883" w:type="dxa"/>
-            <w:shd w:val="clear" w:color="auto" w:fill="C1F0C7"/>
-          </w:tcPr>
-          <w:p>
-            <w:pPr>
-              <w:pStyle w:val="TNR"/>
-            </w:pPr>
-            <w:r>
-              <w:t>C</w:t>
-            </w:r>
-          </w:p>
-        </w:tc>
-      </w:tr>
-      <w:tr>
-        <w:tc>
-          <w:tcPr>
-            <w:tcW w:w="4673" w:type="dxa"/>
-          </w:tcPr>
-          <w:p>
-            <w:pPr>
-              <w:pStyle w:val="TNR"/>
-              <w:jc w:val="left"/>
-              <w:rPr>
-                <w:b/>
-                <w:bCs/>
-              </w:rPr>
-            </w:pPr>
-            <w:r>
-              <w:rPr>
-                <w:b/>
-                <w:bCs/>
-              </w:rPr>
               <w:lastRenderedPageBreak/>
-              <w:t xml:space="preserve">Design a consistent test environment, ensuring all variables are the same and that available processing power is consistent before testing. </w:t>
-            </w:r>
-          </w:p>
-        </w:tc>
-        <w:tc>
-          <w:tcPr>
-            <w:tcW w:w="947" w:type="dxa"/>
-            <w:shd w:val="clear" w:color="auto" w:fill="C1E4F5" w:themeFill="accent1" w:themeFillTint="33"/>
-          </w:tcPr>
-          <w:p>
-            <w:pPr>
-              <w:pStyle w:val="TNR"/>
-            </w:pPr>
-            <w:r>
               <w:t>I</w:t>
             </w:r>
           </w:p>
@@ -11723,14 +12502,14 @@
       <w:pPr>
         <w:pStyle w:val="Heading1"/>
       </w:pPr>
-      <w:bookmarkStart w:id="27" w:name="_Toc237963412"/>
+      <w:bookmarkStart w:id="28" w:name="_Toc238027966"/>
       <w:r>
         <w:t>P</w:t>
       </w:r>
       <w:r>
         <w:t>roject timeline and milestones</w:t>
       </w:r>
-      <w:bookmarkEnd w:id="27"/>
+      <w:bookmarkEnd w:id="28"/>
     </w:p>
     <w:p>
       <w:pPr>
@@ -11846,7 +12625,6 @@
               <w:rPr>
                 <w:rFonts w:cs="Arial"/>
               </w:rPr>
-              <w:lastRenderedPageBreak/>
               <w:t>Mid project proposal thing</w:t>
             </w:r>
           </w:p>
@@ -11880,6 +12658,7 @@
               <w:rPr>
                 <w:rFonts w:cs="Arial"/>
               </w:rPr>
+              <w:lastRenderedPageBreak/>
               <w:t>Client Demo (client)</w:t>
             </w:r>
           </w:p>
@@ -12022,11 +12801,11 @@
       <w:pPr>
         <w:pStyle w:val="Heading1"/>
       </w:pPr>
-      <w:bookmarkStart w:id="28" w:name="_Toc237963413"/>
+      <w:bookmarkStart w:id="29" w:name="_Toc238027967"/>
       <w:r>
         <w:t>Project Risk Analysis</w:t>
       </w:r>
-      <w:bookmarkEnd w:id="28"/>
+      <w:bookmarkEnd w:id="29"/>
     </w:p>
     <w:tbl>
       <w:tblPr>
@@ -12853,9 +13632,6 @@
             </w:r>
             <w:r>
               <w:br/>
-            </w:r>
-            <w:r>
-              <w:lastRenderedPageBreak/>
               <w:t>Break work into set milestones with internal deadlines.</w:t>
             </w:r>
           </w:p>
@@ -13547,15 +14323,7 @@
               <w:pStyle w:val="TNR"/>
             </w:pPr>
             <w:r>
-              <w:t xml:space="preserve">Report to </w:t>
-            </w:r>
-            <w:proofErr w:type="spellStart"/>
-            <w:r>
-              <w:t>WelTec</w:t>
-            </w:r>
-            <w:proofErr w:type="spellEnd"/>
-            <w:r>
-              <w:t xml:space="preserve"> and police. Contact client, advisor, and possibly coordinator for further steps.</w:t>
+              <w:t>Report to WelTec and police. Contact client, advisor, and possibly coordinator for further steps.</w:t>
             </w:r>
           </w:p>
         </w:tc>
@@ -13845,7 +14613,7 @@
     <w:p/>
     <w:p/>
     <w:p/>
-    <w:bookmarkStart w:id="29" w:name="_Toc237963414" w:displacedByCustomXml="next"/>
+    <w:bookmarkStart w:id="30" w:name="_Toc238027968" w:displacedByCustomXml="next"/>
     <w:sdt>
       <w:sdtPr>
         <w:rPr>
@@ -13880,19 +14648,26 @@
           <w:r>
             <w:t>References</w:t>
           </w:r>
-          <w:bookmarkEnd w:id="29"/>
+          <w:bookmarkEnd w:id="30"/>
         </w:p>
         <w:sdt>
           <w:sdtPr>
+            <w:rPr>
+              <w:rFonts w:ascii="Times New Roman" w:hAnsi="Times New Roman"/>
+              <w:sz w:val="24"/>
+              <w:lang w:val="en-NZ"/>
+            </w:rPr>
             <w:id w:val="-573587230"/>
             <w:bibliography/>
           </w:sdtPr>
           <w:sdtContent>
             <w:p>
               <w:pPr>
-                <w:pStyle w:val="TNR"/>
+                <w:pStyle w:val="Bibliography"/>
+                <w:ind w:left="720" w:hanging="720"/>
                 <w:rPr>
                   <w:noProof/>
+                  <w:sz w:val="24"/>
                   <w:szCs w:val="24"/>
                 </w:rPr>
               </w:pPr>
@@ -13905,6 +14680,35 @@
               <w:r>
                 <w:fldChar w:fldCharType="separate"/>
               </w:r>
+              <w:r>
+                <w:rPr>
+                  <w:noProof/>
+                </w:rPr>
+                <w:t xml:space="preserve">Maxim Chernyshev, Baig, Z., Naeem Syed, Robin Doss, &amp; Shore, M. (2026, October 26). </w:t>
+              </w:r>
+              <w:r>
+                <w:rPr>
+                  <w:i/>
+                  <w:iCs/>
+                  <w:noProof/>
+                </w:rPr>
+                <w:t>Large language models in digital forensics: capabilities, challenges and future directions</w:t>
+              </w:r>
+              <w:r>
+                <w:rPr>
+                  <w:noProof/>
+                </w:rPr>
+                <w:t>. Retrieved from https://www.sciencedirect.com/science/article/pii/S2666281725001830#fig0010</w:t>
+              </w:r>
+            </w:p>
+            <w:p>
+              <w:pPr>
+                <w:pStyle w:val="Bibliography"/>
+                <w:ind w:left="720" w:hanging="720"/>
+                <w:rPr>
+                  <w:noProof/>
+                </w:rPr>
+              </w:pPr>
               <w:r>
                 <w:rPr>
                   <w:noProof/>
@@ -13928,7 +14732,37 @@
             </w:p>
             <w:p>
               <w:pPr>
-                <w:pStyle w:val="TNR"/>
+                <w:pStyle w:val="Bibliography"/>
+                <w:ind w:left="720" w:hanging="720"/>
+                <w:rPr>
+                  <w:noProof/>
+                </w:rPr>
+              </w:pPr>
+              <w:r>
+                <w:rPr>
+                  <w:noProof/>
+                </w:rPr>
+                <w:t xml:space="preserve">PECB. (n.d.). </w:t>
+              </w:r>
+              <w:r>
+                <w:rPr>
+                  <w:i/>
+                  <w:iCs/>
+                  <w:noProof/>
+                </w:rPr>
+                <w:t>Certified Digital Forensics Examiner – Training Course</w:t>
+              </w:r>
+              <w:r>
+                <w:rPr>
+                  <w:noProof/>
+                </w:rPr>
+                <w:t>. Retrieved from PECB: https://pecb.com/en/education-and-certification-for-individuals/certified-digital-forensics-examiner#first</w:t>
+              </w:r>
+            </w:p>
+            <w:p>
+              <w:pPr>
+                <w:pStyle w:val="Bibliography"/>
+                <w:ind w:left="720" w:hanging="720"/>
                 <w:rPr>
                   <w:noProof/>
                 </w:rPr>
@@ -13956,7 +14790,8 @@
             </w:p>
             <w:p>
               <w:pPr>
-                <w:pStyle w:val="TNR"/>
+                <w:pStyle w:val="Bibliography"/>
+                <w:ind w:left="720" w:hanging="720"/>
                 <w:rPr>
                   <w:noProof/>
                 </w:rPr>
@@ -14027,7 +14862,7 @@
           <w:lang w:val="en-NZ"/>
         </w:rPr>
       </w:pPr>
-      <w:hyperlink r:id="rId26" w:history="1">
+      <w:hyperlink r:id="rId27" w:history="1">
         <w:r>
           <w:rPr>
             <w:rStyle w:val="Hyperlink"/>
@@ -14052,7 +14887,7 @@
           <w:lang w:val="en-NZ"/>
         </w:rPr>
       </w:pPr>
-      <w:hyperlink r:id="rId27" w:history="1">
+      <w:hyperlink r:id="rId28" w:history="1">
         <w:r>
           <w:rPr>
             <w:rStyle w:val="Hyperlink"/>
@@ -14077,7 +14912,7 @@
           <w:lang w:val="en-NZ"/>
         </w:rPr>
       </w:pPr>
-      <w:hyperlink r:id="rId28" w:history="1">
+      <w:hyperlink r:id="rId29" w:history="1">
         <w:r>
           <w:rPr>
             <w:rStyle w:val="Hyperlink"/>
@@ -14102,7 +14937,7 @@
           <w:lang w:val="en-NZ"/>
         </w:rPr>
       </w:pPr>
-      <w:hyperlink r:id="rId29" w:history="1">
+      <w:hyperlink r:id="rId30" w:history="1">
         <w:r>
           <w:rPr>
             <w:rStyle w:val="Hyperlink"/>
@@ -14120,7 +14955,7 @@
           <w:lang w:val="en-NZ"/>
         </w:rPr>
       </w:pPr>
-      <w:hyperlink r:id="rId30" w:anchor="about-kali-linux" w:history="1">
+      <w:hyperlink r:id="rId31" w:anchor="about-kali-linux" w:history="1">
         <w:r>
           <w:rPr>
             <w:rStyle w:val="Hyperlink"/>
@@ -14145,7 +14980,7 @@
           <w:lang w:val="en-NZ"/>
         </w:rPr>
       </w:pPr>
-      <w:hyperlink r:id="rId31" w:history="1">
+      <w:hyperlink r:id="rId32" w:history="1">
         <w:r>
           <w:rPr>
             <w:rStyle w:val="Hyperlink"/>
@@ -14176,7 +15011,7 @@
           <w:lang w:val="en-NZ"/>
         </w:rPr>
       </w:pPr>
-      <w:hyperlink r:id="rId32" w:history="1">
+      <w:hyperlink r:id="rId33" w:history="1">
         <w:r>
           <w:rPr>
             <w:rStyle w:val="Hyperlink"/>
@@ -14295,21 +15130,21 @@
       <w:pPr>
         <w:pStyle w:val="Heading1"/>
       </w:pPr>
-      <w:bookmarkStart w:id="30" w:name="_Toc237963415"/>
+      <w:bookmarkStart w:id="31" w:name="_Toc238027969"/>
       <w:r>
         <w:t>Appendices</w:t>
       </w:r>
-      <w:bookmarkEnd w:id="30"/>
+      <w:bookmarkEnd w:id="31"/>
     </w:p>
     <w:p>
       <w:pPr>
         <w:pStyle w:val="Heading2"/>
       </w:pPr>
-      <w:bookmarkStart w:id="31" w:name="_Toc237963416"/>
+      <w:bookmarkStart w:id="32" w:name="_Toc238027970"/>
       <w:r>
         <w:t>Appendix A</w:t>
       </w:r>
-      <w:bookmarkEnd w:id="31"/>
+      <w:bookmarkEnd w:id="32"/>
     </w:p>
     <w:p>
       <w:pPr>
@@ -14344,7 +15179,7 @@
                     <pic:cNvPicPr/>
                   </pic:nvPicPr>
                   <pic:blipFill>
-                    <a:blip r:embed="rId33"/>
+                    <a:blip r:embed="rId34"/>
                     <a:stretch>
                       <a:fillRect/>
                     </a:stretch>
@@ -14388,7 +15223,7 @@
         <w:rPr>
           <w:noProof/>
         </w:rPr>
-        <w:t>1</w:t>
+        <w:t>2</w:t>
       </w:r>
       <w:r>
         <w:fldChar w:fldCharType="end"/>
@@ -14539,13 +15374,83 @@
     </w:p>
     <w:p>
       <w:pPr>
+        <w:rPr>
+          <w:lang w:val="en-NZ"/>
+        </w:rPr>
+      </w:pPr>
+    </w:p>
+    <w:p>
+      <w:pPr>
+        <w:rPr>
+          <w:lang w:val="en-NZ"/>
+        </w:rPr>
+      </w:pPr>
+    </w:p>
+    <w:p>
+      <w:pPr>
+        <w:rPr>
+          <w:lang w:val="en-NZ"/>
+        </w:rPr>
+      </w:pPr>
+    </w:p>
+    <w:p>
+      <w:pPr>
+        <w:rPr>
+          <w:lang w:val="en-NZ"/>
+        </w:rPr>
+      </w:pPr>
+    </w:p>
+    <w:p>
+      <w:pPr>
+        <w:rPr>
+          <w:lang w:val="en-NZ"/>
+        </w:rPr>
+      </w:pPr>
+    </w:p>
+    <w:p>
+      <w:pPr>
+        <w:rPr>
+          <w:lang w:val="en-NZ"/>
+        </w:rPr>
+      </w:pPr>
+    </w:p>
+    <w:p>
+      <w:pPr>
+        <w:rPr>
+          <w:lang w:val="en-NZ"/>
+        </w:rPr>
+      </w:pPr>
+    </w:p>
+    <w:p>
+      <w:pPr>
+        <w:rPr>
+          <w:lang w:val="en-NZ"/>
+        </w:rPr>
+      </w:pPr>
+    </w:p>
+    <w:p>
+      <w:pPr>
+        <w:rPr>
+          <w:lang w:val="en-NZ"/>
+        </w:rPr>
+      </w:pPr>
+    </w:p>
+    <w:p>
+      <w:pPr>
+        <w:rPr>
+          <w:lang w:val="en-NZ"/>
+        </w:rPr>
+      </w:pPr>
+    </w:p>
+    <w:p>
+      <w:pPr>
         <w:pStyle w:val="Heading2"/>
       </w:pPr>
-      <w:bookmarkStart w:id="32" w:name="_Toc237963417"/>
+      <w:bookmarkStart w:id="33" w:name="_Toc238027971"/>
       <w:r>
         <w:t>Appendix B</w:t>
       </w:r>
-      <w:bookmarkEnd w:id="32"/>
+      <w:bookmarkEnd w:id="33"/>
     </w:p>
     <w:p>
       <w:pPr>
@@ -14702,11 +15607,11 @@
         <w:pStyle w:val="Heading1"/>
         <w:ind w:left="279"/>
       </w:pPr>
-      <w:bookmarkStart w:id="33" w:name="_Toc237963418"/>
+      <w:bookmarkStart w:id="34" w:name="_Toc238027972"/>
       <w:r>
         <w:t>The Parties</w:t>
       </w:r>
-      <w:bookmarkEnd w:id="33"/>
+      <w:bookmarkEnd w:id="34"/>
       <w:r>
         <w:t xml:space="preserve"> </w:t>
       </w:r>
@@ -14739,15 +15644,7 @@
         <w:jc w:val="both"/>
       </w:pPr>
       <w:r>
-        <w:t xml:space="preserve">Whitireia and </w:t>
-      </w:r>
-      <w:proofErr w:type="spellStart"/>
-      <w:r>
-        <w:t>Weltec</w:t>
-      </w:r>
-      <w:proofErr w:type="spellEnd"/>
-      <w:r>
-        <w:t xml:space="preserve"> New Zealand School of Innovation, Design and Technology </w:t>
+        <w:t xml:space="preserve">Whitireia and Weltec New Zealand School of Innovation, Design and Technology </w:t>
       </w:r>
     </w:p>
     <w:p>
@@ -14788,6 +15685,7 @@
         <w:rPr>
           <w:rFonts w:ascii="Calibri" w:eastAsia="Calibri" w:hAnsi="Calibri" w:cs="Calibri"/>
         </w:rPr>
+        <w:lastRenderedPageBreak/>
         <w:t xml:space="preserve">              </w:t>
       </w:r>
       <w:r>
@@ -14834,15 +15732,7 @@
         <w:jc w:val="both"/>
       </w:pPr>
       <w:r>
-        <w:t xml:space="preserve">As part of an established course of study at the Faculty, Bachelor of Information Technology students take a course module IT7x01, in which the </w:t>
-      </w:r>
-      <w:proofErr w:type="gramStart"/>
-      <w:r>
-        <w:t>Student</w:t>
-      </w:r>
-      <w:proofErr w:type="gramEnd"/>
-      <w:r>
-        <w:t xml:space="preserve">(s) completes a project (“the Project”) with the Organisation on the basis set out in this Agreement. </w:t>
+        <w:t xml:space="preserve">As part of an established course of study at the Faculty, Bachelor of Information Technology students take a course module IT7x01, in which the Student(s) completes a project (“the Project”) with the Organisation on the basis set out in this Agreement. </w:t>
       </w:r>
     </w:p>
     <w:p>
@@ -14856,15 +15746,7 @@
         <w:jc w:val="both"/>
       </w:pPr>
       <w:r>
-        <w:t xml:space="preserve">The Organisation agrees to allow the </w:t>
-      </w:r>
-      <w:proofErr w:type="gramStart"/>
-      <w:r>
-        <w:t>Student</w:t>
-      </w:r>
-      <w:proofErr w:type="gramEnd"/>
-      <w:r>
-        <w:t xml:space="preserve">(s) access to its premises if needed to undertake that Project on the basis set out in this Agreement. </w:t>
+        <w:t xml:space="preserve">The Organisation agrees to allow the Student(s) access to its premises if needed to undertake that Project on the basis set out in this Agreement. </w:t>
       </w:r>
     </w:p>
     <w:p>
@@ -14878,15 +15760,7 @@
         <w:jc w:val="both"/>
       </w:pPr>
       <w:r>
-        <w:t xml:space="preserve">The </w:t>
-      </w:r>
-      <w:proofErr w:type="gramStart"/>
-      <w:r>
-        <w:t>Faculty</w:t>
-      </w:r>
-      <w:proofErr w:type="gramEnd"/>
-      <w:r>
-        <w:t xml:space="preserve"> is satisfied that the Organisation is suitable for the Student(s) Project. </w:t>
+        <w:t xml:space="preserve">The Faculty is satisfied that the Organisation is suitable for the Student(s) Project. </w:t>
       </w:r>
     </w:p>
     <w:p>
@@ -14919,11 +15793,11 @@
       <w:pPr>
         <w:pStyle w:val="Heading1"/>
       </w:pPr>
-      <w:bookmarkStart w:id="34" w:name="_Toc237963419"/>
+      <w:bookmarkStart w:id="35" w:name="_Toc238027973"/>
       <w:r>
         <w:t>1. Effective Date</w:t>
       </w:r>
-      <w:bookmarkEnd w:id="34"/>
+      <w:bookmarkEnd w:id="35"/>
       <w:r>
         <w:t xml:space="preserve"> </w:t>
       </w:r>
@@ -14974,11 +15848,11 @@
         <w:pStyle w:val="Heading1"/>
         <w:ind w:left="279"/>
       </w:pPr>
-      <w:bookmarkStart w:id="35" w:name="_Toc237963420"/>
+      <w:bookmarkStart w:id="36" w:name="_Toc238027974"/>
       <w:r>
         <w:t>2. Undertakings</w:t>
       </w:r>
-      <w:bookmarkEnd w:id="35"/>
+      <w:bookmarkEnd w:id="36"/>
       <w:r>
         <w:t xml:space="preserve"> </w:t>
       </w:r>
@@ -15000,15 +15874,7 @@
         <w:ind w:left="696" w:hanging="427"/>
       </w:pPr>
       <w:r>
-        <w:t xml:space="preserve">2.1 The Organisation has accepted the </w:t>
-      </w:r>
-      <w:proofErr w:type="gramStart"/>
-      <w:r>
-        <w:t>Student</w:t>
-      </w:r>
-      <w:proofErr w:type="gramEnd"/>
-      <w:r>
-        <w:t xml:space="preserve">(s) and agrees to allow that Student(s) access to its premises as needed. </w:t>
+        <w:t xml:space="preserve">2.1 The Organisation has accepted the Student(s) and agrees to allow that Student(s) access to its premises as needed. </w:t>
       </w:r>
     </w:p>
     <w:p>
@@ -15016,15 +15882,7 @@
         <w:ind w:left="696" w:hanging="427"/>
       </w:pPr>
       <w:r>
-        <w:t xml:space="preserve">2.2 The Organisation agrees to be responsible for meeting the requirements of its statutory obligations, e.g. Health and Safety in Employment Act, Human Rights Act, etc., for the </w:t>
-      </w:r>
-      <w:proofErr w:type="gramStart"/>
-      <w:r>
-        <w:t>Student</w:t>
-      </w:r>
-      <w:proofErr w:type="gramEnd"/>
-      <w:r>
-        <w:t xml:space="preserve">(s). </w:t>
+        <w:t xml:space="preserve">2.2 The Organisation agrees to be responsible for meeting the requirements of its statutory obligations, e.g. Health and Safety in Employment Act, Human Rights Act, etc., for the Student(s). </w:t>
       </w:r>
     </w:p>
     <w:p>
@@ -15048,23 +15906,7 @@
         <w:ind w:left="696" w:hanging="427"/>
       </w:pPr>
       <w:r>
-        <w:t xml:space="preserve">2.5 Neither the Faculty nor the </w:t>
-      </w:r>
-      <w:proofErr w:type="gramStart"/>
-      <w:r>
-        <w:t>Student</w:t>
-      </w:r>
-      <w:proofErr w:type="gramEnd"/>
-      <w:r>
-        <w:t xml:space="preserve">(s) guarantee specific results and the Project will be undertaken only on a </w:t>
-      </w:r>
-      <w:proofErr w:type="gramStart"/>
-      <w:r>
-        <w:t>best efforts</w:t>
-      </w:r>
-      <w:proofErr w:type="gramEnd"/>
-      <w:r>
-        <w:t xml:space="preserve"> basis. </w:t>
+        <w:t xml:space="preserve">2.5 Neither the Faculty nor the Student(s) guarantee specific results and the Project will be undertaken only on a best efforts basis. </w:t>
       </w:r>
     </w:p>
     <w:p>
@@ -15083,8 +15925,9 @@
           <w:tab w:val="center" w:pos="4390"/>
         </w:tabs>
       </w:pPr>
-      <w:bookmarkStart w:id="36" w:name="_Toc237963421"/>
-      <w:r>
+      <w:bookmarkStart w:id="37" w:name="_Toc238027975"/>
+      <w:r>
+        <w:lastRenderedPageBreak/>
         <w:t>3</w:t>
       </w:r>
       <w:r>
@@ -15095,17 +15938,9 @@
       </w:r>
       <w:r>
         <w:tab/>
-        <w:t xml:space="preserve">Copyright, Patents, </w:t>
-      </w:r>
-      <w:proofErr w:type="gramStart"/>
-      <w:r>
-        <w:t>Trade Marks</w:t>
-      </w:r>
-      <w:proofErr w:type="gramEnd"/>
-      <w:r>
-        <w:t xml:space="preserve"> and other Intellectual Property Rights</w:t>
-      </w:r>
-      <w:bookmarkEnd w:id="36"/>
+        <w:t>Copyright, Patents, Trade Marks and other Intellectual Property Rights</w:t>
+      </w:r>
+      <w:bookmarkEnd w:id="37"/>
       <w:r>
         <w:t xml:space="preserve"> </w:t>
       </w:r>
@@ -15126,7 +15961,7 @@
           <w:tab w:val="center" w:pos="1980"/>
         </w:tabs>
       </w:pPr>
-      <w:bookmarkStart w:id="37" w:name="_Toc237963422"/>
+      <w:bookmarkStart w:id="38" w:name="_Toc238027976"/>
       <w:r>
         <w:t>4</w:t>
       </w:r>
@@ -15140,7 +15975,7 @@
         <w:tab/>
         <w:t>Confidential Information</w:t>
       </w:r>
-      <w:bookmarkEnd w:id="37"/>
+      <w:bookmarkEnd w:id="38"/>
       <w:r>
         <w:t xml:space="preserve"> </w:t>
       </w:r>
@@ -15270,7 +16105,6 @@
         <w:jc w:val="both"/>
       </w:pPr>
       <w:r>
-        <w:lastRenderedPageBreak/>
         <w:t xml:space="preserve">If permission to use Confidential Information is withheld by a party, then that party will state the reason or basis for refusal of permission.  </w:t>
       </w:r>
     </w:p>
@@ -15282,7 +16116,7 @@
           <w:tab w:val="center" w:pos="2141"/>
         </w:tabs>
       </w:pPr>
-      <w:bookmarkStart w:id="38" w:name="_Toc237963423"/>
+      <w:bookmarkStart w:id="39" w:name="_Toc238027977"/>
       <w:r>
         <w:t>5</w:t>
       </w:r>
@@ -15296,7 +16130,7 @@
         <w:tab/>
         <w:t>Intellectual Property Rights</w:t>
       </w:r>
-      <w:bookmarkEnd w:id="38"/>
+      <w:bookmarkEnd w:id="39"/>
       <w:r>
         <w:t xml:space="preserve"> </w:t>
       </w:r>
@@ -15306,23 +16140,7 @@
         <w:ind w:left="696" w:hanging="427"/>
       </w:pPr>
       <w:r>
-        <w:t xml:space="preserve">5.1 The parties agree that both the Faculty and the Student(s) may use the intellectual property rights that are created as a result of the Project work undertaken by each Student for the Organisation for portfolio purposes to promote the </w:t>
-      </w:r>
-      <w:proofErr w:type="gramStart"/>
-      <w:r>
-        <w:t>Faculty</w:t>
-      </w:r>
-      <w:proofErr w:type="gramEnd"/>
-      <w:r>
-        <w:t xml:space="preserve"> and/or the </w:t>
-      </w:r>
-      <w:proofErr w:type="gramStart"/>
-      <w:r>
-        <w:t>Student</w:t>
-      </w:r>
-      <w:proofErr w:type="gramEnd"/>
-      <w:r>
-        <w:t xml:space="preserve">(s). </w:t>
+        <w:t xml:space="preserve">5.1 The parties agree that both the Faculty and the Student(s) may use the intellectual property rights that are created as a result of the Project work undertaken by each Student for the Organisation for portfolio purposes to promote the Faculty and/or the Student(s). </w:t>
       </w:r>
     </w:p>
     <w:p>
@@ -15383,7 +16201,7 @@
                     </pic:cNvPicPr>
                   </pic:nvPicPr>
                   <pic:blipFill>
-                    <a:blip r:embed="rId34" cstate="print">
+                    <a:blip r:embed="rId35" cstate="print">
                       <a:extLst>
                         <a:ext uri="{28A0092B-C50C-407E-A947-70E740481C1C}">
                           <a14:useLocalDpi xmlns:a14="http://schemas.microsoft.com/office/drawing/2010/main" val="0"/>
@@ -15597,6 +16415,7 @@
         <w:ind w:left="1135"/>
       </w:pPr>
       <w:r>
+        <w:lastRenderedPageBreak/>
         <w:t xml:space="preserve">The Custom property will be vested solely in the Organisation whereas Generic property will vest solely in each respective Student.  Each Student hereby grants the Organisation and where more than one Student has been involved in the Project, the other Student(s), a perpetual non-exclusive licence for that Generic property. </w:t>
       </w:r>
     </w:p>
@@ -15608,7 +16427,7 @@
           <w:tab w:val="center" w:pos="1633"/>
         </w:tabs>
       </w:pPr>
-      <w:bookmarkStart w:id="39" w:name="_Toc237963424"/>
+      <w:bookmarkStart w:id="40" w:name="_Toc238027978"/>
       <w:r>
         <w:t>6</w:t>
       </w:r>
@@ -15622,7 +16441,7 @@
         <w:tab/>
         <w:t>Signatures</w:t>
       </w:r>
-      <w:bookmarkEnd w:id="39"/>
+      <w:bookmarkEnd w:id="40"/>
       <w:r>
         <w:t xml:space="preserve"> </w:t>
       </w:r>
@@ -16423,7 +17242,6 @@
               <w:rPr>
                 <w:rFonts w:ascii="Times New Roman" w:hAnsi="Times New Roman" w:cs="Times New Roman"/>
               </w:rPr>
-              <w:lastRenderedPageBreak/>
               <w:t>Student</w:t>
             </w:r>
           </w:p>
@@ -16504,11 +17322,11 @@
       <w:pPr>
         <w:pStyle w:val="Heading2"/>
       </w:pPr>
-      <w:bookmarkStart w:id="40" w:name="_Toc237963425"/>
+      <w:bookmarkStart w:id="41" w:name="_Toc238027979"/>
       <w:r>
         <w:t>Appendix C</w:t>
       </w:r>
-      <w:bookmarkEnd w:id="40"/>
+      <w:bookmarkEnd w:id="41"/>
     </w:p>
     <w:p>
       <w:pPr>
@@ -16533,11 +17351,11 @@
       <w:pPr>
         <w:pStyle w:val="Heading2"/>
       </w:pPr>
-      <w:bookmarkStart w:id="41" w:name="_Toc237963426"/>
+      <w:bookmarkStart w:id="42" w:name="_Toc238027980"/>
       <w:r>
         <w:t>Appendix D</w:t>
       </w:r>
-      <w:bookmarkEnd w:id="41"/>
+      <w:bookmarkEnd w:id="42"/>
     </w:p>
     <w:p>
       <w:pPr>
@@ -16603,7 +17421,7 @@
       </w:pPr>
     </w:p>
     <w:sectPr>
-      <w:footerReference w:type="default" r:id="rId35"/>
+      <w:footerReference w:type="default" r:id="rId36"/>
       <w:pgSz w:w="11906" w:h="16838"/>
       <w:pgMar w:top="720" w:right="720" w:bottom="720" w:left="720" w:header="708" w:footer="708" w:gutter="0"/>
       <w:pgNumType w:start="0"/>
@@ -17138,6 +17956,119 @@
     </w:lvl>
   </w:abstractNum>
   <w:abstractNum w:abstractNumId="2" w15:restartNumberingAfterBreak="0">
+    <w:nsid w:val="21E34CD3"/>
+    <w:multiLevelType w:val="hybridMultilevel"/>
+    <w:tmpl w:val="A3DCD670"/>
+    <w:lvl w:ilvl="0" w:tplc="6D26D492">
+      <w:start w:val="1"/>
+      <w:numFmt w:val="bullet"/>
+      <w:lvlText w:val="-"/>
+      <w:lvlJc w:val="left"/>
+      <w:pPr>
+        <w:ind w:left="720" w:hanging="360"/>
+      </w:pPr>
+      <w:rPr>
+        <w:rFonts w:ascii="Times New Roman" w:eastAsiaTheme="minorHAnsi" w:hAnsi="Times New Roman" w:cs="Times New Roman" w:hint="default"/>
+      </w:rPr>
+    </w:lvl>
+    <w:lvl w:ilvl="1" w:tplc="14090003" w:tentative="1">
+      <w:start w:val="1"/>
+      <w:numFmt w:val="bullet"/>
+      <w:lvlText w:val="o"/>
+      <w:lvlJc w:val="left"/>
+      <w:pPr>
+        <w:ind w:left="1440" w:hanging="360"/>
+      </w:pPr>
+      <w:rPr>
+        <w:rFonts w:ascii="Courier New" w:hAnsi="Courier New" w:cs="Courier New" w:hint="default"/>
+      </w:rPr>
+    </w:lvl>
+    <w:lvl w:ilvl="2" w:tplc="14090005" w:tentative="1">
+      <w:start w:val="1"/>
+      <w:numFmt w:val="bullet"/>
+      <w:lvlText w:val=""/>
+      <w:lvlJc w:val="left"/>
+      <w:pPr>
+        <w:ind w:left="2160" w:hanging="360"/>
+      </w:pPr>
+      <w:rPr>
+        <w:rFonts w:ascii="Wingdings" w:hAnsi="Wingdings" w:hint="default"/>
+      </w:rPr>
+    </w:lvl>
+    <w:lvl w:ilvl="3" w:tplc="14090001" w:tentative="1">
+      <w:start w:val="1"/>
+      <w:numFmt w:val="bullet"/>
+      <w:lvlText w:val=""/>
+      <w:lvlJc w:val="left"/>
+      <w:pPr>
+        <w:ind w:left="2880" w:hanging="360"/>
+      </w:pPr>
+      <w:rPr>
+        <w:rFonts w:ascii="Symbol" w:hAnsi="Symbol" w:hint="default"/>
+      </w:rPr>
+    </w:lvl>
+    <w:lvl w:ilvl="4" w:tplc="14090003" w:tentative="1">
+      <w:start w:val="1"/>
+      <w:numFmt w:val="bullet"/>
+      <w:lvlText w:val="o"/>
+      <w:lvlJc w:val="left"/>
+      <w:pPr>
+        <w:ind w:left="3600" w:hanging="360"/>
+      </w:pPr>
+      <w:rPr>
+        <w:rFonts w:ascii="Courier New" w:hAnsi="Courier New" w:cs="Courier New" w:hint="default"/>
+      </w:rPr>
+    </w:lvl>
+    <w:lvl w:ilvl="5" w:tplc="14090005" w:tentative="1">
+      <w:start w:val="1"/>
+      <w:numFmt w:val="bullet"/>
+      <w:lvlText w:val=""/>
+      <w:lvlJc w:val="left"/>
+      <w:pPr>
+        <w:ind w:left="4320" w:hanging="360"/>
+      </w:pPr>
+      <w:rPr>
+        <w:rFonts w:ascii="Wingdings" w:hAnsi="Wingdings" w:hint="default"/>
+      </w:rPr>
+    </w:lvl>
+    <w:lvl w:ilvl="6" w:tplc="14090001" w:tentative="1">
+      <w:start w:val="1"/>
+      <w:numFmt w:val="bullet"/>
+      <w:lvlText w:val=""/>
+      <w:lvlJc w:val="left"/>
+      <w:pPr>
+        <w:ind w:left="5040" w:hanging="360"/>
+      </w:pPr>
+      <w:rPr>
+        <w:rFonts w:ascii="Symbol" w:hAnsi="Symbol" w:hint="default"/>
+      </w:rPr>
+    </w:lvl>
+    <w:lvl w:ilvl="7" w:tplc="14090003" w:tentative="1">
+      <w:start w:val="1"/>
+      <w:numFmt w:val="bullet"/>
+      <w:lvlText w:val="o"/>
+      <w:lvlJc w:val="left"/>
+      <w:pPr>
+        <w:ind w:left="5760" w:hanging="360"/>
+      </w:pPr>
+      <w:rPr>
+        <w:rFonts w:ascii="Courier New" w:hAnsi="Courier New" w:cs="Courier New" w:hint="default"/>
+      </w:rPr>
+    </w:lvl>
+    <w:lvl w:ilvl="8" w:tplc="14090005" w:tentative="1">
+      <w:start w:val="1"/>
+      <w:numFmt w:val="bullet"/>
+      <w:lvlText w:val=""/>
+      <w:lvlJc w:val="left"/>
+      <w:pPr>
+        <w:ind w:left="6480" w:hanging="360"/>
+      </w:pPr>
+      <w:rPr>
+        <w:rFonts w:ascii="Wingdings" w:hAnsi="Wingdings" w:hint="default"/>
+      </w:rPr>
+    </w:lvl>
+  </w:abstractNum>
+  <w:abstractNum w:abstractNumId="3" w15:restartNumberingAfterBreak="0">
     <w:nsid w:val="2F476821"/>
     <w:multiLevelType w:val="hybridMultilevel"/>
     <w:tmpl w:val="0C74053E"/>
@@ -17349,7 +18280,7 @@
       </w:rPr>
     </w:lvl>
   </w:abstractNum>
-  <w:abstractNum w:abstractNumId="3" w15:restartNumberingAfterBreak="0">
+  <w:abstractNum w:abstractNumId="4" w15:restartNumberingAfterBreak="0">
     <w:nsid w:val="49F21884"/>
     <w:multiLevelType w:val="hybridMultilevel"/>
     <w:tmpl w:val="5802C03E"/>
@@ -17561,7 +18492,7 @@
       </w:rPr>
     </w:lvl>
   </w:abstractNum>
-  <w:abstractNum w:abstractNumId="4" w15:restartNumberingAfterBreak="0">
+  <w:abstractNum w:abstractNumId="5" w15:restartNumberingAfterBreak="0">
     <w:nsid w:val="681C4A0B"/>
     <w:multiLevelType w:val="hybridMultilevel"/>
     <w:tmpl w:val="807EDC2E"/>
@@ -17774,19 +18705,22 @@
     </w:lvl>
   </w:abstractNum>
   <w:num w:numId="1" w16cid:durableId="1680350313">
-    <w:abstractNumId w:val="3"/>
+    <w:abstractNumId w:val="4"/>
   </w:num>
   <w:num w:numId="2" w16cid:durableId="1268611101">
     <w:abstractNumId w:val="1"/>
   </w:num>
   <w:num w:numId="3" w16cid:durableId="1173646095">
-    <w:abstractNumId w:val="2"/>
+    <w:abstractNumId w:val="3"/>
   </w:num>
   <w:num w:numId="4" w16cid:durableId="103231826">
     <w:abstractNumId w:val="0"/>
   </w:num>
   <w:num w:numId="5" w16cid:durableId="1745881564">
-    <w:abstractNumId w:val="4"/>
+    <w:abstractNumId w:val="5"/>
+  </w:num>
+  <w:num w:numId="6" w16cid:durableId="572280067">
+    <w:abstractNumId w:val="2"/>
   </w:num>
 </w:numbering>
 </file>
@@ -18416,6 +19350,7 @@
   <w:style w:type="character" w:default="1" w:styleId="DefaultParagraphFont">
     <w:name w:val="Default Paragraph Font"/>
     <w:uiPriority w:val="1"/>
+    <w:semiHidden/>
     <w:unhideWhenUsed/>
   </w:style>
   <w:style w:type="table" w:default="1" w:styleId="TableNormal">
@@ -19401,7 +20336,7 @@
     <b:Title>Our Staff</b:Title>
     <b:InternetSiteTitle>whitireiaweltec</b:InternetSiteTitle>
     <b:URL>https://www.whitireiaweltec.ac.nz/about-us/staff-profiles</b:URL>
-    <b:RefOrder>3</b:RefOrder>
+    <b:RefOrder>6</b:RefOrder>
   </b:Source>
   <b:Source>
     <b:Tag>Dan</b:Tag>
@@ -19420,7 +20355,7 @@
     <b:Title>What is Kanban in project management? Breaking down the methodology</b:Title>
     <b:InternetSiteTitle>Atlassian</b:InternetSiteTitle>
     <b:URL>https://www.atlassian.com/agile/kanban</b:URL>
-    <b:RefOrder>1</b:RefOrder>
+    <b:RefOrder>4</b:RefOrder>
   </b:Source>
   <b:Source>
     <b:Tag>NIS26</b:Tag>
@@ -19437,7 +20372,69 @@
     <b:Month>May</b:Month>
     <b:Day>1</b:Day>
     <b:URL>https://www.nist.gov/itl/csd/secure-systems-and-applications/computer-forensics-tool-testing-program-cftt/cftt-general-0</b:URL>
+    <b:RefOrder>5</b:RefOrder>
+  </b:Source>
+  <b:Source>
+    <b:Tag>PEC</b:Tag>
+    <b:SourceType>InternetSite</b:SourceType>
+    <b:Guid>{C26052DB-3EC1-4929-A332-C09E1FD8DA78}</b:Guid>
+    <b:Author>
+      <b:Author>
+        <b:Corporate>PECB</b:Corporate>
+      </b:Author>
+    </b:Author>
+    <b:Title>Certified Digital Forensics Examiner – Training Course</b:Title>
+    <b:InternetSiteTitle>PECB</b:InternetSiteTitle>
+    <b:URL>https://pecb.com/en/education-and-certification-for-individuals/certified-digital-forensics-examiner#first</b:URL>
+    <b:RefOrder>1</b:RefOrder>
+  </b:Source>
+  <b:Source>
+    <b:Tag>Max26</b:Tag>
+    <b:SourceType>InternetSite</b:SourceType>
+    <b:Guid>{04DEDA3E-BFB8-4260-9E6C-A8C3EB4F3BC7}</b:Guid>
+    <b:Title>Large language models in digital forensics: capabilities, challenges and future directions</b:Title>
+    <b:Year>2026</b:Year>
+    <b:Month>October</b:Month>
+    <b:Day>26</b:Day>
+    <b:URL>https://www.sciencedirect.com/science/article/pii/S2666281725001830#fig0010</b:URL>
+    <b:Author>
+      <b:Author>
+        <b:NameList>
+          <b:Person>
+            <b:First>Maxim Chernyshev</b:First>
+          </b:Person>
+          <b:Person>
+            <b:Last>Baig</b:Last>
+            <b:First>Zubair</b:First>
+          </b:Person>
+          <b:Person>
+            <b:First>Naeem Syed</b:First>
+          </b:Person>
+          <b:Person>
+            <b:First>Robin Doss</b:First>
+          </b:Person>
+          <b:Person>
+            <b:Last>Shore</b:Last>
+            <b:First>Malcom</b:First>
+          </b:Person>
+        </b:NameList>
+      </b:Author>
+    </b:Author>
     <b:RefOrder>2</b:RefOrder>
+  </b:Source>
+  <b:Source>
+    <b:Tag>ISO</b:Tag>
+    <b:SourceType>InternetSite</b:SourceType>
+    <b:Guid>{29E69E0F-6775-421C-BA8C-EFB343E727ED}</b:Guid>
+    <b:Author>
+      <b:Author>
+        <b:Corporate>ISO</b:Corporate>
+      </b:Author>
+    </b:Author>
+    <b:Title>Deep learning: The mechanics of magic </b:Title>
+    <b:InternetSiteTitle>ISO</b:InternetSiteTitle>
+    <b:URL>https://www.iso.org/artificial-intelligence/deep-learning</b:URL>
+    <b:RefOrder>3</b:RefOrder>
   </b:Source>
 </b:Sources>
 </file>
@@ -19451,7 +20448,7 @@
 </file>
 
 <file path=customXml/itemProps2.xml><?xml version="1.0" encoding="utf-8"?>
-<ds:datastoreItem xmlns:ds="http://schemas.openxmlformats.org/officeDocument/2006/customXml" ds:itemID="{D1631095-E0DF-441F-B451-C0B0FE8BDAB6}">
+<ds:datastoreItem xmlns:ds="http://schemas.openxmlformats.org/officeDocument/2006/customXml" ds:itemID="{8EF0778D-F9B8-42A0-A480-7B671B96319D}">
   <ds:schemaRefs>
     <ds:schemaRef ds:uri="http://schemas.openxmlformats.org/officeDocument/2006/bibliography"/>
   </ds:schemaRefs>

</xml_diff>